<commit_message>
Completa documentação e artefatos do cenário 4
</commit_message>
<xml_diff>
--- a/output/Relatorio_Tecnico_Cenario_4.docx
+++ b/output/Relatorio_Tecnico_Cenario_4.docx
@@ -32,7 +32,7 @@
       <w:r>
         <w:t>Equipe do Projeto Aplicado</w:t>
         <w:br/>
-        <w:t>12 de setembro de 2026</w:t>
+        <w:t>14 de setembro de 2026</w:t>
         <w:br/>
         <w:t>Relatório técnico</w:t>
       </w:r>
@@ -71,7 +71,7 @@
         <w:jc w:val="both"/>
       </w:pPr>
       <w:r>
-        <w:t>A avaliação executou onze testes automatizados. Os três fluxos obrigatórios funcionaram do início ao fim: cliente do CRM para rascunho de contrato; ativação para cobrança e onboarding; e chamado com consulta de contrato e SLA. A repetição não duplicou efeitos, a indisponibilidade gerou um estado pendente reconciliável e o controle de papéis bloqueou uma operação indevida. Em 200 consultas locais de prontidão, o p95 foi 4,75 ms, abaixo da meta de 500 ms.</w:t>
+        <w:t>A avaliação executou 13 testes automatizados. Os três fluxos obrigatórios funcionaram do início ao fim: cliente do CRM para rascunho de contrato; ativação para cobrança e onboarding; e chamado com consulta de contrato e SLA. A repetição não duplicou efeitos, a indisponibilidade gerou um estado pendente reconciliável e o controle de papéis bloqueou uma operação indevida. Em 200 consultas locais de prontidão, o p95 foi 6,36 ms, abaixo da meta de 500 ms.</w:t>
       </w:r>
     </w:p>
     <w:p>
@@ -333,7 +333,7 @@
         <w:jc w:val="both"/>
       </w:pPr>
       <w:r>
-        <w:t>A Equipe do Projeto Aplicado conduziu análise, modelagem, implementação, testes e documentação. A divisão de trabalho do repositório organiza essas atividades em tasks e subtasks e permite registrar a contribuição individual na versão de submissão.</w:t>
+        <w:t>A Equipe do Projeto Aplicado conduziu análise, modelagem, implementação, testes e documentação. O backlog organiza essas atividades em tarefas e subtarefas e mantém a relação entre requisito, responsável, resultado e evidência. A identificação nominal e a contribuição individual serão registradas pela equipe na versão de submissão.</w:t>
       </w:r>
     </w:p>
     <w:p>
@@ -1841,48 +1841,53 @@
     </w:p>
     <w:p>
       <w:pPr>
-        <w:pStyle w:val="ListBullet"/>
         <w:spacing w:after="80"/>
+        <w:ind w:left="360" w:hanging="259"/>
       </w:pPr>
       <w:r>
-        <w:t>Uma identidade global que mantenha relações com identificadores legados.</w:t>
+        <w:t>•  Uma identidade global que mantenha relações com identificadores legados.</w:t>
       </w:r>
     </w:p>
     <w:p>
       <w:pPr>
-        <w:pStyle w:val="ListBullet"/>
         <w:spacing w:after="80"/>
+        <w:ind w:left="360" w:hanging="259"/>
       </w:pPr>
       <w:r>
-        <w:t>Contratos versionados para comandos, consultas e eventos.</w:t>
+        <w:t>•  Contratos versionados para comandos, consultas e eventos.</w:t>
       </w:r>
     </w:p>
     <w:p>
       <w:pPr>
-        <w:pStyle w:val="ListBullet"/>
         <w:spacing w:after="80"/>
+        <w:ind w:left="360" w:hanging="259"/>
       </w:pPr>
       <w:r>
-        <w:t>Entrega confiável com repetição segura e tratamento de falha permanente.</w:t>
+        <w:t>•  Entrega confiável com repetição segura e tratamento de falha permanente.</w:t>
       </w:r>
     </w:p>
     <w:p>
       <w:pPr>
-        <w:pStyle w:val="ListBullet"/>
         <w:spacing w:after="80"/>
+        <w:ind w:left="360" w:hanging="259"/>
       </w:pPr>
       <w:r>
-        <w:t>Rastreabilidade por correlação, auditoria, métricas e logs estruturados.</w:t>
+        <w:t>•  Rastreabilidade por correlação, auditoria, métricas e logs estruturados.</w:t>
       </w:r>
     </w:p>
     <w:p>
       <w:pPr>
-        <w:pStyle w:val="ListBullet"/>
         <w:spacing w:after="80"/>
+        <w:ind w:left="360" w:hanging="259"/>
       </w:pPr>
       <w:r>
-        <w:t>Fronteiras que preservem a fonte oficial e impeçam acesso cruzado ao banco.</w:t>
+        <w:t>•  Fronteiras que preservem a fonte oficial e impeçam acesso cruzado ao banco.</w:t>
       </w:r>
+    </w:p>
+    <w:p>
+      <w:pPr>
+        <w:spacing w:after="40"/>
+      </w:pPr>
     </w:p>
     <w:p>
       <w:pPr>
@@ -2531,7 +2536,7 @@
         <w:jc w:val="both"/>
       </w:pPr>
       <w:r>
-        <w:t>A decisão adota SOA pragmática em monólito modular. CRM, Contracts, Finance, Support e Workflow contêm regras e dados próprios. Integration mantém identidade legada, correlação, idempotência, outbox, inbox, auditoria e falhas. A aplicação oferece APIs em `/api/v1`.</w:t>
+        <w:t>A decisão adota SOA pragmática em monólito modular. CRM, Contracts, Finance, Support e Workflow contêm regras e dados próprios. Integration mantém identidade legada, correlação, idempotência, outbox, inbox, auditoria e falhas. A aplicação oferece APIs em /api/v1.</w:t>
       </w:r>
     </w:p>
     <w:tbl>
@@ -3522,7 +3527,7 @@
         <w:jc w:val="both"/>
       </w:pPr>
       <w:r>
-        <w:t>O comercial cria ou seleciona um cliente no CRM. O endpoint de rascunho recebe o UUID global, serviço, início, cobrança e SLA. Contracts consulta `CustomerReader`, valida elegibilidade e consentimento e cria o contrato sem copiar manualmente o cadastro.</w:t>
+        <w:t>O comercial cria ou seleciona um cliente no CRM. O endpoint de rascunho recebe o UUID global, serviço, início, cobrança e SLA. Contracts consulta CustomerReader, valida elegibilidade e consentimento e cria o contrato sem copiar manualmente o cadastro.</w:t>
       </w:r>
     </w:p>
     <w:tbl>
@@ -4227,7 +4232,7 @@
         <w:jc w:val="both"/>
       </w:pPr>
       <w:r>
-        <w:t>Uma repetição com a mesma chave devolve o mesmo `contractId`. A auditoria registra operação, resultado e correlação. O teste F1 comprovou o comportamento.</w:t>
+        <w:t>Uma repetição com a mesma chave devolve o mesmo contractId. A auditoria registra operação, resultado e correlação. O teste F1 comprovou o comportamento.</w:t>
       </w:r>
     </w:p>
     <w:p>
@@ -4246,7 +4251,7 @@
         <w:jc w:val="both"/>
       </w:pPr>
       <w:r>
-        <w:t>Contracts grava a ativação e `ContractActivated.v1` na mesma transação. O dispatcher lê a outbox, entrega o evento a Finance e Workflow e registra uma inbox por consumidor. Depois publica o envelope no RabbitMQ quando configurado.</w:t>
+        <w:t>Contracts grava a ativação e ContractActivated.v1 na mesma transação. O dispatcher lê a outbox, entrega o evento a Finance e Workflow e registra uma inbox por consumidor. Depois publica o envelope no RabbitMQ quando configurado.</w:t>
       </w:r>
     </w:p>
     <w:tbl>
@@ -4568,7 +4573,7 @@
         <w:jc w:val="both"/>
       </w:pPr>
       <w:r>
-        <w:t>Falhas transitórias mantêm o evento pendente até nova tentativa. Após três tentativas, o evento passa a `FAILED` com motivo e correlação. Um operador autorizado pode agendar o reprocessamento. As restrições de consumidor continuam válidas, portanto um efeito já confirmado não se repete.</w:t>
+        <w:t>Uma falha mantém o evento pendente até nova chamada de despacho. Após três tentativas, o evento passa a FAILED com motivo e correlação. Um operador autorizado pode agendar o reprocessamento. A operação preserva o contador acumulado; uma nova falha retorna imediatamente a FAILED. Inbox e restrições únicas continuam válidas, portanto um efeito já confirmado não se repete.</w:t>
       </w:r>
     </w:p>
     <w:p>
@@ -4596,7 +4601,7 @@
         <w:jc w:val="both"/>
       </w:pPr>
       <w:r>
-        <w:t>Support consulta `ContractEntitlementPort` com cliente, contrato e serviço. Quando o contrato está ativo, o módulo registra o SLA, calcula o prazo e define prioridade alta para indisponibilidade ou segurança. `TicketOpened.v1` inicia a resolução em Workflow.</w:t>
+        <w:t>Support consulta ContractEntitlementPort com cliente, contrato e serviço. Quando o contrato está ativo, o módulo registra o SLA, calcula o prazo e define prioridade alta para indisponibilidade ou segurança. TicketOpened.v1 inicia a resolução em Workflow.</w:t>
       </w:r>
     </w:p>
     <w:tbl>
@@ -4992,7 +4997,7 @@
         <w:jc w:val="both"/>
       </w:pPr>
       <w:r>
-        <w:t>O evento omite a descrição do chamado. Workflow recebe apenas os identificadores, categoria, prioridade, estado e SLA necessários ao processo. O teste de degradação abriu o chamado pendente e o reconciliou depois que Contracts voltou.</w:t>
+        <w:t>O evento omite a descrição do chamado. Workflow recebe apenas os identificadores, categoria, prioridade, estado e SLA necessários ao processo. O teste de degradação abriu o chamado pendente e o reconciliou depois que Contracts voltou. A implementação atual não recalcula no Workflow o prazo criado enquanto a elegibilidade estava pendente.</w:t>
       </w:r>
     </w:p>
     <w:p>
@@ -5597,7 +5602,7 @@
               <w:rPr>
                 <w:sz w:val="18"/>
               </w:rPr>
-              <w:t>p95 de 4,75 ms</w:t>
+              <w:t>p95 de 6,36 ms</w:t>
             </w:r>
           </w:p>
         </w:tc>
@@ -5742,7 +5747,7 @@
               <w:rPr>
                 <w:sz w:val="18"/>
               </w:rPr>
-              <w:t>11 testes aprovados</w:t>
+              <w:t>13 testes aprovados</w:t>
             </w:r>
           </w:p>
         </w:tc>
@@ -5820,43 +5825,57 @@
         <w:jc w:val="both"/>
       </w:pPr>
       <w:r>
-        <w:t>A proposta reduz recadastro e conecta venda, ativação, cobrança, onboarding e atendimento. O monólito modular e os simuladores limitam custo e complexidade para uma equipe júnior. Os maiores esforços futuros serão descoberta dos legados, qualidade de dados e integração com identidade corporativa.</w:t>
+        <w:t>A proposta reduz recadastro e conecta venda, ativação, cobrança, onboarding e atendimento. O monólito modular limita unidades de implantação, e os simuladores evitam licenças e ambientes legados na demonstração. A adoção organizacional ainda exige descoberta dos produtos, tratamento da qualidade dos dados, identidade corporativa, TLS, operação e capacidade.</w:t>
       </w:r>
     </w:p>
     <w:p>
       <w:pPr>
-        <w:pStyle w:val="ListBullet"/>
         <w:spacing w:after="80"/>
+        <w:ind w:left="360" w:hanging="259"/>
       </w:pPr>
       <w:r>
-        <w:t>Tempo entre ativação e cobrança</w:t>
+        <w:t>•  Tempo entre ativação e cobrança</w:t>
       </w:r>
     </w:p>
     <w:p>
       <w:pPr>
-        <w:pStyle w:val="ListBullet"/>
         <w:spacing w:after="80"/>
+        <w:ind w:left="360" w:hanging="259"/>
       </w:pPr>
       <w:r>
-        <w:t>Contratos com recadastro</w:t>
+        <w:t>•  Contratos com recadastro</w:t>
       </w:r>
     </w:p>
     <w:p>
       <w:pPr>
-        <w:pStyle w:val="ListBullet"/>
         <w:spacing w:after="80"/>
+        <w:ind w:left="360" w:hanging="259"/>
       </w:pPr>
       <w:r>
-        <w:t>Chamados com SLA incorreto</w:t>
+        <w:t>•  Chamados com SLA incorreto</w:t>
       </w:r>
     </w:p>
     <w:p>
       <w:pPr>
-        <w:pStyle w:val="ListBullet"/>
         <w:spacing w:after="80"/>
+        <w:ind w:left="360" w:hanging="259"/>
       </w:pPr>
       <w:r>
-        <w:t>Falhas e tempo de diagnóstico</w:t>
+        <w:t>•  Falhas e tempo de diagnóstico</w:t>
+      </w:r>
+    </w:p>
+    <w:p>
+      <w:pPr>
+        <w:spacing w:after="40"/>
+      </w:pPr>
+    </w:p>
+    <w:p>
+      <w:pPr>
+        <w:spacing w:after="160" w:line="276" w:lineRule="auto"/>
+        <w:jc w:val="both"/>
+      </w:pPr>
+      <w:r>
+        <w:t>Custos, equipe, prazo e infraestrutura de produção não foram informados no enunciado. A viabilidade organizacional depende de levantar essa linha de base e comparar os indicadores antes e depois de uma prova com sistemas reais.</w:t>
       </w:r>
     </w:p>
     <w:p>
@@ -5871,11 +5890,19 @@
     </w:p>
     <w:p>
       <w:pPr>
+        <w:pStyle w:val="Heading2"/>
+      </w:pPr>
+      <w:r>
+        <w:t>12.1 Resultados</w:t>
+      </w:r>
+    </w:p>
+    <w:p>
+      <w:pPr>
         <w:spacing w:after="160" w:line="276" w:lineRule="auto"/>
         <w:jc w:val="both"/>
       </w:pPr>
       <w:r>
-        <w:t>A entrega implementou a arquitetura e produziu as evidências requeridas. Onze testes passaram. Os três fluxos integrados funcionaram; repetição não duplicou cobrança ou processo; falha de dependência preservou o chamado; e o reprocessamento manteve rastreabilidade. O resultado atende ao propósito do enunciado de “demonstrar como a arquitetura e a integração funcionariam na prática” [1].</w:t>
+        <w:t>A entrega implementou a arquitetura e produziu as evidências requeridas. Treze testes passaram. Os três fluxos integrados funcionaram; repetição não duplicou cobrança ou processo; falha de dependência preservou o chamado; e o reprocessamento manteve rastreabilidade. O OpenAPI expõe esquemas e exemplos, o AsyncAPI define o envelope completo e a API rejeita identificadores globais que não sejam UUID. O resultado atende ao propósito do enunciado de “demonstrar como a arquitetura e a integração funcionariam na prática” [1].</w:t>
       </w:r>
     </w:p>
     <w:p>
@@ -5889,11 +5916,10 @@
     </w:p>
     <w:p>
       <w:pPr>
-        <w:spacing w:after="160" w:line="276" w:lineRule="auto"/>
-        <w:jc w:val="both"/>
+        <w:pStyle w:val="Heading2"/>
       </w:pPr>
       <w:r>
-        <w:t>O principal limite decorre dos dados organizacionais ausentes no cenário. Produtos, volumes e interfaces reais podem alterar adaptadores, políticas de timeout e capacidade. A arquitetura trata essas informações como premissas a validar e inclui critérios para reconsiderar a decisão.</w:t>
+        <w:t>12.2 Desafios e aprendizados</w:t>
       </w:r>
     </w:p>
     <w:p>
@@ -5902,7 +5928,33 @@
         <w:jc w:val="both"/>
       </w:pPr>
       <w:r>
-        <w:t>Os próximos passos organizacionais são validar o AS-IS, substituir tokens simulados por OIDC real e executar o roteiro em infraestrutura de demonstração. A equipe deve atualizar a matriz de evidências com os resultados observados e registrar qualquer decisão estrutural em novo ADR.</w:t>
+        <w:t>Os principais desafios foram preservar fronteiras mesmo com um banco e um processo compartilhados, coordenar efeitos assíncronos sem duplicidade e manter a mesma correlação em HTTP, auditoria e eventos. A implementação mostrou que contratos versionados não bastam sozinhos: outbox, inbox, idempotência, estados de recuperação e evidências precisam ser projetados junto com o fluxo.</w:t>
+      </w:r>
+    </w:p>
+    <w:p>
+      <w:pPr>
+        <w:pStyle w:val="Heading2"/>
+      </w:pPr>
+      <w:r>
+        <w:t>12.3 Limitações, riscos e evolução</w:t>
+      </w:r>
+    </w:p>
+    <w:p>
+      <w:pPr>
+        <w:spacing w:after="160" w:line="276" w:lineRule="auto"/>
+        <w:jc w:val="both"/>
+      </w:pPr>
+      <w:r>
+        <w:t>O principal limite decorre dos dados organizacionais ausentes. Produtos, volumes e interfaces reais podem alterar adaptadores, timeout e capacidade. O protótipo também não agenda retentativas com atraso, não oferece OIDC ou TLS reais e não recalcula o prazo do processo de resolução depois da reconciliação do chamado. O contador de tentativas permanece acumulado após o reprocessamento.</w:t>
+      </w:r>
+    </w:p>
+    <w:p>
+      <w:pPr>
+        <w:spacing w:after="160" w:line="276" w:lineRule="auto"/>
+        <w:jc w:val="both"/>
+      </w:pPr>
+      <w:r>
+        <w:t>Os próximos passos são validar o AS-IS, conectar identidade e sistemas reais por adaptadores, automatizar retentativas transitórias e sincronizar o prazo do Workflow após a reconciliação. Métricas de escala, disponibilidade ou cadência devem orientar qualquer extração futura. Decisões estruturais adicionais exigem novo ADR.</w:t>
       </w:r>
     </w:p>
     <w:p>
@@ -5993,7 +6045,7 @@
         <w:jc w:val="both"/>
       </w:pPr>
       <w:r>
-        <w:t>Documentos complementares do repositório: ADR-001; plano de implementação; matriz de rastreabilidade; arquitetura AS-IS e TO-BE; contratos OpenAPI e AsyncAPI; roteiro de demonstração; evidências de validação.</w:t>
+        <w:t>Documentos complementares do repositório: ADR-001; requisitos; plano de implementação; matriz de rastreabilidade; arquitetura AS-IS, TO-BE e fluxos de integração; exemplos de API; contratos OpenAPI e AsyncAPI; roteiro de demonstração; evidências de validação.</w:t>
       </w:r>
     </w:p>
     <w:sectPr>

</xml_diff>

<commit_message>
feat: implementa módulos ArchCorp e cronograma integrado
</commit_message>
<xml_diff>
--- a/output/Relatorio_Tecnico_Cenario_4.docx
+++ b/output/Relatorio_Tecnico_Cenario_4.docx
@@ -30,11 +30,11 @@
         <w:jc w:val="center"/>
       </w:pPr>
       <w:r>
-        <w:t>Equipe do Projeto Aplicado</w:t>
+        <w:t>Equipe do Projeto Aplicado — nomes e contribuições pendentes</w:t>
         <w:br/>
-        <w:t>14 de setembro de 2026</w:t>
+        <w:t>27 de setembro de 2026</w:t>
         <w:br/>
-        <w:t>Relatório técnico</w:t>
+        <w:t>Relatório técnico em revisão</w:t>
       </w:r>
     </w:p>
     <w:p>
@@ -53,7 +53,7 @@
         <w:jc w:val="both"/>
       </w:pPr>
       <w:r>
-        <w:t>A organização do Cenário 4 utiliza CRM, sistema de contratos, sistema financeiro, sistema de atendimento e gestão de processos. O enunciado associa o crescimento da organização a duplicidade de dados, lançamentos manuais, integrações frágeis e processos fragmentados. Este trabalho propõe e implementa uma arquitetura orientada a serviços entregue como monólito modular, com APIs REST para interações imediatas e eventos para efeitos desacoplados.</w:t>
+        <w:t>A organização do Cenário 4 utiliza CRM, sistema de reservas e contratos, sistema financeiro e faturamento, sistema de atendimento e assistência 24h e gestão de processos operacionais. O enunciado associa o crescimento da organização a duplicidade de dados, lançamentos manuais, integrações frágeis e processos fragmentados. Este trabalho propõe e implementa uma arquitetura orientada a serviços entregue como monólito modular, com APIs REST para interações imediatas e eventos para efeitos desacoplados.</w:t>
       </w:r>
     </w:p>
     <w:p>
@@ -71,7 +71,7 @@
         <w:jc w:val="both"/>
       </w:pPr>
       <w:r>
-        <w:t>A avaliação executou 13 testes automatizados. Os três fluxos obrigatórios funcionaram do início ao fim: cliente do CRM para rascunho de contrato; ativação para cobrança e onboarding; e chamado com consulta de contrato e SLA. A repetição não duplicou efeitos, a indisponibilidade gerou um estado pendente reconciliável e o controle de papéis bloqueou uma operação indevida. Em 200 consultas locais de prontidão, o p95 foi 6,36 ms, abaixo da meta de 500 ms.</w:t>
+        <w:t>A avaliação histórica de setembro executou 13 testes automatizados; a suíte ampliada inclui agora reservas, pagamentos simulados, resolução de chamados e proteção da demo pública. Os três fluxos obrigatórios funcionaram no banco de testes: cliente do CRM para contrato; ativação para primeira fatura e preparação de retirada; chamado com contrato e SLA. A medição anterior de 200 consultas locais de prontidão teve p95 de 6,36 ms e não representa latência em hospedagem pública.</w:t>
       </w:r>
     </w:p>
     <w:p>
@@ -107,7 +107,7 @@
         <w:jc w:val="both"/>
       </w:pPr>
       <w:r>
-        <w:t>A ArchCorp recebeu a tarefa de modernizar uma organização que acumulou aplicações distintas ao crescer. Para o Cenário 4, o documento define cinco sistemas: CRM, contratos, financeiro, atendimento e gestão de processos [1]. A falta de comunicação adequada cria duplicidade, recadastro, dificuldade de manutenção e baixa capacidade de evolução.</w:t>
+        <w:t>A Localiza recebeu a tarefa de modernizar uma organização que acumulou aplicações distintas ao crescer. Para o Cenário 4, o documento define cinco sistemas: CRM, reservas e contratos, financeiro e faturamento, atendimento e assistência 24h e gestão de processos operacionais [1]. A falta de comunicação adequada cria duplicidade, recadastro, dificuldade de manutenção e baixa capacidade de evolução.</w:t>
       </w:r>
     </w:p>
     <w:p>
@@ -116,7 +116,7 @@
         <w:jc w:val="both"/>
       </w:pPr>
       <w:r>
-        <w:t>O problema arquitetural envolve propriedade de dados e coordenação entre sistemas. Uma chamada bem-sucedida não basta quando uma ativação precisa produzir cobrança e onboarding, pois uma falha intermediária pode perder o fato ou repetir efeitos. A solução precisa definir contratos, responsabilidades, consistência e recuperação.</w:t>
+        <w:t>O problema arquitetural envolve propriedade de dados e coordenação entre sistemas. Uma chamada bem-sucedida não basta quando uma ativação precisa produzir cobrança e preparação de retirada, pois uma falha intermediária pode perder o fato ou repetir efeitos. A solução precisa definir reservas e contratos, responsabilidades, consistência e recuperação.</w:t>
       </w:r>
     </w:p>
     <w:p>
@@ -579,7 +579,7 @@
               <w:rPr>
                 <w:sz w:val="18"/>
               </w:rPr>
-              <w:t>Contratos</w:t>
+              <w:t>Reservas e contratos</w:t>
             </w:r>
           </w:p>
         </w:tc>
@@ -726,7 +726,7 @@
         <w:jc w:val="both"/>
       </w:pPr>
       <w:r>
-        <w:t>O trabalho seguiu seis ciclos: descoberta; contratos e fundação; adaptadores; fluxos; qualidade; e entrega. Cada mudança relacionou requisito, decisão, implementação e evidência. A equipe tratou detalhes organizacionais ausentes como premissas e preservou o enunciado como fonte prioritária.</w:t>
+        <w:t>O trabalho seguiu seis ciclos: descoberta; reservas e contratos e fundação; adaptadores; fluxos; qualidade; e entrega. Cada mudança relacionou requisito, decisão, implementação e evidência. A equipe tratou detalhes organizacionais ausentes como premissas e preservou o enunciado como fonte prioritária.</w:t>
       </w:r>
     </w:p>
     <w:p>
@@ -882,7 +882,7 @@
               <w:rPr>
                 <w:sz w:val="18"/>
               </w:rPr>
-              <w:t>Comercial</w:t>
+              <w:t>Comercial e canais digitais</w:t>
             </w:r>
           </w:p>
         </w:tc>
@@ -931,7 +931,7 @@
               <w:rPr>
                 <w:sz w:val="18"/>
               </w:rPr>
-              <w:t>Contratos</w:t>
+              <w:t>Reservas e contratos</w:t>
             </w:r>
           </w:p>
         </w:tc>
@@ -955,7 +955,7 @@
               <w:rPr>
                 <w:sz w:val="18"/>
               </w:rPr>
-              <w:t>Jurídico e contratos</w:t>
+              <w:t>Jurídico e reservas e contratos</w:t>
             </w:r>
           </w:p>
         </w:tc>
@@ -979,7 +979,7 @@
               <w:rPr>
                 <w:sz w:val="18"/>
               </w:rPr>
-              <w:t>Contrato, itens, vigência, plano e SLA</w:t>
+              <w:t>Reserva, contrato de locação, grupo de veículo, vigência, proteções e SLA</w:t>
             </w:r>
           </w:p>
         </w:tc>
@@ -1004,7 +1004,7 @@
               <w:rPr>
                 <w:sz w:val="18"/>
               </w:rPr>
-              <w:t>Financeiro</w:t>
+              <w:t>Financeiro e faturamento</w:t>
             </w:r>
           </w:p>
         </w:tc>
@@ -1027,7 +1027,7 @@
               <w:rPr>
                 <w:sz w:val="18"/>
               </w:rPr>
-              <w:t>Financeiro</w:t>
+              <w:t>Financeiro e faturamento</w:t>
             </w:r>
           </w:p>
         </w:tc>
@@ -1050,7 +1050,7 @@
               <w:rPr>
                 <w:sz w:val="18"/>
               </w:rPr>
-              <w:t>Cobrança, vencimento, pagamento e inadimplência</w:t>
+              <w:t>Pré-autorização, cobrança, fatura, pagamento, caução, multa e inadimplência</w:t>
             </w:r>
           </w:p>
         </w:tc>
@@ -1076,7 +1076,7 @@
               <w:rPr>
                 <w:sz w:val="18"/>
               </w:rPr>
-              <w:t>Atendimento</w:t>
+              <w:t>Atendimento e assistência 24h</w:t>
             </w:r>
           </w:p>
         </w:tc>
@@ -1124,7 +1124,7 @@
               <w:rPr>
                 <w:sz w:val="18"/>
               </w:rPr>
-              <w:t>Chamado, prioridade, histórico e resolução</w:t>
+              <w:t>Chamado, assistência, prioridade, histórico e resolução</w:t>
             </w:r>
           </w:p>
         </w:tc>
@@ -1149,7 +1149,7 @@
               <w:rPr>
                 <w:sz w:val="18"/>
               </w:rPr>
-              <w:t>Gestão de processos</w:t>
+              <w:t>Gestão de processos operacionais</w:t>
             </w:r>
           </w:p>
         </w:tc>
@@ -1195,7 +1195,7 @@
               <w:rPr>
                 <w:sz w:val="18"/>
               </w:rPr>
-              <w:t>Instância, tarefa, responsável, prazo e estado</w:t>
+              <w:t>Instância, tarefa, responsável, prazo e estado operacional</w:t>
             </w:r>
           </w:p>
         </w:tc>
@@ -1212,7 +1212,7 @@
         <w:jc w:val="both"/>
       </w:pPr>
       <w:r>
-        <w:t>A primeira hipótese de trabalho considera recadastro entre CRM e contratos. A segunda considera acionamento manual do financeiro e do onboarding após a ativação. A terceira considera que o atendimento consulta contrato e SLA por processo informal. O professor ou representante da organização deve validar essas hipóteses.</w:t>
+        <w:t>A primeira hipótese de trabalho considera recadastro entre CRM e reservas e contratos. A segunda considera acionamento manual do financeiro e faturamento e da preparação de retirada após a ativação. A terceira considera que o atendimento e assistência 24h consulta contrato de locação e SLA por processo informal. O professor ou representante da organização deve validar essas hipóteses.</w:t>
       </w:r>
     </w:p>
     <w:p>
@@ -1413,7 +1413,7 @@
               <w:rPr>
                 <w:sz w:val="18"/>
               </w:rPr>
-              <w:t>Contratos</w:t>
+              <w:t>Reservas e contratos</w:t>
             </w:r>
           </w:p>
         </w:tc>
@@ -1486,7 +1486,7 @@
               <w:rPr>
                 <w:sz w:val="18"/>
               </w:rPr>
-              <w:t>Contratos</w:t>
+              <w:t>Reservas e contratos</w:t>
             </w:r>
           </w:p>
         </w:tc>
@@ -1510,7 +1510,7 @@
               <w:rPr>
                 <w:sz w:val="18"/>
               </w:rPr>
-              <w:t>Financeiro</w:t>
+              <w:t>Financeiro e faturamento</w:t>
             </w:r>
           </w:p>
         </w:tc>
@@ -1559,7 +1559,7 @@
               <w:rPr>
                 <w:sz w:val="18"/>
               </w:rPr>
-              <w:t>Onboarding</w:t>
+              <w:t>Preparação de retirada</w:t>
             </w:r>
           </w:p>
         </w:tc>
@@ -1582,7 +1582,7 @@
               <w:rPr>
                 <w:sz w:val="18"/>
               </w:rPr>
-              <w:t>Contratos</w:t>
+              <w:t>Reservas e contratos</w:t>
             </w:r>
           </w:p>
         </w:tc>
@@ -1605,7 +1605,7 @@
               <w:rPr>
                 <w:sz w:val="18"/>
               </w:rPr>
-              <w:t>Gestão de processos</w:t>
+              <w:t>Gestão de processos operacionais</w:t>
             </w:r>
           </w:p>
         </w:tc>
@@ -1678,7 +1678,7 @@
               <w:rPr>
                 <w:sz w:val="18"/>
               </w:rPr>
-              <w:t>Atendimento</w:t>
+              <w:t>Atendimento e assistência 24h</w:t>
             </w:r>
           </w:p>
         </w:tc>
@@ -1702,7 +1702,7 @@
               <w:rPr>
                 <w:sz w:val="18"/>
               </w:rPr>
-              <w:t>Contratos</w:t>
+              <w:t>Reservas e contratos</w:t>
             </w:r>
           </w:p>
         </w:tc>
@@ -1774,7 +1774,7 @@
               <w:rPr>
                 <w:sz w:val="18"/>
               </w:rPr>
-              <w:t>Atendimento</w:t>
+              <w:t>Atendimento e assistência 24h</w:t>
             </w:r>
           </w:p>
         </w:tc>
@@ -1797,7 +1797,7 @@
               <w:rPr>
                 <w:sz w:val="18"/>
               </w:rPr>
-              <w:t>Gestão de processos</w:t>
+              <w:t>Gestão de processos operacionais</w:t>
             </w:r>
           </w:p>
         </w:tc>
@@ -2139,7 +2139,7 @@
               <w:rPr>
                 <w:sz w:val="18"/>
               </w:rPr>
-              <w:t>Rascunho sem recadastro</w:t>
+              <w:t>Reserva/contrato sem recadastro</w:t>
             </w:r>
           </w:p>
         </w:tc>
@@ -2187,7 +2187,7 @@
               <w:rPr>
                 <w:sz w:val="18"/>
               </w:rPr>
-              <w:t>Ativar, faturar e iniciar onboarding</w:t>
+              <w:t>Ativar, faturar e iniciar preparação de retirada</w:t>
             </w:r>
           </w:p>
         </w:tc>
@@ -2260,7 +2260,7 @@
               <w:rPr>
                 <w:sz w:val="18"/>
               </w:rPr>
-              <w:t>Abrir chamado com contrato e SLA</w:t>
+              <w:t>Abrir chamado com contrato de locação e SLA</w:t>
             </w:r>
           </w:p>
         </w:tc>
@@ -2517,7 +2517,7 @@
         <w:jc w:val="both"/>
       </w:pPr>
       <w:r>
-        <w:t>Os requisitos não funcionais priorizam interoperabilidade, confiabilidade, segurança, observabilidade e manutenibilidade. Disponibilidade orienta a degradação do atendimento. A meta de desempenho fixa p95 inferior a 500 ms para consultas locais. Escalabilidade e testabilidade sustentam a evolução.</w:t>
+        <w:t>Os requisitos não funcionais priorizam interoperabilidade, confiabilidade, segurança, observabilidade e manutenibilidade. Disponibilidade orienta a degradação do atendimento e assistência 24h. A meta de desempenho fixa p95 inferior a 500 ms para consultas locais. Escalabilidade e testabilidade sustentam a evolução.</w:t>
       </w:r>
     </w:p>
     <w:p>
@@ -2915,7 +2915,7 @@
               <w:rPr>
                 <w:sz w:val="18"/>
               </w:rPr>
-              <w:t>API de atendimento</w:t>
+              <w:t>API de atendimento e assistência 24h</w:t>
             </w:r>
           </w:p>
         </w:tc>
@@ -2963,7 +2963,7 @@
               <w:rPr>
                 <w:sz w:val="18"/>
               </w:rPr>
-              <w:t>Onboarding e resolução</w:t>
+              <w:t>Preparação de retirada e resolução</w:t>
             </w:r>
           </w:p>
         </w:tc>
@@ -3508,7 +3508,7 @@
         <w:jc w:val="both"/>
       </w:pPr>
       <w:r>
-        <w:t>O protótipo simula tokens OIDC e aplica papéis comercial, contratos, financeiro, atendimento, operações e administrador. Validação ocorre na fronteira. Eventos não carregam documentos, dados bancários ou descrição de chamado. O ambiente real deve usar um provedor OIDC e TLS no gateway.</w:t>
+        <w:t>O protótipo simula tokens OIDC e aplica papéis comercial e canais digitais, reservas e contratos, financeiro e faturamento, atendimento e assistência 24h, operações e administrador. Validação ocorre na fronteira. Eventos não carregam documentos, dados bancários ou descrição de chamado. O ambiente real deve usar um provedor OIDC e TLS no gateway.</w:t>
       </w:r>
     </w:p>
     <w:p>
@@ -3518,7 +3518,7 @@
         <w:spacing w:before="160" w:after="240"/>
       </w:pPr>
       <w:r>
-        <w:t>7 Integração F1 Cliente para contrato</w:t>
+        <w:t>7 Integração F1 Cliente para reserva/contrato</w:t>
       </w:r>
     </w:p>
     <w:p>
@@ -3527,7 +3527,7 @@
         <w:jc w:val="both"/>
       </w:pPr>
       <w:r>
-        <w:t>O comercial cria ou seleciona um cliente no CRM. O endpoint de rascunho recebe o UUID global, serviço, início, cobrança e SLA. Contracts consulta CustomerReader, valida elegibilidade e consentimento e cria o contrato sem copiar manualmente o cadastro.</w:t>
+        <w:t>O comercial e canais digitais cria ou seleciona um cliente no CRM. O endpoint de rascunho recebe o UUID global, serviço, início, cobrança e SLA. Contracts consulta CustomerReader, valida elegibilidade e consentimento e cria o contrato sem copiar manualmente o cadastro.</w:t>
       </w:r>
     </w:p>
     <w:tbl>
@@ -4242,7 +4242,7 @@
         <w:spacing w:before="160" w:after="240"/>
       </w:pPr>
       <w:r>
-        <w:t>8 Integração F2 Ativação e onboarding</w:t>
+        <w:t>8 Integração F2 Ativação e preparação de retirada</w:t>
       </w:r>
     </w:p>
     <w:p>
@@ -4461,7 +4461,7 @@
               <w:rPr>
                 <w:sz w:val="18"/>
               </w:rPr>
-              <w:t>Processo de onboarding</w:t>
+              <w:t>Processo de preparação de retirada</w:t>
             </w:r>
           </w:p>
         </w:tc>
@@ -4582,7 +4582,7 @@
         <w:jc w:val="both"/>
       </w:pPr>
       <w:r>
-        <w:t>O teste F2 repetiu a ativação e o despacho e encontrou uma cobrança e um onboarding. Essa evidência atende ao requisito de demonstração de reentrega.</w:t>
+        <w:t>O teste F2 repetiu a ativação e o despacho e encontrou uma cobrança e uma preparação de retirada. Essa evidência atende ao requisito de demonstração de reentrega.</w:t>
       </w:r>
     </w:p>
     <w:p>
@@ -4997,7 +4997,7 @@
         <w:jc w:val="both"/>
       </w:pPr>
       <w:r>
-        <w:t>O evento omite a descrição do chamado. Workflow recebe apenas os identificadores, categoria, prioridade, estado e SLA necessários ao processo. O teste de degradação abriu o chamado pendente e o reconciliou depois que Contracts voltou. A implementação atual não recalcula no Workflow o prazo criado enquanto a elegibilidade estava pendente.</w:t>
+        <w:t>O evento omite a descrição do chamado. Workflow recebe apenas os identificadores, categoria, prioridade, estado e SLA necessários ao processo. O teste de degradação abriu o chamado pendente e o reconciliou depois que Contracts voltou. A reconciliação atualiza o prazo do processo de resolução no Workflow.</w:t>
       </w:r>
     </w:p>
     <w:p>
@@ -5144,7 +5144,7 @@
               <w:rPr>
                 <w:sz w:val="18"/>
               </w:rPr>
-              <w:t>UUID, formatos e contratos</w:t>
+              <w:t>UUID, formatos e reservas e contratos</w:t>
             </w:r>
           </w:p>
         </w:tc>
@@ -5747,7 +5747,7 @@
               <w:rPr>
                 <w:sz w:val="18"/>
               </w:rPr>
-              <w:t>13 testes aprovados</w:t>
+              <w:t>Verificar suíte ampliada antes da submissão</w:t>
             </w:r>
           </w:p>
         </w:tc>
@@ -5825,7 +5825,7 @@
         <w:jc w:val="both"/>
       </w:pPr>
       <w:r>
-        <w:t>A proposta reduz recadastro e conecta venda, ativação, cobrança, onboarding e atendimento. O monólito modular limita unidades de implantação, e os simuladores evitam licenças e ambientes legados na demonstração. A adoção organizacional ainda exige descoberta dos produtos, tratamento da qualidade dos dados, identidade corporativa, TLS, operação e capacidade.</w:t>
+        <w:t>A proposta reduz recadastro e conecta venda, ativação, cobrança, preparação de retirada e atendimento e assistência 24h. O monólito modular limita unidades de implantação, e os simuladores evitam licenças e ambientes legados na demonstração. A adoção organizacional ainda exige descoberta dos produtos, tratamento da qualidade dos dados, identidade corporativa, TLS, operação e capacidade.</w:t>
       </w:r>
     </w:p>
     <w:p>
@@ -5843,7 +5843,7 @@
         <w:ind w:left="360" w:hanging="259"/>
       </w:pPr>
       <w:r>
-        <w:t>•  Contratos com recadastro</w:t>
+        <w:t>•  Reservas e contratos com recadastro</w:t>
       </w:r>
     </w:p>
     <w:p>
@@ -5902,7 +5902,7 @@
         <w:jc w:val="both"/>
       </w:pPr>
       <w:r>
-        <w:t>A entrega implementou a arquitetura e produziu as evidências requeridas. Treze testes passaram. Os três fluxos integrados funcionaram; repetição não duplicou cobrança ou processo; falha de dependência preservou o chamado; e o reprocessamento manteve rastreabilidade. O OpenAPI expõe esquemas e exemplos, o AsyncAPI define o envelope completo e a API rejeita identificadores globais que não sejam UUID. O resultado atende ao propósito do enunciado de “demonstrar como a arquitetura e a integração funcionariam na prática” [1].</w:t>
+        <w:t>A entrega local implementou os cinco contextos com interface web, API e persistência. Os três fluxos integrados funcionaram em testes; repetição não duplicou cobrança ou processo; falha de dependência preservou o chamado; e reprocessamento manteve rastreabilidade. OpenAPI e AsyncAPI documentam os contratos. A publicação HTTPS no Render/Supabase permanece dependente de acesso às contas e teste de persistência. Os nomes e as contribuições dos integrantes devem ser registrados antes da submissão.</w:t>
       </w:r>
     </w:p>
     <w:p>
@@ -5911,7 +5911,7 @@
         <w:jc w:val="both"/>
       </w:pPr>
       <w:r>
-        <w:t>Os componentes permanecem organizados por responsabilidade. REST atende decisões imediatas e eventos desacoplam os efeitos posteriores. O ADR registra por que a equipe evitou microsserviços completos e um ESB com regras centrais. A arquitetura permite evolução porque as portas e contratos continuam válidos quando um adaptador ou módulo muda.</w:t>
+        <w:t>Os componentes permanecem organizados por responsabilidade. REST atende decisões imediatas e eventos desacoplam os efeitos posteriores. O ADR registra por que a equipe evitou microsserviços completos e um ESB com regras centrais. A arquitetura permite evolução porque as portas e reservas e contratos continuam válidos quando um adaptador ou módulo muda.</w:t>
       </w:r>
     </w:p>
     <w:p>
@@ -5945,7 +5945,7 @@
         <w:jc w:val="both"/>
       </w:pPr>
       <w:r>
-        <w:t>O principal limite decorre dos dados organizacionais ausentes. Produtos, volumes e interfaces reais podem alterar adaptadores, timeout e capacidade. O protótipo também não agenda retentativas com atraso, não oferece OIDC ou TLS reais e não recalcula o prazo do processo de resolução depois da reconciliação do chamado. O contador de tentativas permanece acumulado após o reprocessamento.</w:t>
+        <w:t>O principal limite decorre dos dados organizacionais ausentes. Produtos, volumes e interfaces reais podem alterar adaptadores, timeout e capacidade. O protótipo não agenda retentativas com atraso, não oferece OIDC ou tracing distribuído e não usa RabbitMQ como transporte de entrada dos consumidores. No modo público, usa uma credencial compartilhada definida no servidor. Após reconciliação, o prazo do processo é atualizado e o reprocessamento reinicia o contador de tentativas.</w:t>
       </w:r>
     </w:p>
     <w:p>
@@ -5954,7 +5954,7 @@
         <w:jc w:val="both"/>
       </w:pPr>
       <w:r>
-        <w:t>Os próximos passos são validar o AS-IS, conectar identidade e sistemas reais por adaptadores, automatizar retentativas transitórias e sincronizar o prazo do Workflow após a reconciliação. Métricas de escala, disponibilidade ou cadência devem orientar qualquer extração futura. Decisões estruturais adicionais exigem novo ADR.</w:t>
+        <w:t>Os próximos passos são validar o AS-IS com a disciplina, publicar e testar o ambiente gratuito, conectar identidade e sistemas reais apenas com autorização e automatizar retentativas transitórias. Métricas de escala, disponibilidade ou cadência devem orientar extrações futuras. Decisões estruturais adicionais exigem novo ADR.</w:t>
       </w:r>
     </w:p>
     <w:p>
@@ -5973,7 +5973,7 @@
         <w:ind w:left="360" w:hanging="360"/>
       </w:pPr>
       <w:r>
-        <w:t>[1] ARCHCORP. Projeto Aplicado ArchCorp Arquitetura de Sistemas Corporativos. Enunciado acadêmico fornecido ao projeto, 2026.</w:t>
+        <w:t>[1] ARCHCORP. Plano de Execução e Cronograma Detalhado. Material acadêmico fornecido ao projeto, 2026.</w:t>
       </w:r>
     </w:p>
     <w:p>
@@ -6045,7 +6045,7 @@
         <w:jc w:val="both"/>
       </w:pPr>
       <w:r>
-        <w:t>Documentos complementares do repositório: ADR-001; requisitos; plano de implementação; matriz de rastreabilidade; arquitetura AS-IS, TO-BE e fluxos de integração; exemplos de API; contratos OpenAPI e AsyncAPI; roteiro de demonstração; evidências de validação.</w:t>
+        <w:t>Documentos complementares do repositório: ADR-001; requisitos; plano de implementação; matriz de rastreabilidade; arquitetura AS-IS, TO-BE e fluxos de integração; exemplos de API; reservas e contratos OpenAPI e AsyncAPI; roteiro de demonstração; evidências de validação.</w:t>
       </w:r>
     </w:p>
     <w:sectPr>

</xml_diff>

<commit_message>
docs(T19): alinha relatorio e slides as evidencias atuais
</commit_message>
<xml_diff>
--- a/output/Relatorio_Tecnico_Cenario_4.docx
+++ b/output/Relatorio_Tecnico_Cenario_4.docx
@@ -9,7 +9,7 @@
         <w:jc w:val="center"/>
       </w:pPr>
       <w:r>
-        <w:t>Arquitetura de Integração para Empresa de Serviços</w:t>
+        <w:t>Arquitetura de Integração no Cenário Localiza</w:t>
       </w:r>
     </w:p>
     <w:p>
@@ -32,7 +32,7 @@
       <w:r>
         <w:t>Equipe do Projeto Aplicado — nomes e contribuições pendentes</w:t>
         <w:br/>
-        <w:t>27 de setembro de 2026</w:t>
+        <w:t>30 de setembro de 2026</w:t>
         <w:br/>
         <w:t>Relatório técnico em revisão</w:t>
       </w:r>
@@ -71,7 +71,7 @@
         <w:jc w:val="both"/>
       </w:pPr>
       <w:r>
-        <w:t>A avaliação histórica de setembro executou 13 testes automatizados; a suíte ampliada inclui agora reservas, pagamentos simulados, resolução de chamados e proteção da demo pública. Os três fluxos obrigatórios funcionaram no banco de testes: cliente do CRM para contrato; ativação para primeira fatura e preparação de retirada; chamado com contrato e SLA. A medição anterior de 200 consultas locais de prontidão teve p95 de 6,36 ms e não representa latência em hospedagem pública.</w:t>
+        <w:t>Em 30/09/2026, 84 testes Python e 11 testes de navegador passaram. F1, F2 e F3 preservaram identidade e efeitos únicos. A avaliação incluiu centavos e auditoria financeira, estados finais de tarefas, recuperação após erro SQL e privacidade de exceções. A varredura axe em sete telas não detectou violações automáticas; isso não comprova WCAG completa. Em 200 consultas locais de prontidão, o p95 foi 3,68 ms, sem carga concorrente ou hospedagem pública.</w:t>
       </w:r>
     </w:p>
     <w:p>
@@ -107,7 +107,7 @@
         <w:jc w:val="both"/>
       </w:pPr>
       <w:r>
-        <w:t>A Localiza recebeu a tarefa de modernizar uma organização que acumulou aplicações distintas ao crescer. Para o Cenário 4, o documento define cinco sistemas: CRM, reservas e contratos, financeiro e faturamento, atendimento e assistência 24h e gestão de processos operacionais [1]. A falta de comunicação adequada cria duplicidade, recadastro, dificuldade de manutenção e baixa capacidade de evolução.</w:t>
+        <w:t>Este projeto acadêmico modela a integração de cinco capacidades do cenário de locação: CRM, reservas e contratos, financeiro e faturamento, atendimento e assistência 24h e gestão de processos operacionais. O Guia.pdf orienta a análise arquitetural e as entregas [1]; o plano local define os três fluxos. Produtos, interfaces e dificuldades reais da Localiza são premissas a validar, sem acesso a seus sistemas.</w:t>
       </w:r>
     </w:p>
     <w:p>
@@ -116,7 +116,7 @@
         <w:jc w:val="both"/>
       </w:pPr>
       <w:r>
-        <w:t>O problema arquitetural envolve propriedade de dados e coordenação entre sistemas. Uma chamada bem-sucedida não basta quando uma ativação precisa produzir cobrança e preparação de retirada, pois uma falha intermediária pode perder o fato ou repetir efeitos. A solução precisa definir reservas e contratos, responsabilidades, consistência e recuperação.</w:t>
+        <w:t>O problema arquitetural envolve propriedade de dados e coordenação entre sistemas. Uma chamada bem-sucedida não basta quando uma ativação precisa produzir cobrança e preparação de retirada, pois uma falha intermediária pode perder o fato ou repetir efeitos. A solução precisa definir contratos técnicos, responsabilidades, consistência e recuperação.</w:t>
       </w:r>
     </w:p>
     <w:p>
@@ -505,7 +505,7 @@
               <w:rPr>
                 <w:sz w:val="18"/>
               </w:rPr>
-              <w:t>PostgreSQL na demonstração e SQLite nos testes</w:t>
+              <w:t>SQLite verificado; PostgreSQL previsto no Compose</w:t>
             </w:r>
           </w:p>
         </w:tc>
@@ -553,7 +553,7 @@
               <w:rPr>
                 <w:sz w:val="18"/>
               </w:rPr>
-              <w:t>RabbitMQ e outbox persistida</w:t>
+              <w:t>Outbox verificada; cópia RabbitMQ opcional</w:t>
             </w:r>
           </w:p>
         </w:tc>
@@ -579,7 +579,7 @@
               <w:rPr>
                 <w:sz w:val="18"/>
               </w:rPr>
-              <w:t>Reservas e contratos</w:t>
+              <w:t>Contratos técnicos</w:t>
             </w:r>
           </w:p>
         </w:tc>
@@ -603,7 +603,7 @@
               <w:rPr>
                 <w:sz w:val="18"/>
               </w:rPr>
-              <w:t>OpenAPI 3.1 e AsyncAPI 3.0</w:t>
+              <w:t>OpenAPI 3.1 e AsyncAPI 3.0, seis eventos</w:t>
             </w:r>
           </w:p>
         </w:tc>
@@ -701,7 +701,7 @@
               <w:rPr>
                 <w:sz w:val="18"/>
               </w:rPr>
-              <w:t>Pytest, testes de arquitetura e medição local</w:t>
+              <w:t>Pytest, Playwright/axe, contratos e medição local</w:t>
             </w:r>
           </w:p>
         </w:tc>
@@ -726,7 +726,7 @@
         <w:jc w:val="both"/>
       </w:pPr>
       <w:r>
-        <w:t>O trabalho seguiu seis ciclos: descoberta; reservas e contratos e fundação; adaptadores; fluxos; qualidade; e entrega. Cada mudança relacionou requisito, decisão, implementação e evidência. A equipe tratou detalhes organizacionais ausentes como premissas e preservou o enunciado como fonte prioritária.</w:t>
+        <w:t>O trabalho seguiu descoberta, contratos técnicos e fundação, adaptadores, fluxos, qualidade e entrega. Cada tarefa foi verificada e comitada antes da próxima. Alembic aditivo e carga sintética idempotente foram testados em SQLite; o SQL PostgreSQL foi gerado offline, sem execução em nuvem. O enunciado específico Localiza não foi localizado no checkout; o Guia.pdf e o plano local sustentam as premissas explícitas.</w:t>
       </w:r>
     </w:p>
     <w:p>
@@ -955,7 +955,7 @@
               <w:rPr>
                 <w:sz w:val="18"/>
               </w:rPr>
-              <w:t>Jurídico e reservas e contratos</w:t>
+              <w:t>Operação e jurídico</w:t>
             </w:r>
           </w:p>
         </w:tc>
@@ -3508,7 +3508,7 @@
         <w:jc w:val="both"/>
       </w:pPr>
       <w:r>
-        <w:t>O protótipo simula tokens OIDC e aplica papéis comercial e canais digitais, reservas e contratos, financeiro e faturamento, atendimento e assistência 24h, operações e administrador. Validação ocorre na fronteira. Eventos não carregam documentos, dados bancários ou descrição de chamado. O ambiente real deve usar um provedor OIDC e TLS no gateway.</w:t>
+        <w:t>O protótipo usa tokens locais com papéis; no modo público exige segredo externo compartilhado, sem OIDC ou contas individuais. Validação ocorre na fronteira. Eventos omitem descrição de chamado e dados bancários. Logs e fila de falhas omitem texto livre e traceback de exceções, preservando tipo e correlação. PostgreSQL/RLS e TLS publicados ainda dependem de validação na T20.</w:t>
       </w:r>
     </w:p>
     <w:p>
@@ -4573,7 +4573,7 @@
         <w:jc w:val="both"/>
       </w:pPr>
       <w:r>
-        <w:t>Uma falha mantém o evento pendente até nova chamada de despacho. Após três tentativas, o evento passa a FAILED com motivo e correlação. Um operador autorizado pode agendar o reprocessamento. A operação preserva o contador acumulado; uma nova falha retorna imediatamente a FAILED. Inbox e restrições únicas continuam válidas, portanto um efeito já confirmado não se repete.</w:t>
+        <w:t>Uma falha desfaz efeitos locais e inbox do despacho por savepoint, inclusive em erro SQL. Depois incrementa attempts e registra tipo do erro e correlação, sem texto da exceção. Após três tentativas o evento fica FAILED. O reprocessamento explícito é auditado e zera attempts, abrindo nova janela de tentativas; não existe agendador ou atraso automático. Publicação no broker não participa de transação distribuída.</w:t>
       </w:r>
     </w:p>
     <w:p>
@@ -4582,7 +4582,7 @@
         <w:jc w:val="both"/>
       </w:pPr>
       <w:r>
-        <w:t>O teste F2 repetiu a ativação e o despacho e encontrou uma cobrança e uma preparação de retirada. Essa evidência atende ao requisito de demonstração de reentrega.</w:t>
+        <w:t>O teste F2 reentregou o mesmo eventId e outro evento de ativação para o mesmo contrato, mantendo uma fatura e um processo. Finance também valida pagamentos parciais/totais, moeda, saldo, precisão de centavos, auditoria e inadimplência por vencimento. Recorrência, multas e acerto final não são implementados.</w:t>
       </w:r>
     </w:p>
     <w:p>
@@ -4997,7 +4997,7 @@
         <w:jc w:val="both"/>
       </w:pPr>
       <w:r>
-        <w:t>O evento omite a descrição do chamado. Workflow recebe apenas os identificadores, categoria, prioridade, estado e SLA necessários ao processo. O teste de degradação abriu o chamado pendente e o reconciliou depois que Contracts voltou. A reconciliação atualiza o prazo do processo de resolução no Workflow.</w:t>
+        <w:t>O evento omite a descrição do chamado. A reconciliação atualiza o prazo do Workflow; a resolução conclui suas tarefas. Tarefas manuais herdam prazo, aceitam responsável e são auditadas. Tarefas finais não reabrem; repetir estado e responsável não duplica efeitos. Todas DONE concluem o processo; todas finais com algum cancelamento o cancelam. Indisponibilidade preserva o chamado para reconciliação.</w:t>
       </w:r>
     </w:p>
     <w:p>
@@ -5144,7 +5144,7 @@
               <w:rPr>
                 <w:sz w:val="18"/>
               </w:rPr>
-              <w:t>UUID, formatos e reservas e contratos</w:t>
+              <w:t>UUID, formatos e contratos técnicos</w:t>
             </w:r>
           </w:p>
         </w:tc>
@@ -5312,7 +5312,7 @@
               <w:rPr>
                 <w:sz w:val="18"/>
               </w:rPr>
-              <w:t>Teste 403</w:t>
+              <w:t>401/403 e privacidade de falha</w:t>
             </w:r>
           </w:p>
         </w:tc>
@@ -5602,7 +5602,7 @@
               <w:rPr>
                 <w:sz w:val="18"/>
               </w:rPr>
-              <w:t>p95 de 6,36 ms</w:t>
+              <w:t>p95 local de 3,68 ms</w:t>
             </w:r>
           </w:p>
         </w:tc>
@@ -5676,7 +5676,7 @@
               <w:rPr>
                 <w:sz w:val="18"/>
               </w:rPr>
-              <w:t>Escala por fila possível</w:t>
+              <w:t>Evolução futura; sem medição de escala</w:t>
             </w:r>
           </w:p>
         </w:tc>
@@ -5747,7 +5747,7 @@
               <w:rPr>
                 <w:sz w:val="18"/>
               </w:rPr>
-              <w:t>Verificar suíte ampliada antes da submissão</w:t>
+              <w:t>84 testes Python; 11 de navegador</w:t>
             </w:r>
           </w:p>
         </w:tc>
@@ -5911,7 +5911,7 @@
         <w:jc w:val="both"/>
       </w:pPr>
       <w:r>
-        <w:t>Os componentes permanecem organizados por responsabilidade. REST atende decisões imediatas e eventos desacoplam os efeitos posteriores. O ADR registra por que a equipe evitou microsserviços completos e um ESB com regras centrais. A arquitetura permite evolução porque as portas e reservas e contratos continuam válidos quando um adaptador ou módulo muda.</w:t>
+        <w:t>Os componentes permanecem organizados por responsabilidade. REST atende decisões imediatas e eventos desacoplam os efeitos posteriores. O ADR registra por que a equipe evitou microsserviços completos e um ESB com regras centrais. A arquitetura permite evolução porque as portas e contratos técnicos continuam válidos quando um adaptador ou módulo muda.</w:t>
       </w:r>
     </w:p>
     <w:p>
@@ -5973,7 +5973,7 @@
         <w:ind w:left="360" w:hanging="360"/>
       </w:pPr>
       <w:r>
-        <w:t>[1] ARCHCORP. Plano de Execução e Cronograma Detalhado. Material acadêmico fornecido ao projeto, 2026.</w:t>
+        <w:t>[1] GUIA do Projeto Aplicado. Guia.pdf, material acadêmico disponível no repositório, 2026. Escopo do cenário: PLANO_IMPLEMENTACAO_CENARIO_4.md. Enunciado específico Localiza não localizado no checkout.</w:t>
       </w:r>
     </w:p>
     <w:p>
@@ -6045,7 +6045,7 @@
         <w:jc w:val="both"/>
       </w:pPr>
       <w:r>
-        <w:t>Documentos complementares do repositório: ADR-001; requisitos; plano de implementação; matriz de rastreabilidade; arquitetura AS-IS, TO-BE e fluxos de integração; exemplos de API; reservas e contratos OpenAPI e AsyncAPI; roteiro de demonstração; evidências de validação.</w:t>
+        <w:t>Documentos complementares do repositório: ADR-001; requisitos; plano de implementação; matriz de rastreabilidade; arquitetura AS-IS, TO-BE e fluxos de integração; exemplos de API; contratos OpenAPI e AsyncAPI; roteiro de demonstração; evidências de validação.</w:t>
       </w:r>
     </w:p>
     <w:sectPr>

</xml_diff>

<commit_message>
docs: atualiza relatório técnico com o estado de 14/10/2026
- Finance: faturas inicial e final, ciclo de vida, inadimplência e ADR-003
- Contracts e Support: encerramento, atribuição, slaStatus e replay
- Interface React, problema+json e limitações novas
- Corrige o contador de reprocessamento (zera e audita previousAttempts)
- Testes: 194 aprovados e 10 ignorados (exigem PostgreSQL/RabbitMQ reais)

Co-Authored-By: Claude Sonnet 5.5 <noreply@anthropic.com>
Claude-Session: https://claude.ai/code/session_01Mcum5vZnZNRtZN1BQi9rqn
</commit_message>
<xml_diff>
--- a/output/Relatorio_Tecnico_Cenario_4.docx
+++ b/output/Relatorio_Tecnico_Cenario_4.docx
@@ -32,7 +32,7 @@
       <w:r>
         <w:t>Equipe do Projeto Aplicado — nomes e contribuições pendentes</w:t>
         <w:br/>
-        <w:t>27 de setembro de 2026</w:t>
+        <w:t>14 de outubro de 2026</w:t>
         <w:br/>
         <w:t>Relatório técnico em revisão</w:t>
       </w:r>
@@ -71,7 +71,7 @@
         <w:jc w:val="both"/>
       </w:pPr>
       <w:r>
-        <w:t>A avaliação histórica de setembro executou 13 testes automatizados; a suíte ampliada inclui agora reservas, pagamentos simulados, resolução de chamados e proteção da demo pública. Os três fluxos obrigatórios funcionaram no banco de testes: cliente do CRM para contrato; ativação para primeira fatura e preparação de retirada; chamado com contrato e SLA. A medição anterior de 200 consultas locais de prontidão teve p95 de 6,36 ms e não representa latência em hospedagem pública.</w:t>
+        <w:t>Em 14 de outubro de 2026, a suíte automatizada local executou 194 testes aprovados e 10 ignorados; os ignorados exigem PostgreSQL ou RabbitMQ reais, não configurados no ambiente. A suíte cobre reservas e contratos, ciclo de vida da fatura, pagamentos simulados, atendimento com SLA e proteção da demo pública. Os três fluxos obrigatórios funcionaram no banco de testes: cliente do CRM para contrato; ativação para primeira fatura e preparação de retirada; chamado com contrato e SLA. A medição anterior de 200 consultas locais de prontidão teve p95 de 6,36 ms e não representa latência em hospedagem pública.</w:t>
       </w:r>
     </w:p>
     <w:p>
@@ -2818,7 +2818,7 @@
               <w:rPr>
                 <w:sz w:val="18"/>
               </w:rPr>
-              <w:t>Cobranças</w:t>
+              <w:t>Faturas inicial e final, pagamentos e inadimplência</w:t>
             </w:r>
           </w:p>
         </w:tc>
@@ -2841,7 +2841,7 @@
               <w:rPr>
                 <w:sz w:val="18"/>
               </w:rPr>
-              <w:t>Consumidor de ContractActivated</w:t>
+              <w:t>Consumidor de ContractActivated e ContractClosed</w:t>
             </w:r>
           </w:p>
         </w:tc>
@@ -3104,7 +3104,7 @@
         <w:jc w:val="both"/>
       </w:pPr>
       <w:r>
-        <w:t>Docker Compose inicia a API, PostgreSQL e RabbitMQ. A API atende canais e documentação. PostgreSQL persiste transações e registros de integração. RabbitMQ recebe cópias duráveis dos eventos para observação e integração externa. Os handlers internos demonstram consumidores substituíveis.</w:t>
+        <w:t>A interface React/TypeScript navega entre os cinco contextos, mostra estados de carregamento, vazio e erro e exibe o corpo application/problem+json (RFC 9457) com code e correlationId. Docker Compose inicia a API, PostgreSQL e RabbitMQ. A API atende canais e documentação. PostgreSQL persiste transações e registros de integração. RabbitMQ recebe cópias duráveis dos eventos para observação e integração externa. Os handlers internos demonstram consumidores substituíveis.</w:t>
       </w:r>
     </w:p>
     <w:tbl>
@@ -4232,7 +4232,7 @@
         <w:jc w:val="both"/>
       </w:pPr>
       <w:r>
-        <w:t>Uma repetição com a mesma chave devolve o mesmo contractId. A auditoria registra operação, resultado e correlação. O teste F1 comprovou o comportamento.</w:t>
+        <w:t>Uma repetição com a mesma chave devolve o mesmo contractId. A auditoria registra operação, resultado e correlação. O teste F1 e a demonstração contra o servidor local (14/10/2026) comprovaram o comportamento. A reserva idempotente pode ser cancelada ou convertida em rascunho na mesma transação; a ativação revalida o cliente e o encerramento é idempotente e publica ContractClosed.v1.</w:t>
       </w:r>
     </w:p>
     <w:p>
@@ -4388,7 +4388,7 @@
               <w:rPr>
                 <w:sz w:val="18"/>
               </w:rPr>
-              <w:t>Primeira cobrança</w:t>
+              <w:t>Primeira fatura (INITIAL)</w:t>
             </w:r>
           </w:p>
         </w:tc>
@@ -4411,7 +4411,7 @@
               <w:rPr>
                 <w:sz w:val="18"/>
               </w:rPr>
-              <w:t>Contrato único na tabela financeira</w:t>
+              <w:t>Uma fatura por contrato e tipo (ADR-003)</w:t>
             </w:r>
           </w:p>
         </w:tc>
@@ -4573,7 +4573,7 @@
         <w:jc w:val="both"/>
       </w:pPr>
       <w:r>
-        <w:t>Uma falha mantém o evento pendente até nova chamada de despacho. Após três tentativas, o evento passa a FAILED com motivo e correlação. Um operador autorizado pode agendar o reprocessamento. A operação preserva o contador acumulado; uma nova falha retorna imediatamente a FAILED. Inbox e restrições únicas continuam válidas, portanto um efeito já confirmado não se repete.</w:t>
+        <w:t>Uma falha mantém o evento pendente até nova chamada de despacho. Após três tentativas, o evento passa a FAILED com motivo e correlação. Um operador autorizado pode agendar o reprocessamento. A operação audita o valor anterior em previousAttempts e zera o contador, abrindo nova janela de tentativas. Inbox e restrições únicas continuam válidas, portanto um efeito já confirmado não se repete.</w:t>
       </w:r>
     </w:p>
     <w:p>
@@ -4583,6 +4583,15 @@
       </w:pPr>
       <w:r>
         <w:t>O teste F2 repetiu a ativação e o despacho e encontrou uma cobrança e uma preparação de retirada. Essa evidência atende ao requisito de demonstração de reentrega.</w:t>
+      </w:r>
+    </w:p>
+    <w:p>
+      <w:pPr>
+        <w:spacing w:after="160" w:line="276" w:lineRule="auto"/>
+        <w:jc w:val="both"/>
+      </w:pPr>
+      <w:r>
+        <w:t>No encerramento, ContractClosed.v1 faz Finance emitir a fatura final (FINAL), idempotente por eventId, descontando as faturas já emitidas. A fatura segue os estados OPEN, PARTIALLY_PAID, PAID, OVERDUE e CANCELLED; o pagamento simulado recusa sobrepagamento e expõe o saldo. O comando overdue-check registra a inadimplência. O faturamento por ciclo e o prazo de 10 dias são premissas a validar.</w:t>
       </w:r>
     </w:p>
     <w:p>
@@ -4997,7 +5006,7 @@
         <w:jc w:val="both"/>
       </w:pPr>
       <w:r>
-        <w:t>O evento omite a descrição do chamado. Workflow recebe apenas os identificadores, categoria, prioridade, estado e SLA necessários ao processo. O teste de degradação abriu o chamado pendente e o reconciliou depois que Contracts voltou. A reconciliação atualiza o prazo do processo de resolução no Workflow.</w:t>
+        <w:t>O evento omite a descrição do chamado. Workflow recebe apenas os identificadores, categoria, prioridade, estado e SLA necessários ao processo. O teste de degradação abriu o chamado pendente e o reconciliou depois que Contracts voltou. A reconciliação, individual ou em lote, atualiza o prazo do processo de resolução no Workflow. O chamado também tem atribuição com histórico, slaStatus (PENDING, WITHIN, BREACHED, MET ou NOT_APPLICABLE) e resolução com replay por Idempotency-Key.</w:t>
       </w:r>
     </w:p>
     <w:p>
@@ -5747,7 +5756,7 @@
               <w:rPr>
                 <w:sz w:val="18"/>
               </w:rPr>
-              <w:t>Verificar suíte ampliada antes da submissão</w:t>
+              <w:t>194 testes aprovados e 10 ignorados (14/10/2026)</w:t>
             </w:r>
           </w:p>
         </w:tc>
@@ -5945,7 +5954,7 @@
         <w:jc w:val="both"/>
       </w:pPr>
       <w:r>
-        <w:t>O principal limite decorre dos dados organizacionais ausentes. Produtos, volumes e interfaces reais podem alterar adaptadores, timeout e capacidade. O protótipo não agenda retentativas com atraso, não oferece OIDC ou tracing distribuído e não usa RabbitMQ como transporte de entrada dos consumidores. No modo público, usa uma credencial compartilhada definida no servidor. Após reconciliação, o prazo do processo é atualizado e o reprocessamento reinicia o contador de tentativas.</w:t>
+        <w:t>O principal limite decorre dos dados organizacionais ausentes. Produtos, volumes e interfaces reais podem alterar adaptadores, timeout e capacidade. O protótipo não agenda retentativas com atraso, não oferece OIDC ou tracing distribuído e não usa RabbitMQ como transporte de entrada dos consumidores. No modo público, usa uma credencial compartilhada definida no servidor. Não há agendador: vencimento de fatura e SLA dependem de ação via API, e CustomerReader não tem timeout nem retentativa. Valores monetários continuam float na API v1 (dívida para a v2). RLS e PostgreSQL do Supabase não foram verificados, e não há teste de frontend versionado. Encerramentos anteriores à T12 não geram fatura final retroativa, e o financeiro completo estava em revisão. Após reconciliação, o prazo do processo é atualizado e o reprocessamento reinicia o contador de tentativas.</w:t>
       </w:r>
     </w:p>
     <w:p>
@@ -6045,7 +6054,7 @@
         <w:jc w:val="both"/>
       </w:pPr>
       <w:r>
-        <w:t>Documentos complementares do repositório: ADR-001; requisitos; plano de implementação; matriz de rastreabilidade; arquitetura AS-IS, TO-BE e fluxos de integração; exemplos de API; reservas e contratos OpenAPI e AsyncAPI; roteiro de demonstração; evidências de validação.</w:t>
+        <w:t>Documentos complementares do repositório: ADR-001 a ADR-005; requisitos; plano de implementação; matriz de rastreabilidade; arquitetura AS-IS, TO-BE e fluxos de integração; exemplos de API; reservas e contratos OpenAPI e AsyncAPI; roteiro de demonstração; evidências de validação.</w:t>
       </w:r>
     </w:p>
     <w:sectPr>

</xml_diff>

<commit_message>
docs: atualiza relatório técnico com o estado de 14/10/2026 (#41)
- Finance: faturas inicial e final, ciclo de vida, inadimplência e ADR-003
- Contracts e Support: encerramento, atribuição, slaStatus e replay
- Interface React, problema+json e limitações novas
- Corrige o contador de reprocessamento (zera e audita previousAttempts)
- Testes: 194 aprovados e 10 ignorados (exigem PostgreSQL/RabbitMQ reais)


Claude-Session: https://claude.ai/code/session_01Mcum5vZnZNRtZN1BQi9rqn

Co-authored-by: Claude <noreply@anthropic.com>
</commit_message>
<xml_diff>
--- a/output/Relatorio_Tecnico_Cenario_4.docx
+++ b/output/Relatorio_Tecnico_Cenario_4.docx
@@ -32,7 +32,7 @@
       <w:r>
         <w:t>Equipe do Projeto Aplicado — nomes e contribuições pendentes</w:t>
         <w:br/>
-        <w:t>27 de setembro de 2026</w:t>
+        <w:t>14 de outubro de 2026</w:t>
         <w:br/>
         <w:t>Relatório técnico em revisão</w:t>
       </w:r>
@@ -71,7 +71,7 @@
         <w:jc w:val="both"/>
       </w:pPr>
       <w:r>
-        <w:t>A avaliação histórica de setembro executou 13 testes automatizados; a suíte ampliada inclui agora reservas, pagamentos simulados, resolução de chamados e proteção da demo pública. Os três fluxos obrigatórios funcionaram no banco de testes: cliente do CRM para contrato; ativação para primeira fatura e preparação de retirada; chamado com contrato e SLA. A medição anterior de 200 consultas locais de prontidão teve p95 de 6,36 ms e não representa latência em hospedagem pública.</w:t>
+        <w:t>Em 14 de outubro de 2026, a suíte automatizada local executou 194 testes aprovados e 10 ignorados; os ignorados exigem PostgreSQL ou RabbitMQ reais, não configurados no ambiente. A suíte cobre reservas e contratos, ciclo de vida da fatura, pagamentos simulados, atendimento com SLA e proteção da demo pública. Os três fluxos obrigatórios funcionaram no banco de testes: cliente do CRM para contrato; ativação para primeira fatura e preparação de retirada; chamado com contrato e SLA. A medição anterior de 200 consultas locais de prontidão teve p95 de 6,36 ms e não representa latência em hospedagem pública.</w:t>
       </w:r>
     </w:p>
     <w:p>
@@ -2818,7 +2818,7 @@
               <w:rPr>
                 <w:sz w:val="18"/>
               </w:rPr>
-              <w:t>Cobranças</w:t>
+              <w:t>Faturas inicial e final, pagamentos e inadimplência</w:t>
             </w:r>
           </w:p>
         </w:tc>
@@ -2841,7 +2841,7 @@
               <w:rPr>
                 <w:sz w:val="18"/>
               </w:rPr>
-              <w:t>Consumidor de ContractActivated</w:t>
+              <w:t>Consumidor de ContractActivated e ContractClosed</w:t>
             </w:r>
           </w:p>
         </w:tc>
@@ -3104,7 +3104,7 @@
         <w:jc w:val="both"/>
       </w:pPr>
       <w:r>
-        <w:t>Docker Compose inicia a API, PostgreSQL e RabbitMQ. A API atende canais e documentação. PostgreSQL persiste transações e registros de integração. RabbitMQ recebe cópias duráveis dos eventos para observação e integração externa. Os handlers internos demonstram consumidores substituíveis.</w:t>
+        <w:t>A interface React/TypeScript navega entre os cinco contextos, mostra estados de carregamento, vazio e erro e exibe o corpo application/problem+json (RFC 9457) com code e correlationId. Docker Compose inicia a API, PostgreSQL e RabbitMQ. A API atende canais e documentação. PostgreSQL persiste transações e registros de integração. RabbitMQ recebe cópias duráveis dos eventos para observação e integração externa. Os handlers internos demonstram consumidores substituíveis.</w:t>
       </w:r>
     </w:p>
     <w:tbl>
@@ -4232,7 +4232,7 @@
         <w:jc w:val="both"/>
       </w:pPr>
       <w:r>
-        <w:t>Uma repetição com a mesma chave devolve o mesmo contractId. A auditoria registra operação, resultado e correlação. O teste F1 comprovou o comportamento.</w:t>
+        <w:t>Uma repetição com a mesma chave devolve o mesmo contractId. A auditoria registra operação, resultado e correlação. O teste F1 e a demonstração contra o servidor local (14/10/2026) comprovaram o comportamento. A reserva idempotente pode ser cancelada ou convertida em rascunho na mesma transação; a ativação revalida o cliente e o encerramento é idempotente e publica ContractClosed.v1.</w:t>
       </w:r>
     </w:p>
     <w:p>
@@ -4388,7 +4388,7 @@
               <w:rPr>
                 <w:sz w:val="18"/>
               </w:rPr>
-              <w:t>Primeira cobrança</w:t>
+              <w:t>Primeira fatura (INITIAL)</w:t>
             </w:r>
           </w:p>
         </w:tc>
@@ -4411,7 +4411,7 @@
               <w:rPr>
                 <w:sz w:val="18"/>
               </w:rPr>
-              <w:t>Contrato único na tabela financeira</w:t>
+              <w:t>Uma fatura por contrato e tipo (ADR-003)</w:t>
             </w:r>
           </w:p>
         </w:tc>
@@ -4573,7 +4573,7 @@
         <w:jc w:val="both"/>
       </w:pPr>
       <w:r>
-        <w:t>Uma falha mantém o evento pendente até nova chamada de despacho. Após três tentativas, o evento passa a FAILED com motivo e correlação. Um operador autorizado pode agendar o reprocessamento. A operação preserva o contador acumulado; uma nova falha retorna imediatamente a FAILED. Inbox e restrições únicas continuam válidas, portanto um efeito já confirmado não se repete.</w:t>
+        <w:t>Uma falha mantém o evento pendente até nova chamada de despacho. Após três tentativas, o evento passa a FAILED com motivo e correlação. Um operador autorizado pode agendar o reprocessamento. A operação audita o valor anterior em previousAttempts e zera o contador, abrindo nova janela de tentativas. Inbox e restrições únicas continuam válidas, portanto um efeito já confirmado não se repete.</w:t>
       </w:r>
     </w:p>
     <w:p>
@@ -4583,6 +4583,15 @@
       </w:pPr>
       <w:r>
         <w:t>O teste F2 repetiu a ativação e o despacho e encontrou uma cobrança e uma preparação de retirada. Essa evidência atende ao requisito de demonstração de reentrega.</w:t>
+      </w:r>
+    </w:p>
+    <w:p>
+      <w:pPr>
+        <w:spacing w:after="160" w:line="276" w:lineRule="auto"/>
+        <w:jc w:val="both"/>
+      </w:pPr>
+      <w:r>
+        <w:t>No encerramento, ContractClosed.v1 faz Finance emitir a fatura final (FINAL), idempotente por eventId, descontando as faturas já emitidas. A fatura segue os estados OPEN, PARTIALLY_PAID, PAID, OVERDUE e CANCELLED; o pagamento simulado recusa sobrepagamento e expõe o saldo. O comando overdue-check registra a inadimplência. O faturamento por ciclo e o prazo de 10 dias são premissas a validar.</w:t>
       </w:r>
     </w:p>
     <w:p>
@@ -4997,7 +5006,7 @@
         <w:jc w:val="both"/>
       </w:pPr>
       <w:r>
-        <w:t>O evento omite a descrição do chamado. Workflow recebe apenas os identificadores, categoria, prioridade, estado e SLA necessários ao processo. O teste de degradação abriu o chamado pendente e o reconciliou depois que Contracts voltou. A reconciliação atualiza o prazo do processo de resolução no Workflow.</w:t>
+        <w:t>O evento omite a descrição do chamado. Workflow recebe apenas os identificadores, categoria, prioridade, estado e SLA necessários ao processo. O teste de degradação abriu o chamado pendente e o reconciliou depois que Contracts voltou. A reconciliação, individual ou em lote, atualiza o prazo do processo de resolução no Workflow. O chamado também tem atribuição com histórico, slaStatus (PENDING, WITHIN, BREACHED, MET ou NOT_APPLICABLE) e resolução com replay por Idempotency-Key.</w:t>
       </w:r>
     </w:p>
     <w:p>
@@ -5747,7 +5756,7 @@
               <w:rPr>
                 <w:sz w:val="18"/>
               </w:rPr>
-              <w:t>Verificar suíte ampliada antes da submissão</w:t>
+              <w:t>194 testes aprovados e 10 ignorados (14/10/2026)</w:t>
             </w:r>
           </w:p>
         </w:tc>
@@ -5945,7 +5954,7 @@
         <w:jc w:val="both"/>
       </w:pPr>
       <w:r>
-        <w:t>O principal limite decorre dos dados organizacionais ausentes. Produtos, volumes e interfaces reais podem alterar adaptadores, timeout e capacidade. O protótipo não agenda retentativas com atraso, não oferece OIDC ou tracing distribuído e não usa RabbitMQ como transporte de entrada dos consumidores. No modo público, usa uma credencial compartilhada definida no servidor. Após reconciliação, o prazo do processo é atualizado e o reprocessamento reinicia o contador de tentativas.</w:t>
+        <w:t>O principal limite decorre dos dados organizacionais ausentes. Produtos, volumes e interfaces reais podem alterar adaptadores, timeout e capacidade. O protótipo não agenda retentativas com atraso, não oferece OIDC ou tracing distribuído e não usa RabbitMQ como transporte de entrada dos consumidores. No modo público, usa uma credencial compartilhada definida no servidor. Não há agendador: vencimento de fatura e SLA dependem de ação via API, e CustomerReader não tem timeout nem retentativa. Valores monetários continuam float na API v1 (dívida para a v2). RLS e PostgreSQL do Supabase não foram verificados, e não há teste de frontend versionado. Encerramentos anteriores à T12 não geram fatura final retroativa, e o financeiro completo estava em revisão. Após reconciliação, o prazo do processo é atualizado e o reprocessamento reinicia o contador de tentativas.</w:t>
       </w:r>
     </w:p>
     <w:p>
@@ -6045,7 +6054,7 @@
         <w:jc w:val="both"/>
       </w:pPr>
       <w:r>
-        <w:t>Documentos complementares do repositório: ADR-001; requisitos; plano de implementação; matriz de rastreabilidade; arquitetura AS-IS, TO-BE e fluxos de integração; exemplos de API; reservas e contratos OpenAPI e AsyncAPI; roteiro de demonstração; evidências de validação.</w:t>
+        <w:t>Documentos complementares do repositório: ADR-001 a ADR-005; requisitos; plano de implementação; matriz de rastreabilidade; arquitetura AS-IS, TO-BE e fluxos de integração; exemplos de API; reservas e contratos OpenAPI e AsyncAPI; roteiro de demonstração; evidências de validação.</w:t>
       </w:r>
     </w:p>
     <w:sectPr>

</xml_diff>

<commit_message>
docs: viabilidade com custos separados e premissas; atualiza evidências do relatório
Pacote G (#63) e a parte do pacote I (#65) que não depende da publicação:

- VISAO_NEGOCIO: custos de serviços, implementação e operação separados
  (gratuidade não é custo zero); cada benefício ligado ao que o protótipo
  mede hoje; premissas para validação docente com código e teste.
- Relatório e slides (fontes): 246 testes com PostgreSQL e RabbitMQ reais,
  p95 até 45,1 ms (RNF-07), "plano gratuito" em vez de "componentes
  gratuitos". DOCX regenerado; PPTX não regenerado (gerador indisponível
  neste ambiente).
- Aviso repetido em 17 documentos perde a data vencida de 27/09/2026;
  termino1.md deixa de citar uma contagem antiga de testes.
- EVIDENCIAS_VALIDACAO registra a rodada, a contagem de páginas e o que
  não foi verificado.

Co-Authored-By: Claude Opus 5.5 <noreply@anthropic.com>
Claude-Session: https://claude.ai/code/session_01MPMChk7v8mG4cx9Y7fRRFL
</commit_message>
<xml_diff>
--- a/output/Relatorio_Tecnico_Cenario_4.docx
+++ b/output/Relatorio_Tecnico_Cenario_4.docx
@@ -69,7 +69,7 @@
         <w:jc w:val="both"/>
       </w:pPr>
       <w:r>
-        <w:t>Em 17 de outubro de 2026, a suíte automatizada local registrou 211 testes aprovados e 10 ignorados; os ignorados exigem PostgreSQL ou RabbitMQ reais. Roteiros executados contra a API local demonstraram os três fluxos integrados: cliente do CRM para contrato sem recadastro (20 de 20 checagens), ativação para primeira fatura e preparação de retirada sem duplicidade (14 de 14) e chamado com contrato e SLA até a resolução (15 de 15). A medição local de 200 consultas de prontidão teve p95 de 4,22 ms, valor que não representa hospedagem pública.</w:t>
+        <w:t>Em 20 de outubro de 2026, a suíte automatizada local registrou 246 testes aprovados com PostgreSQL 16 e RabbitMQ 3.12 reais (232 aprovados e 14 ignorados com SQLite puro); os ignorados exigem PostgreSQL ou RabbitMQ reais. Os 22 roteiros de navegador (F1, F2 e F3 pela interface e acessibilidade com axe) passaram com SQLite e com PostgreSQL e RabbitMQ. Roteiros executados contra a API local demonstraram os três fluxos integrados: cliente do CRM para contrato sem recadastro (20 de 20 checagens), ativação para primeira fatura e preparação de retirada sem duplicidade (14 de 14) e chamado com contrato e SLA até a resolução (15 de 15). Na medição local do RNF-07 (60 clientes e 100 amostras por consulta, em 10 consultas de negócio), o maior p95 foi 45,1 ms com PostgreSQL, abaixo da meta de 500 ms; o valor não representa hospedagem pública.</w:t>
       </w:r>
     </w:p>
     <w:p>
@@ -8639,7 +8639,7 @@
               <w:rPr>
                 <w:sz w:val="18"/>
               </w:rPr>
-              <w:t>p95 local 4,22 ms</w:t>
+              <w:t>p95 local até 45,1 ms</w:t>
             </w:r>
           </w:p>
         </w:tc>
@@ -8878,7 +8878,7 @@
               <w:rPr>
                 <w:sz w:val="18"/>
               </w:rPr>
-              <w:t>211 testes aprovados e 10 ignorados</w:t>
+              <w:t>246 testes aprovados com PostgreSQL 16 e RabbitMQ 3.12 reais (232 aprovados e 14 ignorados com SQLite puro)</w:t>
             </w:r>
           </w:p>
         </w:tc>
@@ -8895,7 +8895,7 @@
         <w:jc w:val="both"/>
       </w:pPr>
       <w:r>
-        <w:t>As medições representam o ambiente local (Windows 11, Python 3.12, SQLite) e não substituem planejamento de capacidade com volumes reais. PostgreSQL, RabbitMQ e a hospedagem pública só foram verificados na integração contínua ou ainda não foram verificados.</w:t>
+        <w:t>As medições representam um ambiente local (contêiner Linux, Python 3.13, PostgreSQL 16 e SQLite) com dados sintéticos e não substituem planejamento de capacidade com volumes reais. PostgreSQL e RabbitMQ foram verificados localmente e na integração contínua; a hospedagem pública e o PostgreSQL gerenciado ainda não foram verificados.</w:t>
       </w:r>
     </w:p>
     <w:p>
@@ -9354,7 +9354,7 @@
         <w:jc w:val="both"/>
       </w:pPr>
       <w:r>
-        <w:t>Viabilidade: o monólito modular limita custo de infraestrutura e complexidade operacional, e a demonstração usa apenas componentes gratuitos. A equipe júnior consegue manter um único implantável com fronteiras testadas. Custos, prazos e infraestrutura de produção não foram informados; a adoção real depende de levantar a linha de base dos indicadores (tempo entre ativação e cobrança, recadastros, chamados com SLA incorreto e tempo de diagnóstico). Como afirma o enunciado, "uma boa arquitetura não é apenas tecnicamente adequada, mas também precisa fazer sentido para o negócio" (ARCHCORP, 2026a, p. 8).</w:t>
+        <w:t>Viabilidade: o monólito modular limita custo de infraestrutura e complexidade operacional, e a demonstração usa serviços sem licença ou em plano gratuito. Gratuidade não é custo zero: o esforço de implementação e de operação existe e não foi medido. A equipe júnior consegue manter um único implantável com fronteiras testadas. Custos, prazos e infraestrutura de produção não foram informados; vencimento em 10 dias, faturamento por ciclos iniciados, SLA contado da abertura e preparação de 72 h são premissas a validar; a adoção real depende de levantar a linha de base dos indicadores (tempo entre ativação e cobrança, recadastros, chamados com SLA incorreto e tempo de diagnóstico). Como afirma o enunciado, "uma boa arquitetura não é apenas tecnicamente adequada, mas também precisa fazer sentido para o negócio" (ARCHCORP, 2026a, p. 8).</w:t>
       </w:r>
     </w:p>
     <w:p>

</xml_diff>

<commit_message>
docs: alinha entrega ao guia e aos marcos de novembro
</commit_message>
<xml_diff>
--- a/output/Relatorio_Tecnico_Cenario_4.docx
+++ b/output/Relatorio_Tecnico_Cenario_4.docx
@@ -30,9 +30,13 @@
         <w:jc w:val="center"/>
       </w:pPr>
       <w:r>
-        <w:t>Equipe do Projeto Aplicado (nomes a preencher antes da submissão)</w:t>
+        <w:t>Autoria e contribuições individuais pendentes de informação pela equipe</w:t>
         <w:br/>
-        <w:t>Outubro de 2026</w:t>
+        <w:t>Versão de 28 de outubro de 2026</w:t>
+        <w:br/>
+        <w:t>Entrega pronta prevista para 09/11/2026</w:t>
+        <w:br/>
+        <w:t>Apresentação prevista para 23/11/2026</w:t>
       </w:r>
     </w:p>
     <w:p>
@@ -69,7 +73,7 @@
         <w:jc w:val="both"/>
       </w:pPr>
       <w:r>
-        <w:t>Em 20 de outubro de 2026, a suíte automatizada local registrou 246 testes aprovados com PostgreSQL 16 e RabbitMQ 3.12 reais (232 aprovados e 14 ignorados com SQLite puro); os ignorados exigem PostgreSQL ou RabbitMQ reais. Os 22 roteiros de navegador (F1, F2 e F3 pela interface e acessibilidade com axe) passaram com SQLite e com PostgreSQL e RabbitMQ. Roteiros executados contra a API local demonstraram os três fluxos integrados: cliente do CRM para contrato sem recadastro (20 de 20 checagens), ativação para primeira fatura e preparação de retirada sem duplicidade (14 de 14) e chamado com contrato e SLA até a resolução (15 de 15). Na medição local do RNF-07 (60 clientes e 100 amostras por consulta, em 10 consultas de negócio), o maior p95 foi 45,1 ms com PostgreSQL, abaixo da meta de 500 ms; o valor não representa hospedagem pública.</w:t>
+        <w:t>A análise considera a main em f1669d7, integrada pelo PR #75 em 25/10/2026. Na CI 40199072801, de 25/10, os quatro jobs concluíram com sucesso: application (252 aprovados e 14 ignorados), postgresql (262 aprovados e 4 ignorados), rabbitmq (22 aprovados) e e2e (25 roteiros aprovados e uma verificação axe aprovada). As suítes se sobrepõem e suas contagens não devem ser somadas. Como evidência histórica, em 20 de outubro de 2026 foram registrados 246 testes aprovados com PostgreSQL 16 e RabbitMQ 3.12 reais (232 aprovados e 14 ignorados com SQLite puro) e verificações dos fluxos F1 (20/20), F2 (14/14) e F3 (15/15). A medição histórica do RNF-07, com 60 clientes e 100 amostras por consulta em 10 consultas de negócio, apresentou maior p95 de 45,1 ms no PostgreSQL, abaixo da meta de 500 ms. Os resultados usam dados sintéticos e não comprovam hospedagem pública nem nova medição de desempenho sobre essa main (PROJETO APLICADO 7, 2026a, 2026b, 2026c).</w:t>
       </w:r>
     </w:p>
     <w:p>
@@ -443,283 +447,13 @@
         <w:t>3.1 Participantes</w:t>
       </w:r>
     </w:p>
-    <w:tbl>
-      <w:tblPr>
-        <w:tblW w:type="auto" w:w="0"/>
-        <w:jc w:val="center"/>
-        <w:tblLayout w:type="autofit"/>
-        <w:tblLook w:firstColumn="1" w:firstRow="1" w:lastColumn="0" w:lastRow="0" w:noHBand="0" w:noVBand="1" w:val="04A0"/>
-        <w:tblBorders>
-          <w:top w:val="single" w:sz="4" w:color="D9D9D9"/>
-          <w:left w:val="single" w:sz="4" w:color="D9D9D9"/>
-          <w:bottom w:val="single" w:sz="4" w:color="D9D9D9"/>
-          <w:right w:val="single" w:sz="4" w:color="D9D9D9"/>
-          <w:insideH w:val="single" w:sz="4" w:color="D9D9D9"/>
-          <w:insideV w:val="single" w:sz="4" w:color="D9D9D9"/>
-        </w:tblBorders>
-      </w:tblPr>
-      <w:tblGrid>
-        <w:gridCol w:w="4968"/>
-        <w:gridCol w:w="4968"/>
-      </w:tblGrid>
-      <w:tr>
-        <w:trPr>
-          <w:tblHeader/>
-        </w:trPr>
-        <w:tc>
-          <w:tcPr>
-            <w:tcW w:type="dxa" w:w="3168"/>
-            <w:shd w:fill="17365D"/>
-            <w:vAlign w:val="center"/>
-            <w:tcMar>
-              <w:top w:w="100" w:type="dxa"/>
-              <w:start w:w="120" w:type="dxa"/>
-              <w:bottom w:w="100" w:type="dxa"/>
-              <w:end w:w="120" w:type="dxa"/>
-            </w:tcMar>
-          </w:tcPr>
-          <w:p>
-            <w:r>
-              <w:rPr>
-                <w:b/>
-                <w:color w:val="FFFFFF"/>
-              </w:rPr>
-              <w:t>Integrante</w:t>
-            </w:r>
-          </w:p>
-        </w:tc>
-        <w:tc>
-          <w:tcPr>
-            <w:tcW w:type="dxa" w:w="6480"/>
-            <w:shd w:fill="17365D"/>
-            <w:vAlign w:val="center"/>
-            <w:tcMar>
-              <w:top w:w="100" w:type="dxa"/>
-              <w:start w:w="120" w:type="dxa"/>
-              <w:bottom w:w="100" w:type="dxa"/>
-              <w:end w:w="120" w:type="dxa"/>
-            </w:tcMar>
-          </w:tcPr>
-          <w:p>
-            <w:r>
-              <w:rPr>
-                <w:b/>
-                <w:color w:val="FFFFFF"/>
-              </w:rPr>
-              <w:t>Contribuição</w:t>
-            </w:r>
-          </w:p>
-        </w:tc>
-      </w:tr>
-      <w:tr>
-        <w:tc>
-          <w:tcPr>
-            <w:tcW w:type="dxa" w:w="3168"/>
-            <w:vAlign w:val="center"/>
-            <w:tcMar>
-              <w:top w:w="100" w:type="dxa"/>
-              <w:start w:w="120" w:type="dxa"/>
-              <w:bottom w:w="100" w:type="dxa"/>
-              <w:end w:w="120" w:type="dxa"/>
-            </w:tcMar>
-          </w:tcPr>
-          <w:p>
-            <w:pPr>
-              <w:spacing w:after="0"/>
-            </w:pPr>
-            <w:r>
-              <w:rPr>
-                <w:sz w:val="18"/>
-              </w:rPr>
-              <w:t>[preencher]</w:t>
-            </w:r>
-          </w:p>
-        </w:tc>
-        <w:tc>
-          <w:tcPr>
-            <w:tcW w:type="dxa" w:w="6480"/>
-            <w:vAlign w:val="center"/>
-            <w:tcMar>
-              <w:top w:w="100" w:type="dxa"/>
-              <w:start w:w="120" w:type="dxa"/>
-              <w:bottom w:w="100" w:type="dxa"/>
-              <w:end w:w="120" w:type="dxa"/>
-            </w:tcMar>
-          </w:tcPr>
-          <w:p>
-            <w:pPr>
-              <w:spacing w:after="0"/>
-            </w:pPr>
-            <w:r>
-              <w:rPr>
-                <w:sz w:val="18"/>
-              </w:rPr>
-              <w:t>Análise do cenário, requisitos e AS-IS</w:t>
-            </w:r>
-          </w:p>
-        </w:tc>
-      </w:tr>
-      <w:tr>
-        <w:tc>
-          <w:tcPr>
-            <w:tcW w:type="dxa" w:w="3168"/>
-            <w:vAlign w:val="center"/>
-            <w:tcMar>
-              <w:top w:w="100" w:type="dxa"/>
-              <w:start w:w="120" w:type="dxa"/>
-              <w:bottom w:w="100" w:type="dxa"/>
-              <w:end w:w="120" w:type="dxa"/>
-            </w:tcMar>
-            <w:shd w:fill="EAF1F8"/>
-          </w:tcPr>
-          <w:p>
-            <w:pPr>
-              <w:spacing w:after="0"/>
-            </w:pPr>
-            <w:r>
-              <w:rPr>
-                <w:sz w:val="18"/>
-              </w:rPr>
-              <w:t>[preencher]</w:t>
-            </w:r>
-          </w:p>
-        </w:tc>
-        <w:tc>
-          <w:tcPr>
-            <w:tcW w:type="dxa" w:w="6480"/>
-            <w:vAlign w:val="center"/>
-            <w:tcMar>
-              <w:top w:w="100" w:type="dxa"/>
-              <w:start w:w="120" w:type="dxa"/>
-              <w:bottom w:w="100" w:type="dxa"/>
-              <w:end w:w="120" w:type="dxa"/>
-            </w:tcMar>
-            <w:shd w:fill="EAF1F8"/>
-          </w:tcPr>
-          <w:p>
-            <w:pPr>
-              <w:spacing w:after="0"/>
-            </w:pPr>
-            <w:r>
-              <w:rPr>
-                <w:sz w:val="18"/>
-              </w:rPr>
-              <w:t>Arquitetura TO-BE, ADRs e contratos OpenAPI/AsyncAPI</w:t>
-            </w:r>
-          </w:p>
-        </w:tc>
-      </w:tr>
-      <w:tr>
-        <w:tc>
-          <w:tcPr>
-            <w:tcW w:type="dxa" w:w="3168"/>
-            <w:vAlign w:val="center"/>
-            <w:tcMar>
-              <w:top w:w="100" w:type="dxa"/>
-              <w:start w:w="120" w:type="dxa"/>
-              <w:bottom w:w="100" w:type="dxa"/>
-              <w:end w:w="120" w:type="dxa"/>
-            </w:tcMar>
-          </w:tcPr>
-          <w:p>
-            <w:pPr>
-              <w:spacing w:after="0"/>
-            </w:pPr>
-            <w:r>
-              <w:rPr>
-                <w:sz w:val="18"/>
-              </w:rPr>
-              <w:t>[preencher]</w:t>
-            </w:r>
-          </w:p>
-        </w:tc>
-        <w:tc>
-          <w:tcPr>
-            <w:tcW w:type="dxa" w:w="6480"/>
-            <w:vAlign w:val="center"/>
-            <w:tcMar>
-              <w:top w:w="100" w:type="dxa"/>
-              <w:start w:w="120" w:type="dxa"/>
-              <w:bottom w:w="100" w:type="dxa"/>
-              <w:end w:w="120" w:type="dxa"/>
-            </w:tcMar>
-          </w:tcPr>
-          <w:p>
-            <w:pPr>
-              <w:spacing w:after="0"/>
-            </w:pPr>
-            <w:r>
-              <w:rPr>
-                <w:sz w:val="18"/>
-              </w:rPr>
-              <w:t>Implementação dos contextos e testes automatizados</w:t>
-            </w:r>
-          </w:p>
-        </w:tc>
-      </w:tr>
-      <w:tr>
-        <w:tc>
-          <w:tcPr>
-            <w:tcW w:type="dxa" w:w="3168"/>
-            <w:vAlign w:val="center"/>
-            <w:tcMar>
-              <w:top w:w="100" w:type="dxa"/>
-              <w:start w:w="120" w:type="dxa"/>
-              <w:bottom w:w="100" w:type="dxa"/>
-              <w:end w:w="120" w:type="dxa"/>
-            </w:tcMar>
-            <w:shd w:fill="EAF1F8"/>
-          </w:tcPr>
-          <w:p>
-            <w:pPr>
-              <w:spacing w:after="0"/>
-            </w:pPr>
-            <w:r>
-              <w:rPr>
-                <w:sz w:val="18"/>
-              </w:rPr>
-              <w:t>[preencher]</w:t>
-            </w:r>
-          </w:p>
-        </w:tc>
-        <w:tc>
-          <w:tcPr>
-            <w:tcW w:type="dxa" w:w="6480"/>
-            <w:vAlign w:val="center"/>
-            <w:tcMar>
-              <w:top w:w="100" w:type="dxa"/>
-              <w:start w:w="120" w:type="dxa"/>
-              <w:bottom w:w="100" w:type="dxa"/>
-              <w:end w:w="120" w:type="dxa"/>
-            </w:tcMar>
-            <w:shd w:fill="EAF1F8"/>
-          </w:tcPr>
-          <w:p>
-            <w:pPr>
-              <w:spacing w:after="0"/>
-            </w:pPr>
-            <w:r>
-              <w:rPr>
-                <w:sz w:val="18"/>
-              </w:rPr>
-              <w:t>Interface web, demonstração e relatório</w:t>
-            </w:r>
-          </w:p>
-        </w:tc>
-      </w:tr>
-    </w:tbl>
-    <w:p>
-      <w:pPr>
-        <w:spacing w:after="40"/>
-      </w:pPr>
-    </w:p>
     <w:p>
       <w:pPr>
         <w:spacing w:after="160" w:line="276" w:lineRule="auto"/>
         <w:jc w:val="both"/>
       </w:pPr>
       <w:r>
-        <w:t>Os nomes e a divisão definitiva das contribuições serão confirmados pela equipe antes da submissão; as linhas acima indicam as frentes de trabalho do backlog.</w:t>
+        <w:t>Os nomes dos integrantes e suas contribuições individuais não foram informados. Essa informação é necessária para cumprir o item Participantes do Guia (ARCHCORP, 2026a, p. 11) e permanece pendente antes da submissão. As frentes de requisitos, arquitetura, implementação, testes e comunicação técnica descrevem atividades do projeto, sem atribuição individual comprovada. O histórico de commits não substitui a declaração de autoria e de contribuição pela equipe.</w:t>
       </w:r>
     </w:p>
     <w:p>
@@ -734,7 +468,7 @@
       <w:tblPr>
         <w:tblW w:type="auto" w:w="0"/>
         <w:jc w:val="center"/>
-        <w:tblLayout w:type="autofit"/>
+        <w:tblLayout w:type="fixed"/>
         <w:tblLook w:firstColumn="1" w:firstRow="1" w:lastColumn="0" w:lastRow="0" w:noHBand="0" w:noVBand="1" w:val="04A0"/>
         <w:tblBorders>
           <w:top w:val="single" w:sz="4" w:color="D9D9D9"/>
@@ -746,12 +480,13 @@
         </w:tblBorders>
       </w:tblPr>
       <w:tblGrid>
-        <w:gridCol w:w="4968"/>
-        <w:gridCol w:w="4968"/>
+        <w:gridCol w:w="2880"/>
+        <w:gridCol w:w="6768"/>
       </w:tblGrid>
       <w:tr>
         <w:trPr>
           <w:tblHeader/>
+          <w:cantSplit/>
         </w:trPr>
         <w:tc>
           <w:tcPr>
@@ -799,6 +534,9 @@
         </w:tc>
       </w:tr>
       <w:tr>
+        <w:trPr>
+          <w:cantSplit/>
+        </w:trPr>
         <w:tc>
           <w:tcPr>
             <w:tcW w:type="dxa" w:w="2880"/>
@@ -847,6 +585,9 @@
         </w:tc>
       </w:tr>
       <w:tr>
+        <w:trPr>
+          <w:cantSplit/>
+        </w:trPr>
         <w:tc>
           <w:tcPr>
             <w:tcW w:type="dxa" w:w="2880"/>
@@ -897,6 +638,9 @@
         </w:tc>
       </w:tr>
       <w:tr>
+        <w:trPr>
+          <w:cantSplit/>
+        </w:trPr>
         <w:tc>
           <w:tcPr>
             <w:tcW w:type="dxa" w:w="2880"/>
@@ -945,6 +689,9 @@
         </w:tc>
       </w:tr>
       <w:tr>
+        <w:trPr>
+          <w:cantSplit/>
+        </w:trPr>
         <w:tc>
           <w:tcPr>
             <w:tcW w:type="dxa" w:w="2880"/>
@@ -995,6 +742,9 @@
         </w:tc>
       </w:tr>
       <w:tr>
+        <w:trPr>
+          <w:cantSplit/>
+        </w:trPr>
         <w:tc>
           <w:tcPr>
             <w:tcW w:type="dxa" w:w="2880"/>
@@ -1043,6 +793,9 @@
         </w:tc>
       </w:tr>
       <w:tr>
+        <w:trPr>
+          <w:cantSplit/>
+        </w:trPr>
         <w:tc>
           <w:tcPr>
             <w:tcW w:type="dxa" w:w="2880"/>
@@ -1093,6 +846,9 @@
         </w:tc>
       </w:tr>
       <w:tr>
+        <w:trPr>
+          <w:cantSplit/>
+        </w:trPr>
         <w:tc>
           <w:tcPr>
             <w:tcW w:type="dxa" w:w="2880"/>
@@ -1158,7 +914,7 @@
       <w:tblPr>
         <w:tblW w:type="auto" w:w="0"/>
         <w:jc w:val="center"/>
-        <w:tblLayout w:type="autofit"/>
+        <w:tblLayout w:type="fixed"/>
         <w:tblLook w:firstColumn="1" w:firstRow="1" w:lastColumn="0" w:lastRow="0" w:noHBand="0" w:noVBand="1" w:val="04A0"/>
         <w:tblBorders>
           <w:top w:val="single" w:sz="4" w:color="D9D9D9"/>
@@ -1170,12 +926,13 @@
         </w:tblBorders>
       </w:tblPr>
       <w:tblGrid>
-        <w:gridCol w:w="4968"/>
-        <w:gridCol w:w="4968"/>
+        <w:gridCol w:w="2880"/>
+        <w:gridCol w:w="6768"/>
       </w:tblGrid>
       <w:tr>
         <w:trPr>
           <w:tblHeader/>
+          <w:cantSplit/>
         </w:trPr>
         <w:tc>
           <w:tcPr>
@@ -1223,6 +980,9 @@
         </w:tc>
       </w:tr>
       <w:tr>
+        <w:trPr>
+          <w:cantSplit/>
+        </w:trPr>
         <w:tc>
           <w:tcPr>
             <w:tcW w:type="dxa" w:w="2880"/>
@@ -1271,6 +1031,9 @@
         </w:tc>
       </w:tr>
       <w:tr>
+        <w:trPr>
+          <w:cantSplit/>
+        </w:trPr>
         <w:tc>
           <w:tcPr>
             <w:tcW w:type="dxa" w:w="2880"/>
@@ -1321,6 +1084,9 @@
         </w:tc>
       </w:tr>
       <w:tr>
+        <w:trPr>
+          <w:cantSplit/>
+        </w:trPr>
         <w:tc>
           <w:tcPr>
             <w:tcW w:type="dxa" w:w="2880"/>
@@ -1369,6 +1135,9 @@
         </w:tc>
       </w:tr>
       <w:tr>
+        <w:trPr>
+          <w:cantSplit/>
+        </w:trPr>
         <w:tc>
           <w:tcPr>
             <w:tcW w:type="dxa" w:w="2880"/>
@@ -1419,6 +1188,9 @@
         </w:tc>
       </w:tr>
       <w:tr>
+        <w:trPr>
+          <w:cantSplit/>
+        </w:trPr>
         <w:tc>
           <w:tcPr>
             <w:tcW w:type="dxa" w:w="2880"/>
@@ -1467,6 +1239,9 @@
         </w:tc>
       </w:tr>
       <w:tr>
+        <w:trPr>
+          <w:cantSplit/>
+        </w:trPr>
         <w:tc>
           <w:tcPr>
             <w:tcW w:type="dxa" w:w="2880"/>
@@ -1517,6 +1292,9 @@
         </w:tc>
       </w:tr>
       <w:tr>
+        <w:trPr>
+          <w:cantSplit/>
+        </w:trPr>
         <w:tc>
           <w:tcPr>
             <w:tcW w:type="dxa" w:w="2880"/>
@@ -1573,6 +1351,7 @@
     <w:p>
       <w:pPr>
         <w:pStyle w:val="Heading2"/>
+        <w:pageBreakBefore/>
       </w:pPr>
       <w:r>
         <w:t>3.4 Procedimentos metodológicos</w:t>
@@ -1584,7 +1363,16 @@
         <w:jc w:val="both"/>
       </w:pPr>
       <w:r>
-        <w:t>O trabalho seguiu o cronograma de 14 semanas em sete quinzenas: escopo; requisitos e AS-IS; TO-BE e contratos; fundação e CRM; reservas e contratos; financeiro, atendimento e workflow; e qualidade, relatório e apresentação. Cada mudança relacionou requisito, decisão, implementação e evidência na matriz de rastreabilidade. O enunciado prevaleceu sobre premissas, e detalhes organizacionais ausentes foram registrados como hipóteses a validar.</w:t>
+        <w:t>Os procedimentos compreenderam análise do escopo, levantamento de requisitos e AS-IS, modelagem TO-BE e contratos, implementação dos contextos e avaliação dos fluxos e atributos de qualidade. A matriz de rastreabilidade relaciona requisito, decisão, implementação e evidência. O enunciado prevalece sobre premissas, e detalhes organizacionais ausentes permanecem como hipóteses a validar.</w:t>
+      </w:r>
+    </w:p>
+    <w:p>
+      <w:pPr>
+        <w:spacing w:after="160" w:line="276" w:lineRule="auto"/>
+        <w:jc w:val="both"/>
+      </w:pPr>
+      <w:r>
+        <w:t>O recorte documental é 28 de outubro de 2026, com referência técnica na main f1669d7 (PR #75, 25/10/2026). O planejamento estabelece a entrega pronta em 09/11/2026 e a apresentação em 23/11/2026. Esses marcos são compromissos previstos, sem declaração de submissão, apresentação realizada ou aceite docente. A conclusão formal depende também da identificação dos participantes e de suas contribuições.</w:t>
       </w:r>
     </w:p>
     <w:p>
@@ -1616,6 +1404,7 @@
     </w:p>
     <w:p>
       <w:pPr>
+        <w:keepNext/>
         <w:spacing w:after="40"/>
         <w:jc w:val="center"/>
       </w:pPr>
@@ -1671,7 +1460,7 @@
       <w:tblPr>
         <w:tblW w:type="auto" w:w="0"/>
         <w:jc w:val="center"/>
-        <w:tblLayout w:type="autofit"/>
+        <w:tblLayout w:type="fixed"/>
         <w:tblLook w:firstColumn="1" w:firstRow="1" w:lastColumn="0" w:lastRow="0" w:noHBand="0" w:noVBand="1" w:val="04A0"/>
         <w:tblBorders>
           <w:top w:val="single" w:sz="4" w:color="D9D9D9"/>
@@ -1683,13 +1472,14 @@
         </w:tblBorders>
       </w:tblPr>
       <w:tblGrid>
-        <w:gridCol w:w="3312"/>
-        <w:gridCol w:w="3312"/>
-        <w:gridCol w:w="3312"/>
+        <w:gridCol w:w="2304"/>
+        <w:gridCol w:w="2448"/>
+        <w:gridCol w:w="4896"/>
       </w:tblGrid>
       <w:tr>
         <w:trPr>
           <w:tblHeader/>
+          <w:cantSplit/>
         </w:trPr>
         <w:tc>
           <w:tcPr>
@@ -1759,6 +1549,9 @@
         </w:tc>
       </w:tr>
       <w:tr>
+        <w:trPr>
+          <w:cantSplit/>
+        </w:trPr>
         <w:tc>
           <w:tcPr>
             <w:tcW w:type="dxa" w:w="2304"/>
@@ -1830,6 +1623,9 @@
         </w:tc>
       </w:tr>
       <w:tr>
+        <w:trPr>
+          <w:cantSplit/>
+        </w:trPr>
         <w:tc>
           <w:tcPr>
             <w:tcW w:type="dxa" w:w="2304"/>
@@ -1904,6 +1700,9 @@
         </w:tc>
       </w:tr>
       <w:tr>
+        <w:trPr>
+          <w:cantSplit/>
+        </w:trPr>
         <w:tc>
           <w:tcPr>
             <w:tcW w:type="dxa" w:w="2304"/>
@@ -1975,6 +1774,9 @@
         </w:tc>
       </w:tr>
       <w:tr>
+        <w:trPr>
+          <w:cantSplit/>
+        </w:trPr>
         <w:tc>
           <w:tcPr>
             <w:tcW w:type="dxa" w:w="2304"/>
@@ -2049,6 +1851,9 @@
         </w:tc>
       </w:tr>
       <w:tr>
+        <w:trPr>
+          <w:cantSplit/>
+        </w:trPr>
         <w:tc>
           <w:tcPr>
             <w:tcW w:type="dxa" w:w="2304"/>
@@ -2137,7 +1942,7 @@
       <w:tblPr>
         <w:tblW w:type="auto" w:w="0"/>
         <w:jc w:val="center"/>
-        <w:tblLayout w:type="autofit"/>
+        <w:tblLayout w:type="fixed"/>
         <w:tblLook w:firstColumn="1" w:firstRow="1" w:lastColumn="0" w:lastRow="0" w:noHBand="0" w:noVBand="1" w:val="04A0"/>
         <w:tblBorders>
           <w:top w:val="single" w:sz="4" w:color="D9D9D9"/>
@@ -2149,15 +1954,16 @@
         </w:tblBorders>
       </w:tblPr>
       <w:tblGrid>
-        <w:gridCol w:w="1987"/>
-        <w:gridCol w:w="1987"/>
-        <w:gridCol w:w="1987"/>
-        <w:gridCol w:w="1987"/>
-        <w:gridCol w:w="1987"/>
+        <w:gridCol w:w="1080"/>
+        <w:gridCol w:w="1656"/>
+        <w:gridCol w:w="1800"/>
+        <w:gridCol w:w="2376"/>
+        <w:gridCol w:w="2736"/>
       </w:tblGrid>
       <w:tr>
         <w:trPr>
           <w:tblHeader/>
+          <w:cantSplit/>
         </w:trPr>
         <w:tc>
           <w:tcPr>
@@ -2271,6 +2077,9 @@
         </w:tc>
       </w:tr>
       <w:tr>
+        <w:trPr>
+          <w:cantSplit/>
+        </w:trPr>
         <w:tc>
           <w:tcPr>
             <w:tcW w:type="dxa" w:w="1080"/>
@@ -2388,6 +2197,9 @@
         </w:tc>
       </w:tr>
       <w:tr>
+        <w:trPr>
+          <w:cantSplit/>
+        </w:trPr>
         <w:tc>
           <w:tcPr>
             <w:tcW w:type="dxa" w:w="1080"/>
@@ -2510,6 +2322,9 @@
         </w:tc>
       </w:tr>
       <w:tr>
+        <w:trPr>
+          <w:cantSplit/>
+        </w:trPr>
         <w:tc>
           <w:tcPr>
             <w:tcW w:type="dxa" w:w="1080"/>
@@ -2627,6 +2442,9 @@
         </w:tc>
       </w:tr>
       <w:tr>
+        <w:trPr>
+          <w:cantSplit/>
+        </w:trPr>
         <w:tc>
           <w:tcPr>
             <w:tcW w:type="dxa" w:w="1080"/>
@@ -2749,6 +2567,9 @@
         </w:tc>
       </w:tr>
       <w:tr>
+        <w:trPr>
+          <w:cantSplit/>
+        </w:trPr>
         <w:tc>
           <w:tcPr>
             <w:tcW w:type="dxa" w:w="1080"/>
@@ -2949,7 +2770,7 @@
       <w:tblPr>
         <w:tblW w:type="auto" w:w="0"/>
         <w:jc w:val="center"/>
-        <w:tblLayout w:type="autofit"/>
+        <w:tblLayout w:type="fixed"/>
         <w:tblLook w:firstColumn="1" w:firstRow="1" w:lastColumn="0" w:lastRow="0" w:noHBand="0" w:noVBand="1" w:val="04A0"/>
         <w:tblBorders>
           <w:top w:val="single" w:sz="4" w:color="D9D9D9"/>
@@ -2961,13 +2782,14 @@
         </w:tblBorders>
       </w:tblPr>
       <w:tblGrid>
-        <w:gridCol w:w="3312"/>
-        <w:gridCol w:w="3312"/>
-        <w:gridCol w:w="3312"/>
+        <w:gridCol w:w="1008"/>
+        <w:gridCol w:w="3456"/>
+        <w:gridCol w:w="5184"/>
       </w:tblGrid>
       <w:tr>
         <w:trPr>
           <w:tblHeader/>
+          <w:cantSplit/>
         </w:trPr>
         <w:tc>
           <w:tcPr>
@@ -3037,6 +2859,9 @@
         </w:tc>
       </w:tr>
       <w:tr>
+        <w:trPr>
+          <w:cantSplit/>
+        </w:trPr>
         <w:tc>
           <w:tcPr>
             <w:tcW w:type="dxa" w:w="1008"/>
@@ -3108,6 +2933,9 @@
         </w:tc>
       </w:tr>
       <w:tr>
+        <w:trPr>
+          <w:cantSplit/>
+        </w:trPr>
         <w:tc>
           <w:tcPr>
             <w:tcW w:type="dxa" w:w="1008"/>
@@ -3182,6 +3010,9 @@
         </w:tc>
       </w:tr>
       <w:tr>
+        <w:trPr>
+          <w:cantSplit/>
+        </w:trPr>
         <w:tc>
           <w:tcPr>
             <w:tcW w:type="dxa" w:w="1008"/>
@@ -3253,6 +3084,9 @@
         </w:tc>
       </w:tr>
       <w:tr>
+        <w:trPr>
+          <w:cantSplit/>
+        </w:trPr>
         <w:tc>
           <w:tcPr>
             <w:tcW w:type="dxa" w:w="1008"/>
@@ -3327,6 +3161,9 @@
         </w:tc>
       </w:tr>
       <w:tr>
+        <w:trPr>
+          <w:cantSplit/>
+        </w:trPr>
         <w:tc>
           <w:tcPr>
             <w:tcW w:type="dxa" w:w="1008"/>
@@ -3398,6 +3235,9 @@
         </w:tc>
       </w:tr>
       <w:tr>
+        <w:trPr>
+          <w:cantSplit/>
+        </w:trPr>
         <w:tc>
           <w:tcPr>
             <w:tcW w:type="dxa" w:w="1008"/>
@@ -3472,6 +3312,9 @@
         </w:tc>
       </w:tr>
       <w:tr>
+        <w:trPr>
+          <w:cantSplit/>
+        </w:trPr>
         <w:tc>
           <w:tcPr>
             <w:tcW w:type="dxa" w:w="1008"/>
@@ -3560,7 +3403,7 @@
       <w:tblPr>
         <w:tblW w:type="auto" w:w="0"/>
         <w:jc w:val="center"/>
-        <w:tblLayout w:type="autofit"/>
+        <w:tblLayout w:type="fixed"/>
         <w:tblLook w:firstColumn="1" w:firstRow="1" w:lastColumn="0" w:lastRow="0" w:noHBand="0" w:noVBand="1" w:val="04A0"/>
         <w:tblBorders>
           <w:top w:val="single" w:sz="4" w:color="D9D9D9"/>
@@ -3572,14 +3415,15 @@
         </w:tblBorders>
       </w:tblPr>
       <w:tblGrid>
-        <w:gridCol w:w="2484"/>
-        <w:gridCol w:w="2484"/>
-        <w:gridCol w:w="2484"/>
-        <w:gridCol w:w="2484"/>
+        <w:gridCol w:w="1008"/>
+        <w:gridCol w:w="2736"/>
+        <w:gridCol w:w="1152"/>
+        <w:gridCol w:w="4752"/>
       </w:tblGrid>
       <w:tr>
         <w:trPr>
           <w:tblHeader/>
+          <w:cantSplit/>
         </w:trPr>
         <w:tc>
           <w:tcPr>
@@ -3671,6 +3515,9 @@
         </w:tc>
       </w:tr>
       <w:tr>
+        <w:trPr>
+          <w:cantSplit/>
+        </w:trPr>
         <w:tc>
           <w:tcPr>
             <w:tcW w:type="dxa" w:w="1008"/>
@@ -3765,6 +3612,9 @@
         </w:tc>
       </w:tr>
       <w:tr>
+        <w:trPr>
+          <w:cantSplit/>
+        </w:trPr>
         <w:tc>
           <w:tcPr>
             <w:tcW w:type="dxa" w:w="1008"/>
@@ -3863,6 +3713,9 @@
         </w:tc>
       </w:tr>
       <w:tr>
+        <w:trPr>
+          <w:cantSplit/>
+        </w:trPr>
         <w:tc>
           <w:tcPr>
             <w:tcW w:type="dxa" w:w="1008"/>
@@ -3957,6 +3810,9 @@
         </w:tc>
       </w:tr>
       <w:tr>
+        <w:trPr>
+          <w:cantSplit/>
+        </w:trPr>
         <w:tc>
           <w:tcPr>
             <w:tcW w:type="dxa" w:w="1008"/>
@@ -4055,6 +3911,9 @@
         </w:tc>
       </w:tr>
       <w:tr>
+        <w:trPr>
+          <w:cantSplit/>
+        </w:trPr>
         <w:tc>
           <w:tcPr>
             <w:tcW w:type="dxa" w:w="1008"/>
@@ -4149,6 +4008,9 @@
         </w:tc>
       </w:tr>
       <w:tr>
+        <w:trPr>
+          <w:cantSplit/>
+        </w:trPr>
         <w:tc>
           <w:tcPr>
             <w:tcW w:type="dxa" w:w="1008"/>
@@ -4247,6 +4109,9 @@
         </w:tc>
       </w:tr>
       <w:tr>
+        <w:trPr>
+          <w:cantSplit/>
+        </w:trPr>
         <w:tc>
           <w:tcPr>
             <w:tcW w:type="dxa" w:w="1008"/>
@@ -4341,6 +4206,9 @@
         </w:tc>
       </w:tr>
       <w:tr>
+        <w:trPr>
+          <w:cantSplit/>
+        </w:trPr>
         <w:tc>
           <w:tcPr>
             <w:tcW w:type="dxa" w:w="1008"/>
@@ -4439,6 +4307,9 @@
         </w:tc>
       </w:tr>
       <w:tr>
+        <w:trPr>
+          <w:cantSplit/>
+        </w:trPr>
         <w:tc>
           <w:tcPr>
             <w:tcW w:type="dxa" w:w="1008"/>
@@ -4566,6 +4437,7 @@
     </w:p>
     <w:p>
       <w:pPr>
+        <w:keepNext/>
         <w:spacing w:after="40"/>
         <w:jc w:val="center"/>
       </w:pPr>
@@ -4621,7 +4493,7 @@
       <w:tblPr>
         <w:tblW w:type="auto" w:w="0"/>
         <w:jc w:val="center"/>
-        <w:tblLayout w:type="autofit"/>
+        <w:tblLayout w:type="fixed"/>
         <w:tblLook w:firstColumn="1" w:firstRow="1" w:lastColumn="0" w:lastRow="0" w:noHBand="0" w:noVBand="1" w:val="04A0"/>
         <w:tblBorders>
           <w:top w:val="single" w:sz="4" w:color="D9D9D9"/>
@@ -4633,13 +4505,14 @@
         </w:tblBorders>
       </w:tblPr>
       <w:tblGrid>
-        <w:gridCol w:w="3312"/>
-        <w:gridCol w:w="3312"/>
-        <w:gridCol w:w="3312"/>
+        <w:gridCol w:w="1584"/>
+        <w:gridCol w:w="3456"/>
+        <w:gridCol w:w="4608"/>
       </w:tblGrid>
       <w:tr>
         <w:trPr>
           <w:tblHeader/>
+          <w:cantSplit/>
         </w:trPr>
         <w:tc>
           <w:tcPr>
@@ -4709,6 +4582,9 @@
         </w:tc>
       </w:tr>
       <w:tr>
+        <w:trPr>
+          <w:cantSplit/>
+        </w:trPr>
         <w:tc>
           <w:tcPr>
             <w:tcW w:type="dxa" w:w="1584"/>
@@ -4780,6 +4656,9 @@
         </w:tc>
       </w:tr>
       <w:tr>
+        <w:trPr>
+          <w:cantSplit/>
+        </w:trPr>
         <w:tc>
           <w:tcPr>
             <w:tcW w:type="dxa" w:w="1584"/>
@@ -4854,6 +4733,9 @@
         </w:tc>
       </w:tr>
       <w:tr>
+        <w:trPr>
+          <w:cantSplit/>
+        </w:trPr>
         <w:tc>
           <w:tcPr>
             <w:tcW w:type="dxa" w:w="1584"/>
@@ -4925,6 +4807,9 @@
         </w:tc>
       </w:tr>
       <w:tr>
+        <w:trPr>
+          <w:cantSplit/>
+        </w:trPr>
         <w:tc>
           <w:tcPr>
             <w:tcW w:type="dxa" w:w="1584"/>
@@ -4999,6 +4884,9 @@
         </w:tc>
       </w:tr>
       <w:tr>
+        <w:trPr>
+          <w:cantSplit/>
+        </w:trPr>
         <w:tc>
           <w:tcPr>
             <w:tcW w:type="dxa" w:w="1584"/>
@@ -5070,6 +4958,9 @@
         </w:tc>
       </w:tr>
       <w:tr>
+        <w:trPr>
+          <w:cantSplit/>
+        </w:trPr>
         <w:tc>
           <w:tcPr>
             <w:tcW w:type="dxa" w:w="1584"/>
@@ -5168,6 +5059,7 @@
     </w:p>
     <w:p>
       <w:pPr>
+        <w:keepNext/>
         <w:spacing w:after="40"/>
         <w:jc w:val="center"/>
       </w:pPr>
@@ -5223,7 +5115,7 @@
       <w:tblPr>
         <w:tblW w:type="auto" w:w="0"/>
         <w:jc w:val="center"/>
-        <w:tblLayout w:type="autofit"/>
+        <w:tblLayout w:type="fixed"/>
         <w:tblLook w:firstColumn="1" w:firstRow="1" w:lastColumn="0" w:lastRow="0" w:noHBand="0" w:noVBand="1" w:val="04A0"/>
         <w:tblBorders>
           <w:top w:val="single" w:sz="4" w:color="D9D9D9"/>
@@ -5235,13 +5127,14 @@
         </w:tblBorders>
       </w:tblPr>
       <w:tblGrid>
-        <w:gridCol w:w="3312"/>
-        <w:gridCol w:w="3312"/>
-        <w:gridCol w:w="3312"/>
+        <w:gridCol w:w="1656"/>
+        <w:gridCol w:w="3744"/>
+        <w:gridCol w:w="4248"/>
       </w:tblGrid>
       <w:tr>
         <w:trPr>
           <w:tblHeader/>
+          <w:cantSplit/>
         </w:trPr>
         <w:tc>
           <w:tcPr>
@@ -5311,6 +5204,9 @@
         </w:tc>
       </w:tr>
       <w:tr>
+        <w:trPr>
+          <w:cantSplit/>
+        </w:trPr>
         <w:tc>
           <w:tcPr>
             <w:tcW w:type="dxa" w:w="1656"/>
@@ -5382,6 +5278,9 @@
         </w:tc>
       </w:tr>
       <w:tr>
+        <w:trPr>
+          <w:cantSplit/>
+        </w:trPr>
         <w:tc>
           <w:tcPr>
             <w:tcW w:type="dxa" w:w="1656"/>
@@ -5456,6 +5355,9 @@
         </w:tc>
       </w:tr>
       <w:tr>
+        <w:trPr>
+          <w:cantSplit/>
+        </w:trPr>
         <w:tc>
           <w:tcPr>
             <w:tcW w:type="dxa" w:w="1656"/>
@@ -5527,6 +5429,9 @@
         </w:tc>
       </w:tr>
       <w:tr>
+        <w:trPr>
+          <w:cantSplit/>
+        </w:trPr>
         <w:tc>
           <w:tcPr>
             <w:tcW w:type="dxa" w:w="1656"/>
@@ -5637,7 +5542,7 @@
         <w:jc w:val="both"/>
       </w:pPr>
       <w:r>
-        <w:t>O protótipo simula tokens e aplica papéis por área. A validação ocorre na fronteira, e eventos não carregam documentos, dados bancários nem a descrição do chamado. Um ambiente real exigiria provedor OIDC, contas individuais e TLS; esses itens são metas, não funcionalidades demonstradas.</w:t>
+        <w:t>O protótipo aplica papéis por tokens locais e permite configurar um segredo compartilhado para o modo público. A validação ocorre na fronteira, e eventos não carregam documentos, dados bancários nem a descrição do chamado. A versão de referência compara credenciais em bytes para tratar caracteres não ASCII e limita o registro de exceções inesperadas ao tipo do erro, sem mensagem sensível nem traceback (PROJETO APLICADO 7, 2026b). Um ambiente real exigiria provedor OIDC, contas individuais e TLS verificado; esses itens não estão demonstrados.</w:t>
       </w:r>
     </w:p>
     <w:p>
@@ -5660,7 +5565,7 @@
       <w:tblPr>
         <w:tblW w:type="auto" w:w="0"/>
         <w:jc w:val="center"/>
-        <w:tblLayout w:type="autofit"/>
+        <w:tblLayout w:type="fixed"/>
         <w:tblLook w:firstColumn="1" w:firstRow="1" w:lastColumn="0" w:lastRow="0" w:noHBand="0" w:noVBand="1" w:val="04A0"/>
         <w:tblBorders>
           <w:top w:val="single" w:sz="4" w:color="D9D9D9"/>
@@ -5672,15 +5577,16 @@
         </w:tblBorders>
       </w:tblPr>
       <w:tblGrid>
-        <w:gridCol w:w="1987"/>
-        <w:gridCol w:w="1987"/>
-        <w:gridCol w:w="1987"/>
-        <w:gridCol w:w="1987"/>
-        <w:gridCol w:w="1987"/>
+        <w:gridCol w:w="1656"/>
+        <w:gridCol w:w="1512"/>
+        <w:gridCol w:w="2088"/>
+        <w:gridCol w:w="2304"/>
+        <w:gridCol w:w="2088"/>
       </w:tblGrid>
       <w:tr>
         <w:trPr>
           <w:tblHeader/>
+          <w:cantSplit/>
         </w:trPr>
         <w:tc>
           <w:tcPr>
@@ -5794,6 +5700,9 @@
         </w:tc>
       </w:tr>
       <w:tr>
+        <w:trPr>
+          <w:cantSplit/>
+        </w:trPr>
         <w:tc>
           <w:tcPr>
             <w:tcW w:type="dxa" w:w="1656"/>
@@ -5911,6 +5820,9 @@
         </w:tc>
       </w:tr>
       <w:tr>
+        <w:trPr>
+          <w:cantSplit/>
+        </w:trPr>
         <w:tc>
           <w:tcPr>
             <w:tcW w:type="dxa" w:w="1656"/>
@@ -6033,6 +5945,9 @@
         </w:tc>
       </w:tr>
       <w:tr>
+        <w:trPr>
+          <w:cantSplit/>
+        </w:trPr>
         <w:tc>
           <w:tcPr>
             <w:tcW w:type="dxa" w:w="1656"/>
@@ -6150,6 +6065,9 @@
         </w:tc>
       </w:tr>
       <w:tr>
+        <w:trPr>
+          <w:cantSplit/>
+        </w:trPr>
         <w:tc>
           <w:tcPr>
             <w:tcW w:type="dxa" w:w="1656"/>
@@ -6272,6 +6190,9 @@
         </w:tc>
       </w:tr>
       <w:tr>
+        <w:trPr>
+          <w:cantSplit/>
+        </w:trPr>
         <w:tc>
           <w:tcPr>
             <w:tcW w:type="dxa" w:w="1656"/>
@@ -6488,6 +6409,7 @@
     </w:p>
     <w:p>
       <w:pPr>
+        <w:keepNext/>
         <w:spacing w:after="40"/>
         <w:jc w:val="center"/>
       </w:pPr>
@@ -6543,7 +6465,7 @@
       <w:tblPr>
         <w:tblW w:type="auto" w:w="0"/>
         <w:jc w:val="center"/>
-        <w:tblLayout w:type="autofit"/>
+        <w:tblLayout w:type="fixed"/>
         <w:tblLook w:firstColumn="1" w:firstRow="1" w:lastColumn="0" w:lastRow="0" w:noHBand="0" w:noVBand="1" w:val="04A0"/>
         <w:tblBorders>
           <w:top w:val="single" w:sz="4" w:color="D9D9D9"/>
@@ -6555,12 +6477,13 @@
         </w:tblBorders>
       </w:tblPr>
       <w:tblGrid>
-        <w:gridCol w:w="4968"/>
-        <w:gridCol w:w="4968"/>
+        <w:gridCol w:w="2160"/>
+        <w:gridCol w:w="7488"/>
       </w:tblGrid>
       <w:tr>
         <w:trPr>
           <w:tblHeader/>
+          <w:cantSplit/>
         </w:trPr>
         <w:tc>
           <w:tcPr>
@@ -6608,6 +6531,9 @@
         </w:tc>
       </w:tr>
       <w:tr>
+        <w:trPr>
+          <w:cantSplit/>
+        </w:trPr>
         <w:tc>
           <w:tcPr>
             <w:tcW w:type="dxa" w:w="2160"/>
@@ -6656,6 +6582,9 @@
         </w:tc>
       </w:tr>
       <w:tr>
+        <w:trPr>
+          <w:cantSplit/>
+        </w:trPr>
         <w:tc>
           <w:tcPr>
             <w:tcW w:type="dxa" w:w="2160"/>
@@ -6706,6 +6635,9 @@
         </w:tc>
       </w:tr>
       <w:tr>
+        <w:trPr>
+          <w:cantSplit/>
+        </w:trPr>
         <w:tc>
           <w:tcPr>
             <w:tcW w:type="dxa" w:w="2160"/>
@@ -6754,6 +6686,9 @@
         </w:tc>
       </w:tr>
       <w:tr>
+        <w:trPr>
+          <w:cantSplit/>
+        </w:trPr>
         <w:tc>
           <w:tcPr>
             <w:tcW w:type="dxa" w:w="2160"/>
@@ -6804,6 +6739,9 @@
         </w:tc>
       </w:tr>
       <w:tr>
+        <w:trPr>
+          <w:cantSplit/>
+        </w:trPr>
         <w:tc>
           <w:tcPr>
             <w:tcW w:type="dxa" w:w="2160"/>
@@ -6852,6 +6790,9 @@
         </w:tc>
       </w:tr>
       <w:tr>
+        <w:trPr>
+          <w:cantSplit/>
+        </w:trPr>
         <w:tc>
           <w:tcPr>
             <w:tcW w:type="dxa" w:w="2160"/>
@@ -6902,6 +6843,9 @@
         </w:tc>
       </w:tr>
       <w:tr>
+        <w:trPr>
+          <w:cantSplit/>
+        </w:trPr>
         <w:tc>
           <w:tcPr>
             <w:tcW w:type="dxa" w:w="2160"/>
@@ -6965,6 +6909,7 @@
     </w:p>
     <w:p>
       <w:pPr>
+        <w:keepNext/>
         <w:spacing w:after="40"/>
         <w:jc w:val="center"/>
       </w:pPr>
@@ -7020,7 +6965,7 @@
       <w:tblPr>
         <w:tblW w:type="auto" w:w="0"/>
         <w:jc w:val="center"/>
-        <w:tblLayout w:type="autofit"/>
+        <w:tblLayout w:type="fixed"/>
         <w:tblLook w:firstColumn="1" w:firstRow="1" w:lastColumn="0" w:lastRow="0" w:noHBand="0" w:noVBand="1" w:val="04A0"/>
         <w:tblBorders>
           <w:top w:val="single" w:sz="4" w:color="D9D9D9"/>
@@ -7032,12 +6977,13 @@
         </w:tblBorders>
       </w:tblPr>
       <w:tblGrid>
-        <w:gridCol w:w="4968"/>
-        <w:gridCol w:w="4968"/>
+        <w:gridCol w:w="2160"/>
+        <w:gridCol w:w="7488"/>
       </w:tblGrid>
       <w:tr>
         <w:trPr>
           <w:tblHeader/>
+          <w:cantSplit/>
         </w:trPr>
         <w:tc>
           <w:tcPr>
@@ -7085,6 +7031,9 @@
         </w:tc>
       </w:tr>
       <w:tr>
+        <w:trPr>
+          <w:cantSplit/>
+        </w:trPr>
         <w:tc>
           <w:tcPr>
             <w:tcW w:type="dxa" w:w="2160"/>
@@ -7133,6 +7082,9 @@
         </w:tc>
       </w:tr>
       <w:tr>
+        <w:trPr>
+          <w:cantSplit/>
+        </w:trPr>
         <w:tc>
           <w:tcPr>
             <w:tcW w:type="dxa" w:w="2160"/>
@@ -7183,6 +7135,9 @@
         </w:tc>
       </w:tr>
       <w:tr>
+        <w:trPr>
+          <w:cantSplit/>
+        </w:trPr>
         <w:tc>
           <w:tcPr>
             <w:tcW w:type="dxa" w:w="2160"/>
@@ -7231,6 +7186,9 @@
         </w:tc>
       </w:tr>
       <w:tr>
+        <w:trPr>
+          <w:cantSplit/>
+        </w:trPr>
         <w:tc>
           <w:tcPr>
             <w:tcW w:type="dxa" w:w="2160"/>
@@ -7281,6 +7239,9 @@
         </w:tc>
       </w:tr>
       <w:tr>
+        <w:trPr>
+          <w:cantSplit/>
+        </w:trPr>
         <w:tc>
           <w:tcPr>
             <w:tcW w:type="dxa" w:w="2160"/>
@@ -7323,7 +7284,7 @@
               <w:rPr>
                 <w:sz w:val="18"/>
               </w:rPr>
-              <w:t>Três tentativas; depois FAILED com motivo; reprocessamento auditado; inbox impede duplicidade</w:t>
+              <w:t>Três tentativas; depois FAILED com motivo genérico; reprocessamento auditado; inbox impede duplicidade</w:t>
             </w:r>
           </w:p>
         </w:tc>
@@ -7344,6 +7305,7 @@
     </w:p>
     <w:p>
       <w:pPr>
+        <w:keepNext/>
         <w:spacing w:after="40"/>
         <w:jc w:val="center"/>
       </w:pPr>
@@ -7399,7 +7361,7 @@
       <w:tblPr>
         <w:tblW w:type="auto" w:w="0"/>
         <w:jc w:val="center"/>
-        <w:tblLayout w:type="autofit"/>
+        <w:tblLayout w:type="fixed"/>
         <w:tblLook w:firstColumn="1" w:firstRow="1" w:lastColumn="0" w:lastRow="0" w:noHBand="0" w:noVBand="1" w:val="04A0"/>
         <w:tblBorders>
           <w:top w:val="single" w:sz="4" w:color="D9D9D9"/>
@@ -7411,12 +7373,13 @@
         </w:tblBorders>
       </w:tblPr>
       <w:tblGrid>
-        <w:gridCol w:w="4968"/>
-        <w:gridCol w:w="4968"/>
+        <w:gridCol w:w="2160"/>
+        <w:gridCol w:w="7488"/>
       </w:tblGrid>
       <w:tr>
         <w:trPr>
           <w:tblHeader/>
+          <w:cantSplit/>
         </w:trPr>
         <w:tc>
           <w:tcPr>
@@ -7464,6 +7427,9 @@
         </w:tc>
       </w:tr>
       <w:tr>
+        <w:trPr>
+          <w:cantSplit/>
+        </w:trPr>
         <w:tc>
           <w:tcPr>
             <w:tcW w:type="dxa" w:w="2160"/>
@@ -7512,6 +7478,9 @@
         </w:tc>
       </w:tr>
       <w:tr>
+        <w:trPr>
+          <w:cantSplit/>
+        </w:trPr>
         <w:tc>
           <w:tcPr>
             <w:tcW w:type="dxa" w:w="2160"/>
@@ -7562,6 +7531,9 @@
         </w:tc>
       </w:tr>
       <w:tr>
+        <w:trPr>
+          <w:cantSplit/>
+        </w:trPr>
         <w:tc>
           <w:tcPr>
             <w:tcW w:type="dxa" w:w="2160"/>
@@ -7610,6 +7582,9 @@
         </w:tc>
       </w:tr>
       <w:tr>
+        <w:trPr>
+          <w:cantSplit/>
+        </w:trPr>
         <w:tc>
           <w:tcPr>
             <w:tcW w:type="dxa" w:w="2160"/>
@@ -7677,7 +7652,7 @@
       <w:tblPr>
         <w:tblW w:type="auto" w:w="0"/>
         <w:jc w:val="center"/>
-        <w:tblLayout w:type="autofit"/>
+        <w:tblLayout w:type="fixed"/>
         <w:tblLook w:firstColumn="1" w:firstRow="1" w:lastColumn="0" w:lastRow="0" w:noHBand="0" w:noVBand="1" w:val="04A0"/>
         <w:tblBorders>
           <w:top w:val="single" w:sz="4" w:color="D9D9D9"/>
@@ -7689,15 +7664,16 @@
         </w:tblBorders>
       </w:tblPr>
       <w:tblGrid>
-        <w:gridCol w:w="1987"/>
-        <w:gridCol w:w="1987"/>
-        <w:gridCol w:w="1987"/>
-        <w:gridCol w:w="1987"/>
-        <w:gridCol w:w="1987"/>
+        <w:gridCol w:w="1512"/>
+        <w:gridCol w:w="1800"/>
+        <w:gridCol w:w="1728"/>
+        <w:gridCol w:w="2520"/>
+        <w:gridCol w:w="2088"/>
       </w:tblGrid>
       <w:tr>
         <w:trPr>
           <w:tblHeader/>
+          <w:cantSplit/>
         </w:trPr>
         <w:tc>
           <w:tcPr>
@@ -7811,6 +7787,9 @@
         </w:tc>
       </w:tr>
       <w:tr>
+        <w:trPr>
+          <w:cantSplit/>
+        </w:trPr>
         <w:tc>
           <w:tcPr>
             <w:tcW w:type="dxa" w:w="1512"/>
@@ -7928,6 +7907,9 @@
         </w:tc>
       </w:tr>
       <w:tr>
+        <w:trPr>
+          <w:cantSplit/>
+        </w:trPr>
         <w:tc>
           <w:tcPr>
             <w:tcW w:type="dxa" w:w="1512"/>
@@ -8050,6 +8032,9 @@
         </w:tc>
       </w:tr>
       <w:tr>
+        <w:trPr>
+          <w:cantSplit/>
+        </w:trPr>
         <w:tc>
           <w:tcPr>
             <w:tcW w:type="dxa" w:w="1512"/>
@@ -8167,6 +8152,9 @@
         </w:tc>
       </w:tr>
       <w:tr>
+        <w:trPr>
+          <w:cantSplit/>
+        </w:trPr>
         <w:tc>
           <w:tcPr>
             <w:tcW w:type="dxa" w:w="1512"/>
@@ -8289,6 +8277,9 @@
         </w:tc>
       </w:tr>
       <w:tr>
+        <w:trPr>
+          <w:cantSplit/>
+        </w:trPr>
         <w:tc>
           <w:tcPr>
             <w:tcW w:type="dxa" w:w="1512"/>
@@ -8406,6 +8397,9 @@
         </w:tc>
       </w:tr>
       <w:tr>
+        <w:trPr>
+          <w:cantSplit/>
+        </w:trPr>
         <w:tc>
           <w:tcPr>
             <w:tcW w:type="dxa" w:w="1512"/>
@@ -8528,6 +8522,9 @@
         </w:tc>
       </w:tr>
       <w:tr>
+        <w:trPr>
+          <w:cantSplit/>
+        </w:trPr>
         <w:tc>
           <w:tcPr>
             <w:tcW w:type="dxa" w:w="1512"/>
@@ -8639,12 +8636,15 @@
               <w:rPr>
                 <w:sz w:val="18"/>
               </w:rPr>
-              <w:t>p95 local até 45,1 ms</w:t>
+              <w:t>p95 histórico de 45,1 ms (20/10)</w:t>
             </w:r>
           </w:p>
         </w:tc>
       </w:tr>
       <w:tr>
+        <w:trPr>
+          <w:cantSplit/>
+        </w:trPr>
         <w:tc>
           <w:tcPr>
             <w:tcW w:type="dxa" w:w="1512"/>
@@ -8767,6 +8767,9 @@
         </w:tc>
       </w:tr>
       <w:tr>
+        <w:trPr>
+          <w:cantSplit/>
+        </w:trPr>
         <w:tc>
           <w:tcPr>
             <w:tcW w:type="dxa" w:w="1512"/>
@@ -8878,7 +8881,7 @@
               <w:rPr>
                 <w:sz w:val="18"/>
               </w:rPr>
-              <w:t>246 testes aprovados com PostgreSQL 16 e RabbitMQ 3.12 reais (232 aprovados e 14 ignorados com SQLite puro)</w:t>
+              <w:t>Suítes da CI 40199072801 verificadas separadamente (seção 4.10)</w:t>
             </w:r>
           </w:p>
         </w:tc>
@@ -8895,7 +8898,7 @@
         <w:jc w:val="both"/>
       </w:pPr>
       <w:r>
-        <w:t>As medições representam um ambiente local (contêiner Linux, Python 3.13, PostgreSQL 16 e SQLite) com dados sintéticos e não substituem planejamento de capacidade com volumes reais. PostgreSQL e RabbitMQ foram verificados localmente e na integração contínua; a hospedagem pública e o PostgreSQL gerenciado ainda não foram verificados.</w:t>
+        <w:t>A medição de desempenho de 20/10 representa um ambiente local (contêiner Linux, Python 3.13, PostgreSQL 16 e RabbitMQ 3.12) com dados sintéticos. A CI de 25/10 verifica a main de referência em jobs distintos de aplicação, PostgreSQL, RabbitMQ e navegador. As suítes se sobrepõem; suas contagens não constituem um total único. A verificação local de 28/10 registrou Python 252 aprovados e 14 ignorados, frontend 19 aprovados, TypeScript e OpenAPI aprovados. A hospedagem pública, o PostgreSQL gerenciado e a capacidade com volumes reais permanecem sem comprovação.</w:t>
       </w:r>
     </w:p>
     <w:p>
@@ -8910,7 +8913,7 @@
       <w:tblPr>
         <w:tblW w:type="auto" w:w="0"/>
         <w:jc w:val="center"/>
-        <w:tblLayout w:type="autofit"/>
+        <w:tblLayout w:type="fixed"/>
         <w:tblLook w:firstColumn="1" w:firstRow="1" w:lastColumn="0" w:lastRow="0" w:noHBand="0" w:noVBand="1" w:val="04A0"/>
         <w:tblBorders>
           <w:top w:val="single" w:sz="4" w:color="D9D9D9"/>
@@ -8922,12 +8925,13 @@
         </w:tblBorders>
       </w:tblPr>
       <w:tblGrid>
-        <w:gridCol w:w="4968"/>
-        <w:gridCol w:w="4968"/>
+        <w:gridCol w:w="3312"/>
+        <w:gridCol w:w="6336"/>
       </w:tblGrid>
       <w:tr>
         <w:trPr>
           <w:tblHeader/>
+          <w:cantSplit/>
         </w:trPr>
         <w:tc>
           <w:tcPr>
@@ -8975,6 +8979,9 @@
         </w:tc>
       </w:tr>
       <w:tr>
+        <w:trPr>
+          <w:cantSplit/>
+        </w:trPr>
         <w:tc>
           <w:tcPr>
             <w:tcW w:type="dxa" w:w="3312"/>
@@ -9023,6 +9030,9 @@
         </w:tc>
       </w:tr>
       <w:tr>
+        <w:trPr>
+          <w:cantSplit/>
+        </w:trPr>
         <w:tc>
           <w:tcPr>
             <w:tcW w:type="dxa" w:w="3312"/>
@@ -9073,6 +9083,9 @@
         </w:tc>
       </w:tr>
       <w:tr>
+        <w:trPr>
+          <w:cantSplit/>
+        </w:trPr>
         <w:tc>
           <w:tcPr>
             <w:tcW w:type="dxa" w:w="3312"/>
@@ -9121,6 +9134,9 @@
         </w:tc>
       </w:tr>
       <w:tr>
+        <w:trPr>
+          <w:cantSplit/>
+        </w:trPr>
         <w:tc>
           <w:tcPr>
             <w:tcW w:type="dxa" w:w="3312"/>
@@ -9171,6 +9187,9 @@
         </w:tc>
       </w:tr>
       <w:tr>
+        <w:trPr>
+          <w:cantSplit/>
+        </w:trPr>
         <w:tc>
           <w:tcPr>
             <w:tcW w:type="dxa" w:w="3312"/>
@@ -9219,6 +9238,9 @@
         </w:tc>
       </w:tr>
       <w:tr>
+        <w:trPr>
+          <w:cantSplit/>
+        </w:trPr>
         <w:tc>
           <w:tcPr>
             <w:tcW w:type="dxa" w:w="3312"/>
@@ -9269,6 +9291,9 @@
         </w:tc>
       </w:tr>
       <w:tr>
+        <w:trPr>
+          <w:cantSplit/>
+        </w:trPr>
         <w:tc>
           <w:tcPr>
             <w:tcW w:type="dxa" w:w="3312"/>
@@ -9371,7 +9396,299 @@
         <w:jc w:val="both"/>
       </w:pPr>
       <w:r>
-        <w:t>A arquitetura resolve o problema identificado no escopo demonstrável: os três fluxos eliminam o recadastro, automatizam cobrança e preparação de retirada e levam o SLA ao atendimento, com testes e roteiros como evidência. Os componentes estão organizados por propriedade de dados, e um teste estático impede importação de modelos entre contextos. As integrações são coerentes: REST quando a resposta é necessária na hora e eventos para efeitos posteriores. Os padrões escolhidos são adequados ao porte e à incerteza do cenário, e a arquitetura permite evolução por portas, contratos aditivos e ADRs.</w:t>
+        <w:t>A versão analisada é a main f1669d7, incorporada pelo PR #75 em 25/10/2026 (PROJETO APLICADO 7, 2026b). A CI 40199072801, executada em 25/10 nessa main, concluiu os quatro jobs com sucesso. Os resultados abaixo foram conferidos nos logs do GitHub Actions (PROJETO APLICADO 7, 2026c).</w:t>
+      </w:r>
+    </w:p>
+    <w:tbl>
+      <w:tblPr>
+        <w:tblW w:type="auto" w:w="0"/>
+        <w:jc w:val="center"/>
+        <w:tblLayout w:type="fixed"/>
+        <w:tblLook w:firstColumn="1" w:firstRow="1" w:lastColumn="0" w:lastRow="0" w:noHBand="0" w:noVBand="1" w:val="04A0"/>
+        <w:tblBorders>
+          <w:top w:val="single" w:sz="4" w:color="D9D9D9"/>
+          <w:left w:val="single" w:sz="4" w:color="D9D9D9"/>
+          <w:bottom w:val="single" w:sz="4" w:color="D9D9D9"/>
+          <w:right w:val="single" w:sz="4" w:color="D9D9D9"/>
+          <w:insideH w:val="single" w:sz="4" w:color="D9D9D9"/>
+          <w:insideV w:val="single" w:sz="4" w:color="D9D9D9"/>
+        </w:tblBorders>
+      </w:tblPr>
+      <w:tblGrid>
+        <w:gridCol w:w="1872"/>
+        <w:gridCol w:w="7776"/>
+      </w:tblGrid>
+      <w:tr>
+        <w:trPr>
+          <w:tblHeader/>
+          <w:cantSplit/>
+        </w:trPr>
+        <w:tc>
+          <w:tcPr>
+            <w:tcW w:type="dxa" w:w="1872"/>
+            <w:shd w:fill="17365D"/>
+            <w:vAlign w:val="center"/>
+            <w:tcMar>
+              <w:top w:w="100" w:type="dxa"/>
+              <w:start w:w="120" w:type="dxa"/>
+              <w:bottom w:w="100" w:type="dxa"/>
+              <w:end w:w="120" w:type="dxa"/>
+            </w:tcMar>
+          </w:tcPr>
+          <w:p>
+            <w:r>
+              <w:rPr>
+                <w:b/>
+                <w:color w:val="FFFFFF"/>
+              </w:rPr>
+              <w:t>Job da CI</w:t>
+            </w:r>
+          </w:p>
+        </w:tc>
+        <w:tc>
+          <w:tcPr>
+            <w:tcW w:type="dxa" w:w="7776"/>
+            <w:shd w:fill="17365D"/>
+            <w:vAlign w:val="center"/>
+            <w:tcMar>
+              <w:top w:w="100" w:type="dxa"/>
+              <w:start w:w="120" w:type="dxa"/>
+              <w:bottom w:w="100" w:type="dxa"/>
+              <w:end w:w="120" w:type="dxa"/>
+            </w:tcMar>
+          </w:tcPr>
+          <w:p>
+            <w:r>
+              <w:rPr>
+                <w:b/>
+                <w:color w:val="FFFFFF"/>
+              </w:rPr>
+              <w:t>Resultado da verificação</w:t>
+            </w:r>
+          </w:p>
+        </w:tc>
+      </w:tr>
+      <w:tr>
+        <w:trPr>
+          <w:cantSplit/>
+        </w:trPr>
+        <w:tc>
+          <w:tcPr>
+            <w:tcW w:type="dxa" w:w="1872"/>
+            <w:vAlign w:val="center"/>
+            <w:tcMar>
+              <w:top w:w="100" w:type="dxa"/>
+              <w:start w:w="120" w:type="dxa"/>
+              <w:bottom w:w="100" w:type="dxa"/>
+              <w:end w:w="120" w:type="dxa"/>
+            </w:tcMar>
+          </w:tcPr>
+          <w:p>
+            <w:pPr>
+              <w:spacing w:after="0"/>
+            </w:pPr>
+            <w:r>
+              <w:rPr>
+                <w:sz w:val="18"/>
+              </w:rPr>
+              <w:t>application</w:t>
+            </w:r>
+          </w:p>
+        </w:tc>
+        <w:tc>
+          <w:tcPr>
+            <w:tcW w:type="dxa" w:w="7776"/>
+            <w:vAlign w:val="center"/>
+            <w:tcMar>
+              <w:top w:w="100" w:type="dxa"/>
+              <w:start w:w="120" w:type="dxa"/>
+              <w:bottom w:w="100" w:type="dxa"/>
+              <w:end w:w="120" w:type="dxa"/>
+            </w:tcMar>
+          </w:tcPr>
+          <w:p>
+            <w:pPr>
+              <w:spacing w:after="0"/>
+            </w:pPr>
+            <w:r>
+              <w:rPr>
+                <w:sz w:val="18"/>
+              </w:rPr>
+              <w:t>252 testes aprovados e 14 ignorados</w:t>
+            </w:r>
+          </w:p>
+        </w:tc>
+      </w:tr>
+      <w:tr>
+        <w:trPr>
+          <w:cantSplit/>
+        </w:trPr>
+        <w:tc>
+          <w:tcPr>
+            <w:tcW w:type="dxa" w:w="1872"/>
+            <w:vAlign w:val="center"/>
+            <w:tcMar>
+              <w:top w:w="100" w:type="dxa"/>
+              <w:start w:w="120" w:type="dxa"/>
+              <w:bottom w:w="100" w:type="dxa"/>
+              <w:end w:w="120" w:type="dxa"/>
+            </w:tcMar>
+            <w:shd w:fill="EAF1F8"/>
+          </w:tcPr>
+          <w:p>
+            <w:pPr>
+              <w:spacing w:after="0"/>
+            </w:pPr>
+            <w:r>
+              <w:rPr>
+                <w:sz w:val="18"/>
+              </w:rPr>
+              <w:t>postgresql</w:t>
+            </w:r>
+          </w:p>
+        </w:tc>
+        <w:tc>
+          <w:tcPr>
+            <w:tcW w:type="dxa" w:w="7776"/>
+            <w:vAlign w:val="center"/>
+            <w:tcMar>
+              <w:top w:w="100" w:type="dxa"/>
+              <w:start w:w="120" w:type="dxa"/>
+              <w:bottom w:w="100" w:type="dxa"/>
+              <w:end w:w="120" w:type="dxa"/>
+            </w:tcMar>
+            <w:shd w:fill="EAF1F8"/>
+          </w:tcPr>
+          <w:p>
+            <w:pPr>
+              <w:spacing w:after="0"/>
+            </w:pPr>
+            <w:r>
+              <w:rPr>
+                <w:sz w:val="18"/>
+              </w:rPr>
+              <w:t>262 testes aprovados e 4 ignorados</w:t>
+            </w:r>
+          </w:p>
+        </w:tc>
+      </w:tr>
+      <w:tr>
+        <w:trPr>
+          <w:cantSplit/>
+        </w:trPr>
+        <w:tc>
+          <w:tcPr>
+            <w:tcW w:type="dxa" w:w="1872"/>
+            <w:vAlign w:val="center"/>
+            <w:tcMar>
+              <w:top w:w="100" w:type="dxa"/>
+              <w:start w:w="120" w:type="dxa"/>
+              <w:bottom w:w="100" w:type="dxa"/>
+              <w:end w:w="120" w:type="dxa"/>
+            </w:tcMar>
+          </w:tcPr>
+          <w:p>
+            <w:pPr>
+              <w:spacing w:after="0"/>
+            </w:pPr>
+            <w:r>
+              <w:rPr>
+                <w:sz w:val="18"/>
+              </w:rPr>
+              <w:t>rabbitmq</w:t>
+            </w:r>
+          </w:p>
+        </w:tc>
+        <w:tc>
+          <w:tcPr>
+            <w:tcW w:type="dxa" w:w="7776"/>
+            <w:vAlign w:val="center"/>
+            <w:tcMar>
+              <w:top w:w="100" w:type="dxa"/>
+              <w:start w:w="120" w:type="dxa"/>
+              <w:bottom w:w="100" w:type="dxa"/>
+              <w:end w:w="120" w:type="dxa"/>
+            </w:tcMar>
+          </w:tcPr>
+          <w:p>
+            <w:pPr>
+              <w:spacing w:after="0"/>
+            </w:pPr>
+            <w:r>
+              <w:rPr>
+                <w:sz w:val="18"/>
+              </w:rPr>
+              <w:t>22 testes aprovados</w:t>
+            </w:r>
+          </w:p>
+        </w:tc>
+      </w:tr>
+      <w:tr>
+        <w:trPr>
+          <w:cantSplit/>
+        </w:trPr>
+        <w:tc>
+          <w:tcPr>
+            <w:tcW w:type="dxa" w:w="1872"/>
+            <w:vAlign w:val="center"/>
+            <w:tcMar>
+              <w:top w:w="100" w:type="dxa"/>
+              <w:start w:w="120" w:type="dxa"/>
+              <w:bottom w:w="100" w:type="dxa"/>
+              <w:end w:w="120" w:type="dxa"/>
+            </w:tcMar>
+            <w:shd w:fill="EAF1F8"/>
+          </w:tcPr>
+          <w:p>
+            <w:pPr>
+              <w:spacing w:after="0"/>
+            </w:pPr>
+            <w:r>
+              <w:rPr>
+                <w:sz w:val="18"/>
+              </w:rPr>
+              <w:t>e2e</w:t>
+            </w:r>
+          </w:p>
+        </w:tc>
+        <w:tc>
+          <w:tcPr>
+            <w:tcW w:type="dxa" w:w="7776"/>
+            <w:vAlign w:val="center"/>
+            <w:tcMar>
+              <w:top w:w="100" w:type="dxa"/>
+              <w:start w:w="120" w:type="dxa"/>
+              <w:bottom w:w="100" w:type="dxa"/>
+              <w:end w:w="120" w:type="dxa"/>
+            </w:tcMar>
+            <w:shd w:fill="EAF1F8"/>
+          </w:tcPr>
+          <w:p>
+            <w:pPr>
+              <w:spacing w:after="0"/>
+            </w:pPr>
+            <w:r>
+              <w:rPr>
+                <w:sz w:val="18"/>
+              </w:rPr>
+              <w:t>25 roteiros de navegador aprovados; verificação axe separada: 1 aprovada</w:t>
+            </w:r>
+          </w:p>
+        </w:tc>
+      </w:tr>
+    </w:tbl>
+    <w:p>
+      <w:pPr>
+        <w:spacing w:after="40"/>
+      </w:pPr>
+    </w:p>
+    <w:p>
+      <w:pPr>
+        <w:spacing w:after="160" w:line="276" w:lineRule="auto"/>
+        <w:jc w:val="both"/>
+      </w:pPr>
+      <w:r>
+        <w:t>As suítes se sobrepõem e não devem ser somadas. A verificação local informada em 28/10 registrou 252 testes Python aprovados e 14 ignorados, 19 testes da interface aprovados, checagem TypeScript e conferência OpenAPI aprovadas (PROJETO APLICADO 7, 2026d). A evidência de 20/10 (246 testes com PostgreSQL/RabbitMQ, 22 roteiros de navegador e p95 máximo de 45,1 ms) permanece histórica; o p95 não foi medido novamente sobre a main f1669d7 nesta revisão (PROJETO APLICADO 7, 2026a).</w:t>
       </w:r>
     </w:p>
     <w:p>
@@ -9380,12 +9697,31 @@
         <w:jc w:val="both"/>
       </w:pPr>
       <w:r>
-        <w:t>Riscos e limitações: os dados organizacionais reais são desconhecidos; não há OIDC, tracing distribuído nem agendador (vencimento de fatura e SLA dependem de acionamento); o RabbitMQ recebe cópia dos eventos, mas não entrega aos consumidores; o prazo da leitura do CRM limita tentativas e esperas, mas não interrompe uma chamada no mesmo processo; a hospedagem pública e o PostgreSQL gerenciado não foram verificados.</w:t>
+        <w:t>Nos cenários exercitados, os três fluxos evitam recadastro, automatizam cobrança e preparação de retirada e levam o SLA ao atendimento. Os resultados sustentam a viabilidade do desenho, mas não garantem convergência em toda ordem de eventos ou consistência de todos os estados. Os componentes estão organizados por propriedade de dados, com teste estático das fronteiras. REST atende respostas imediatas e eventos coordenam efeitos posteriores. Portas, contratos aditivos e ADRs permitem evolução com mudanças localizadas.</w:t>
+      </w:r>
+    </w:p>
+    <w:p>
+      <w:pPr>
+        <w:spacing w:after="160" w:line="276" w:lineRule="auto"/>
+        <w:jc w:val="both"/>
+      </w:pPr>
+      <w:r>
+        <w:t>A revisão de código de 28/10 identificou três limitações reproduzidas (PROJETO APLICADO 7, 2026d). No F3, se TicketOpened falha e TicketResolved é consumido antes da recuperação, o consumidor de resolução retorna sem processo; a recuperação posterior da abertura cria um processo STARTED embora o chamado já esteja RESOLVED, sem pendências na outbox que assegurem a convergência. No encerramento de contrato, o processo pode ficar COMPLETED com tarefa CANCELLED. No financeiro, a leitura pode exibir OVERDUE enquanto o estado persistido permanece OPEN e ainda permite cancelamento. São defeitos conhecidos, não corrigidos nesta revisão documental; exigem correção e regressões específicas para ordem de eventos e coerência de estados. Aprovação das suítes não equivale a confiabilidade absoluta.</w:t>
+      </w:r>
+    </w:p>
+    <w:p>
+      <w:pPr>
+        <w:spacing w:after="160" w:line="276" w:lineRule="auto"/>
+        <w:jc w:val="both"/>
+      </w:pPr>
+      <w:r>
+        <w:t>Riscos e limitações: os dados organizacionais reais são desconhecidos; não há OIDC, tracing distribuído nem agendador (vencimento de fatura e SLA dependem de acionamento); o RabbitMQ recebe cópia dos eventos, mas não entrega aos consumidores, e FAILED é um estado da aplicação, não uma fila de erro do broker. O prazo da leitura do CRM limita tentativas e esperas, mas não interrompe uma chamada no mesmo processo; o ADR-006 permanece proposto, aguardando aceite. A hospedagem pública e o PostgreSQL gerenciado não foram verificados. Integração na main não comprova aceite docente, validação das premissas ou conclusão formal da entrega.</w:t>
       </w:r>
     </w:p>
     <w:p>
       <w:pPr>
         <w:pStyle w:val="Heading1"/>
+        <w:pageBreakBefore/>
       </w:pPr>
       <w:r>
         <w:t>5 Considerações finais</w:t>
@@ -9397,7 +9733,7 @@
         <w:jc w:val="both"/>
       </w:pPr>
       <w:r>
-        <w:t>Os objetivos foram alcançados no nível de protótipo acadêmico: requisitos, AS-IS, TO-BE, padrões, três integrações, interoperabilidade, qualidade e evolução estão documentados e demonstrados. As decisões mais relevantes foram o monólito modular com fronteiras extraíveis, a outbox com inbox para efeitos únicos e o tratamento explícito da indisponibilidade (503 no F1 e estado pendente no F3). Os principais desafios foram manter fronteiras com banco e processo compartilhados e garantir a mesma correlação em HTTP, auditoria e eventos.</w:t>
+        <w:t>Os objetivos técnicos possuem evidências no nível de protótipo acadêmico: requisitos, AS-IS, TO-BE, padrões, três integrações, interoperabilidade, qualidade e evolução estão documentados e demonstrados no recorte de validação apresentado. A entrega acadêmica permanece condicionada à informação dos nomes e contribuições individuais e à revisão docente das premissas. As decisões mais relevantes foram o monólito modular com fronteiras extraíveis, a outbox com inbox para efeitos únicos e o tratamento explícito da indisponibilidade (503 no F1 e estado pendente no F3). Os principais desafios foram manter fronteiras com banco e processo compartilhados e garantir a mesma correlação em HTTP, auditoria e eventos.</w:t>
       </w:r>
     </w:p>
     <w:p>
@@ -9406,7 +9742,7 @@
         <w:jc w:val="both"/>
       </w:pPr>
       <w:r>
-        <w:t>Como evolução, a arquitetura pode incorporar identidade corporativa, agendador para vencimentos e alertas de SLA, consumo efetivo pelo broker e conectores reais por adaptadores. Funcionalidades futuras incluem gestão de frota, vistoria com fotos e portal do cliente. O principal aprendizado é que contratos versionados não bastam sozinhos: idempotência, estados de recuperação e evidências precisam ser projetados junto com cada fluxo.</w:t>
+        <w:t>A prioridade técnica é corrigir as limitações de convergência e coerência de estados descritas na seção 4.10 e demonstrar sua recuperação por testes específicos. Como evolução, a arquitetura pode incorporar identidade corporativa, agendador para vencimentos e alertas de SLA, consumo efetivo pelo broker e conectores reais por adaptadores. Funcionalidades futuras incluem gestão de frota, vistoria com fotos e portal do cliente. O principal aprendizado é que idempotência, ordenação de eventos, estados de recuperação e evidências precisam ser projetados junto com cada fluxo.</w:t>
       </w:r>
     </w:p>
     <w:p>
@@ -9416,214 +9752,258 @@
         <w:spacing w:before="160" w:after="240"/>
       </w:pPr>
       <w:r>
-        <w:t>Referências</w:t>
+        <w:t>6 Referências</w:t>
       </w:r>
     </w:p>
     <w:p>
       <w:pPr>
-        <w:spacing w:after="100"/>
+        <w:spacing w:after="80"/>
       </w:pPr>
       <w:r>
         <w:rPr>
-          <w:sz w:val="19"/>
+          <w:sz w:val="18"/>
         </w:rPr>
         <w:t>ARCHCORP. Projeto Aplicado – ArchCorp: Arquitetura de Sistemas Corporativos. Enunciado acadêmico do Projeto Aplicado. 2026a.</w:t>
       </w:r>
     </w:p>
     <w:p>
       <w:pPr>
-        <w:spacing w:after="100"/>
+        <w:spacing w:after="80"/>
       </w:pPr>
       <w:r>
         <w:rPr>
-          <w:sz w:val="19"/>
+          <w:sz w:val="18"/>
         </w:rPr>
         <w:t>ARCHCORP. Plano de Execução e Cronograma Detalhado. Material acadêmico fornecido ao projeto. 2026b.</w:t>
       </w:r>
     </w:p>
     <w:p>
       <w:pPr>
-        <w:spacing w:after="100"/>
+        <w:spacing w:after="80"/>
       </w:pPr>
       <w:r>
         <w:rPr>
-          <w:sz w:val="19"/>
+          <w:sz w:val="18"/>
         </w:rPr>
         <w:t>ASYNCAPI INITIATIVE. AsyncAPI Specification 3.0.0. 2023. Disponível em: https://www.asyncapi.com/docs/reference/specification/v3.0.0. Acesso em: 17 out. 2026.</w:t>
       </w:r>
     </w:p>
     <w:p>
       <w:pPr>
-        <w:spacing w:after="100"/>
+        <w:spacing w:after="80"/>
       </w:pPr>
       <w:r>
         <w:rPr>
-          <w:sz w:val="19"/>
+          <w:sz w:val="18"/>
         </w:rPr>
         <w:t>BASS, Len; CLEMENTS, Paul; KAZMAN, Rick. Software architecture in practice. 4. ed. Boston: Addison-Wesley, 2021.</w:t>
       </w:r>
     </w:p>
     <w:p>
       <w:pPr>
-        <w:spacing w:after="100"/>
+        <w:spacing w:after="80"/>
       </w:pPr>
       <w:r>
         <w:rPr>
-          <w:sz w:val="19"/>
+          <w:sz w:val="18"/>
         </w:rPr>
         <w:t>BUTTLE, Francis; MAKLAN, Stan. Customer relationship management: concepts and technologies. 4. ed. London: Routledge, 2019.</w:t>
       </w:r>
     </w:p>
     <w:p>
       <w:pPr>
-        <w:spacing w:after="100"/>
+        <w:spacing w:after="80"/>
       </w:pPr>
       <w:r>
         <w:rPr>
-          <w:sz w:val="19"/>
+          <w:sz w:val="18"/>
         </w:rPr>
         <w:t>COCKBURN, Alistair. Hexagonal architecture. 2005. Disponível em: https://alistair.cockburn.us/hexagonal-architecture/. Acesso em: 17 out. 2026.</w:t>
       </w:r>
     </w:p>
     <w:p>
       <w:pPr>
-        <w:spacing w:after="100"/>
+        <w:spacing w:after="80"/>
       </w:pPr>
       <w:r>
         <w:rPr>
-          <w:sz w:val="19"/>
+          <w:sz w:val="18"/>
         </w:rPr>
         <w:t>DAVENPORT, Thomas H. Putting the enterprise into the enterprise system. Harvard Business Review, Boston, v. 76, n. 4, p. 121-131, jul./ago. 1998.</w:t>
       </w:r>
     </w:p>
     <w:p>
       <w:pPr>
-        <w:spacing w:after="100"/>
+        <w:spacing w:after="80"/>
       </w:pPr>
       <w:r>
         <w:rPr>
-          <w:sz w:val="19"/>
+          <w:sz w:val="18"/>
         </w:rPr>
         <w:t>DUMAS, Marlon; LA ROSA, Marcello; MENDLING, Jan; REIJERS, Hajo A. Fundamentals of business process management. 2. ed. Berlin: Springer, 2018.</w:t>
       </w:r>
     </w:p>
     <w:p>
       <w:pPr>
-        <w:spacing w:after="100"/>
+        <w:spacing w:after="80"/>
       </w:pPr>
       <w:r>
         <w:rPr>
-          <w:sz w:val="19"/>
+          <w:sz w:val="18"/>
         </w:rPr>
         <w:t>FIELDING, Roy; NOTTINGHAM, Mark; RESCHKE, Julian (ed.). RFC 9110: HTTP semantics. Internet Engineering Task Force, jun. 2022. Disponível em: https://www.rfc-editor.org/rfc/rfc9110. Acesso em: 17 out. 2026.</w:t>
       </w:r>
     </w:p>
     <w:p>
       <w:pPr>
-        <w:spacing w:after="100"/>
+        <w:spacing w:after="80"/>
       </w:pPr>
       <w:r>
         <w:rPr>
-          <w:sz w:val="19"/>
+          <w:sz w:val="18"/>
         </w:rPr>
         <w:t>FOWLER, Martin. Patterns of enterprise application architecture. Boston: Addison-Wesley, 2002.</w:t>
       </w:r>
     </w:p>
     <w:p>
       <w:pPr>
-        <w:spacing w:after="100"/>
+        <w:spacing w:after="80"/>
       </w:pPr>
       <w:r>
         <w:rPr>
-          <w:sz w:val="19"/>
+          <w:sz w:val="18"/>
         </w:rPr>
         <w:t>FOWLER, Martin. MonolithFirst. 3 jun. 2015. Disponível em: https://martinfowler.com/bliki/MonolithFirst.html. Acesso em: 17 out. 2026.</w:t>
       </w:r>
     </w:p>
     <w:p>
       <w:pPr>
-        <w:spacing w:after="100"/>
+        <w:spacing w:after="80"/>
       </w:pPr>
       <w:r>
         <w:rPr>
-          <w:sz w:val="19"/>
+          <w:sz w:val="18"/>
         </w:rPr>
         <w:t>HOHPE, Gregor; WOOLF, Bobby. Enterprise integration patterns: designing, building, and deploying messaging solutions. Boston: Addison-Wesley, 2003.</w:t>
       </w:r>
     </w:p>
     <w:p>
       <w:pPr>
-        <w:spacing w:after="100"/>
+        <w:spacing w:after="80"/>
       </w:pPr>
       <w:r>
         <w:rPr>
-          <w:sz w:val="19"/>
+          <w:sz w:val="18"/>
         </w:rPr>
         <w:t>ISO/IEC. ISO/IEC 25010:2011: systems and software engineering — systems and software quality requirements and evaluation (SQuaRE) — system and software quality models. Geneva: ISO, 2011.</w:t>
       </w:r>
     </w:p>
     <w:p>
       <w:pPr>
-        <w:spacing w:after="100"/>
+        <w:spacing w:after="80"/>
       </w:pPr>
       <w:r>
         <w:rPr>
-          <w:sz w:val="19"/>
+          <w:sz w:val="18"/>
         </w:rPr>
         <w:t>LEHMAN, Meir M. Programs, life cycles, and laws of software evolution. Proceedings of the IEEE, v. 68, n. 9, p. 1060-1076, 1980.</w:t>
       </w:r>
     </w:p>
     <w:p>
       <w:pPr>
-        <w:spacing w:after="100"/>
+        <w:spacing w:after="80"/>
       </w:pPr>
       <w:r>
         <w:rPr>
-          <w:sz w:val="19"/>
+          <w:sz w:val="18"/>
         </w:rPr>
         <w:t>LEWIS, James; FOWLER, Martin. Microservices: a definition of this new architectural term. 25 mar. 2014. Disponível em: https://martinfowler.com/articles/microservices.html. Acesso em: 17 out. 2026.</w:t>
       </w:r>
     </w:p>
     <w:p>
       <w:pPr>
-        <w:spacing w:after="100"/>
+        <w:spacing w:after="80"/>
       </w:pPr>
       <w:r>
         <w:rPr>
-          <w:sz w:val="19"/>
+          <w:sz w:val="18"/>
         </w:rPr>
         <w:t>NEWMAN, Sam. Building microservices: designing fine-grained systems. 2. ed. Sebastopol: O'Reilly Media, 2021.</w:t>
       </w:r>
     </w:p>
     <w:p>
       <w:pPr>
-        <w:spacing w:after="100"/>
+        <w:spacing w:after="80"/>
       </w:pPr>
       <w:r>
         <w:rPr>
-          <w:sz w:val="19"/>
+          <w:sz w:val="18"/>
         </w:rPr>
         <w:t>NYGARD, Michael T. Release it!: design and deploy production-ready software. 2. ed. Raleigh: Pragmatic Bookshelf, 2018.</w:t>
       </w:r>
     </w:p>
     <w:p>
       <w:pPr>
-        <w:spacing w:after="100"/>
+        <w:spacing w:after="80"/>
       </w:pPr>
       <w:r>
         <w:rPr>
-          <w:sz w:val="19"/>
+          <w:sz w:val="18"/>
         </w:rPr>
         <w:t>OPENAPI INITIATIVE. OpenAPI Specification 3.1.1. 2024. Disponível em: https://spec.openapis.org/oas/v3.1.1.html. Acesso em: 17 out. 2026.</w:t>
       </w:r>
     </w:p>
     <w:p>
       <w:pPr>
-        <w:spacing w:after="100"/>
+        <w:spacing w:after="80"/>
       </w:pPr>
       <w:r>
         <w:rPr>
-          <w:sz w:val="19"/>
+          <w:sz w:val="18"/>
+        </w:rPr>
+        <w:t>PROJETO APLICADO 7. Evidências de validação. Seções de 20/10 e 21/10/2026. Documento do repositório docs/EVIDENCIAS_VALIDACAO.md, versão f1669d7. 2026a.</w:t>
+      </w:r>
+    </w:p>
+    <w:p>
+      <w:pPr>
+        <w:spacing w:after="80"/>
+      </w:pPr>
+      <w:r>
+        <w:rPr>
+          <w:sz w:val="18"/>
+        </w:rPr>
+        <w:t>PROJETO APLICADO 7. Integra as tarefas T06–T19 à main e recupera correções do T17. PR #75, commit f1669d78f01e2d279b3de60a999ed778e6c9916e, 25 out. 2026. Disponível em: https://github.com/Roger-Quinelato/projetoAplicado7/pull/75. Registro do commit consultado localmente em: 28 out. 2026. 2026b.</w:t>
+      </w:r>
+    </w:p>
+    <w:p>
+      <w:pPr>
+        <w:spacing w:after="80"/>
+      </w:pPr>
+      <w:r>
+        <w:rPr>
+          <w:sz w:val="18"/>
+        </w:rPr>
+        <w:t>PROJETO APLICADO 7. Verify: execução 40199072801 na main f1669d7. GitHub Actions, 25 out. 2026. Disponível em: https://github.com/Roger-Quinelato/projetoAplicado7/actions/runs/40199072801. Logs consultados no GitHub Actions em: 28 out. 2026. 2026c.</w:t>
+      </w:r>
+    </w:p>
+    <w:p>
+      <w:pPr>
+        <w:spacing w:after="80"/>
+      </w:pPr>
+      <w:r>
+        <w:rPr>
+          <w:sz w:val="18"/>
+        </w:rPr>
+        <w:t>PROJETO APLICADO 7. Registros de testes locais e revisão de código de 28 out. 2026. Resultados e reproduções informados pela equipe; conferência dos consumidores em src/archcorp/workflow/service.py e das regras em src/archcorp/finance/service.py e domain.py. 2026d.</w:t>
+      </w:r>
+    </w:p>
+    <w:p>
+      <w:pPr>
+        <w:spacing w:after="80"/>
+      </w:pPr>
+      <w:r>
+        <w:rPr>
+          <w:sz w:val="18"/>
         </w:rPr>
         <w:t>RICHARDS, Mark; FORD, Neal. Fundamentals of software architecture: an engineering approach. Sebastopol: O'Reilly Media, 2020.</w:t>
       </w:r>
@@ -9639,8 +10019,8 @@
     </w:p>
     <w:sectPr>
       <w:footerReference w:type="default" r:id="rId9"/>
-      <w:pgSz w:w="12240" w:h="15840"/>
-      <w:pgMar w:top="1037" w:right="1152" w:bottom="1037" w:left="1152" w:header="720" w:footer="720" w:gutter="0"/>
+      <w:pgSz w:w="11909" w:h="16834"/>
+      <w:pgMar w:top="1037" w:right="979" w:bottom="1037" w:left="979" w:header="720" w:footer="720" w:gutter="0"/>
       <w:cols w:space="720"/>
       <w:docGrid w:linePitch="360"/>
     </w:sectPr>

</xml_diff>

<commit_message>
docs: alinha entrega ao guia e aos marcos de novembro (#77)
</commit_message>
<xml_diff>
--- a/output/Relatorio_Tecnico_Cenario_4.docx
+++ b/output/Relatorio_Tecnico_Cenario_4.docx
@@ -30,9 +30,13 @@
         <w:jc w:val="center"/>
       </w:pPr>
       <w:r>
-        <w:t>Equipe do Projeto Aplicado (nomes a preencher antes da submissão)</w:t>
+        <w:t>Autoria e contribuições individuais pendentes de informação pela equipe</w:t>
         <w:br/>
-        <w:t>Outubro de 2026</w:t>
+        <w:t>Versão de 28 de outubro de 2026</w:t>
+        <w:br/>
+        <w:t>Entrega pronta prevista para 09/11/2026</w:t>
+        <w:br/>
+        <w:t>Apresentação prevista para 23/11/2026</w:t>
       </w:r>
     </w:p>
     <w:p>
@@ -69,7 +73,7 @@
         <w:jc w:val="both"/>
       </w:pPr>
       <w:r>
-        <w:t>Em 20 de outubro de 2026, a suíte automatizada local registrou 246 testes aprovados com PostgreSQL 16 e RabbitMQ 3.12 reais (232 aprovados e 14 ignorados com SQLite puro); os ignorados exigem PostgreSQL ou RabbitMQ reais. Os 22 roteiros de navegador (F1, F2 e F3 pela interface e acessibilidade com axe) passaram com SQLite e com PostgreSQL e RabbitMQ. Roteiros executados contra a API local demonstraram os três fluxos integrados: cliente do CRM para contrato sem recadastro (20 de 20 checagens), ativação para primeira fatura e preparação de retirada sem duplicidade (14 de 14) e chamado com contrato e SLA até a resolução (15 de 15). Na medição local do RNF-07 (60 clientes e 100 amostras por consulta, em 10 consultas de negócio), o maior p95 foi 45,1 ms com PostgreSQL, abaixo da meta de 500 ms; o valor não representa hospedagem pública.</w:t>
+        <w:t>A análise considera a main em f1669d7, integrada pelo PR #75 em 25/10/2026. Na CI 40199072801, de 25/10, os quatro jobs concluíram com sucesso: application (252 aprovados e 14 ignorados), postgresql (262 aprovados e 4 ignorados), rabbitmq (22 aprovados) e e2e (25 roteiros aprovados e uma verificação axe aprovada). As suítes se sobrepõem e suas contagens não devem ser somadas. Como evidência histórica, em 20 de outubro de 2026 foram registrados 246 testes aprovados com PostgreSQL 16 e RabbitMQ 3.12 reais (232 aprovados e 14 ignorados com SQLite puro) e verificações dos fluxos F1 (20/20), F2 (14/14) e F3 (15/15). A medição histórica do RNF-07, com 60 clientes e 100 amostras por consulta em 10 consultas de negócio, apresentou maior p95 de 45,1 ms no PostgreSQL, abaixo da meta de 500 ms. Os resultados usam dados sintéticos e não comprovam hospedagem pública nem nova medição de desempenho sobre essa main (PROJETO APLICADO 7, 2026a, 2026b, 2026c).</w:t>
       </w:r>
     </w:p>
     <w:p>
@@ -443,283 +447,13 @@
         <w:t>3.1 Participantes</w:t>
       </w:r>
     </w:p>
-    <w:tbl>
-      <w:tblPr>
-        <w:tblW w:type="auto" w:w="0"/>
-        <w:jc w:val="center"/>
-        <w:tblLayout w:type="autofit"/>
-        <w:tblLook w:firstColumn="1" w:firstRow="1" w:lastColumn="0" w:lastRow="0" w:noHBand="0" w:noVBand="1" w:val="04A0"/>
-        <w:tblBorders>
-          <w:top w:val="single" w:sz="4" w:color="D9D9D9"/>
-          <w:left w:val="single" w:sz="4" w:color="D9D9D9"/>
-          <w:bottom w:val="single" w:sz="4" w:color="D9D9D9"/>
-          <w:right w:val="single" w:sz="4" w:color="D9D9D9"/>
-          <w:insideH w:val="single" w:sz="4" w:color="D9D9D9"/>
-          <w:insideV w:val="single" w:sz="4" w:color="D9D9D9"/>
-        </w:tblBorders>
-      </w:tblPr>
-      <w:tblGrid>
-        <w:gridCol w:w="4968"/>
-        <w:gridCol w:w="4968"/>
-      </w:tblGrid>
-      <w:tr>
-        <w:trPr>
-          <w:tblHeader/>
-        </w:trPr>
-        <w:tc>
-          <w:tcPr>
-            <w:tcW w:type="dxa" w:w="3168"/>
-            <w:shd w:fill="17365D"/>
-            <w:vAlign w:val="center"/>
-            <w:tcMar>
-              <w:top w:w="100" w:type="dxa"/>
-              <w:start w:w="120" w:type="dxa"/>
-              <w:bottom w:w="100" w:type="dxa"/>
-              <w:end w:w="120" w:type="dxa"/>
-            </w:tcMar>
-          </w:tcPr>
-          <w:p>
-            <w:r>
-              <w:rPr>
-                <w:b/>
-                <w:color w:val="FFFFFF"/>
-              </w:rPr>
-              <w:t>Integrante</w:t>
-            </w:r>
-          </w:p>
-        </w:tc>
-        <w:tc>
-          <w:tcPr>
-            <w:tcW w:type="dxa" w:w="6480"/>
-            <w:shd w:fill="17365D"/>
-            <w:vAlign w:val="center"/>
-            <w:tcMar>
-              <w:top w:w="100" w:type="dxa"/>
-              <w:start w:w="120" w:type="dxa"/>
-              <w:bottom w:w="100" w:type="dxa"/>
-              <w:end w:w="120" w:type="dxa"/>
-            </w:tcMar>
-          </w:tcPr>
-          <w:p>
-            <w:r>
-              <w:rPr>
-                <w:b/>
-                <w:color w:val="FFFFFF"/>
-              </w:rPr>
-              <w:t>Contribuição</w:t>
-            </w:r>
-          </w:p>
-        </w:tc>
-      </w:tr>
-      <w:tr>
-        <w:tc>
-          <w:tcPr>
-            <w:tcW w:type="dxa" w:w="3168"/>
-            <w:vAlign w:val="center"/>
-            <w:tcMar>
-              <w:top w:w="100" w:type="dxa"/>
-              <w:start w:w="120" w:type="dxa"/>
-              <w:bottom w:w="100" w:type="dxa"/>
-              <w:end w:w="120" w:type="dxa"/>
-            </w:tcMar>
-          </w:tcPr>
-          <w:p>
-            <w:pPr>
-              <w:spacing w:after="0"/>
-            </w:pPr>
-            <w:r>
-              <w:rPr>
-                <w:sz w:val="18"/>
-              </w:rPr>
-              <w:t>[preencher]</w:t>
-            </w:r>
-          </w:p>
-        </w:tc>
-        <w:tc>
-          <w:tcPr>
-            <w:tcW w:type="dxa" w:w="6480"/>
-            <w:vAlign w:val="center"/>
-            <w:tcMar>
-              <w:top w:w="100" w:type="dxa"/>
-              <w:start w:w="120" w:type="dxa"/>
-              <w:bottom w:w="100" w:type="dxa"/>
-              <w:end w:w="120" w:type="dxa"/>
-            </w:tcMar>
-          </w:tcPr>
-          <w:p>
-            <w:pPr>
-              <w:spacing w:after="0"/>
-            </w:pPr>
-            <w:r>
-              <w:rPr>
-                <w:sz w:val="18"/>
-              </w:rPr>
-              <w:t>Análise do cenário, requisitos e AS-IS</w:t>
-            </w:r>
-          </w:p>
-        </w:tc>
-      </w:tr>
-      <w:tr>
-        <w:tc>
-          <w:tcPr>
-            <w:tcW w:type="dxa" w:w="3168"/>
-            <w:vAlign w:val="center"/>
-            <w:tcMar>
-              <w:top w:w="100" w:type="dxa"/>
-              <w:start w:w="120" w:type="dxa"/>
-              <w:bottom w:w="100" w:type="dxa"/>
-              <w:end w:w="120" w:type="dxa"/>
-            </w:tcMar>
-            <w:shd w:fill="EAF1F8"/>
-          </w:tcPr>
-          <w:p>
-            <w:pPr>
-              <w:spacing w:after="0"/>
-            </w:pPr>
-            <w:r>
-              <w:rPr>
-                <w:sz w:val="18"/>
-              </w:rPr>
-              <w:t>[preencher]</w:t>
-            </w:r>
-          </w:p>
-        </w:tc>
-        <w:tc>
-          <w:tcPr>
-            <w:tcW w:type="dxa" w:w="6480"/>
-            <w:vAlign w:val="center"/>
-            <w:tcMar>
-              <w:top w:w="100" w:type="dxa"/>
-              <w:start w:w="120" w:type="dxa"/>
-              <w:bottom w:w="100" w:type="dxa"/>
-              <w:end w:w="120" w:type="dxa"/>
-            </w:tcMar>
-            <w:shd w:fill="EAF1F8"/>
-          </w:tcPr>
-          <w:p>
-            <w:pPr>
-              <w:spacing w:after="0"/>
-            </w:pPr>
-            <w:r>
-              <w:rPr>
-                <w:sz w:val="18"/>
-              </w:rPr>
-              <w:t>Arquitetura TO-BE, ADRs e contratos OpenAPI/AsyncAPI</w:t>
-            </w:r>
-          </w:p>
-        </w:tc>
-      </w:tr>
-      <w:tr>
-        <w:tc>
-          <w:tcPr>
-            <w:tcW w:type="dxa" w:w="3168"/>
-            <w:vAlign w:val="center"/>
-            <w:tcMar>
-              <w:top w:w="100" w:type="dxa"/>
-              <w:start w:w="120" w:type="dxa"/>
-              <w:bottom w:w="100" w:type="dxa"/>
-              <w:end w:w="120" w:type="dxa"/>
-            </w:tcMar>
-          </w:tcPr>
-          <w:p>
-            <w:pPr>
-              <w:spacing w:after="0"/>
-            </w:pPr>
-            <w:r>
-              <w:rPr>
-                <w:sz w:val="18"/>
-              </w:rPr>
-              <w:t>[preencher]</w:t>
-            </w:r>
-          </w:p>
-        </w:tc>
-        <w:tc>
-          <w:tcPr>
-            <w:tcW w:type="dxa" w:w="6480"/>
-            <w:vAlign w:val="center"/>
-            <w:tcMar>
-              <w:top w:w="100" w:type="dxa"/>
-              <w:start w:w="120" w:type="dxa"/>
-              <w:bottom w:w="100" w:type="dxa"/>
-              <w:end w:w="120" w:type="dxa"/>
-            </w:tcMar>
-          </w:tcPr>
-          <w:p>
-            <w:pPr>
-              <w:spacing w:after="0"/>
-            </w:pPr>
-            <w:r>
-              <w:rPr>
-                <w:sz w:val="18"/>
-              </w:rPr>
-              <w:t>Implementação dos contextos e testes automatizados</w:t>
-            </w:r>
-          </w:p>
-        </w:tc>
-      </w:tr>
-      <w:tr>
-        <w:tc>
-          <w:tcPr>
-            <w:tcW w:type="dxa" w:w="3168"/>
-            <w:vAlign w:val="center"/>
-            <w:tcMar>
-              <w:top w:w="100" w:type="dxa"/>
-              <w:start w:w="120" w:type="dxa"/>
-              <w:bottom w:w="100" w:type="dxa"/>
-              <w:end w:w="120" w:type="dxa"/>
-            </w:tcMar>
-            <w:shd w:fill="EAF1F8"/>
-          </w:tcPr>
-          <w:p>
-            <w:pPr>
-              <w:spacing w:after="0"/>
-            </w:pPr>
-            <w:r>
-              <w:rPr>
-                <w:sz w:val="18"/>
-              </w:rPr>
-              <w:t>[preencher]</w:t>
-            </w:r>
-          </w:p>
-        </w:tc>
-        <w:tc>
-          <w:tcPr>
-            <w:tcW w:type="dxa" w:w="6480"/>
-            <w:vAlign w:val="center"/>
-            <w:tcMar>
-              <w:top w:w="100" w:type="dxa"/>
-              <w:start w:w="120" w:type="dxa"/>
-              <w:bottom w:w="100" w:type="dxa"/>
-              <w:end w:w="120" w:type="dxa"/>
-            </w:tcMar>
-            <w:shd w:fill="EAF1F8"/>
-          </w:tcPr>
-          <w:p>
-            <w:pPr>
-              <w:spacing w:after="0"/>
-            </w:pPr>
-            <w:r>
-              <w:rPr>
-                <w:sz w:val="18"/>
-              </w:rPr>
-              <w:t>Interface web, demonstração e relatório</w:t>
-            </w:r>
-          </w:p>
-        </w:tc>
-      </w:tr>
-    </w:tbl>
-    <w:p>
-      <w:pPr>
-        <w:spacing w:after="40"/>
-      </w:pPr>
-    </w:p>
     <w:p>
       <w:pPr>
         <w:spacing w:after="160" w:line="276" w:lineRule="auto"/>
         <w:jc w:val="both"/>
       </w:pPr>
       <w:r>
-        <w:t>Os nomes e a divisão definitiva das contribuições serão confirmados pela equipe antes da submissão; as linhas acima indicam as frentes de trabalho do backlog.</w:t>
+        <w:t>Os nomes dos integrantes e suas contribuições individuais não foram informados. Essa informação é necessária para cumprir o item Participantes do Guia (ARCHCORP, 2026a, p. 11) e permanece pendente antes da submissão. As frentes de requisitos, arquitetura, implementação, testes e comunicação técnica descrevem atividades do projeto, sem atribuição individual comprovada. O histórico de commits não substitui a declaração de autoria e de contribuição pela equipe.</w:t>
       </w:r>
     </w:p>
     <w:p>
@@ -734,7 +468,7 @@
       <w:tblPr>
         <w:tblW w:type="auto" w:w="0"/>
         <w:jc w:val="center"/>
-        <w:tblLayout w:type="autofit"/>
+        <w:tblLayout w:type="fixed"/>
         <w:tblLook w:firstColumn="1" w:firstRow="1" w:lastColumn="0" w:lastRow="0" w:noHBand="0" w:noVBand="1" w:val="04A0"/>
         <w:tblBorders>
           <w:top w:val="single" w:sz="4" w:color="D9D9D9"/>
@@ -746,12 +480,13 @@
         </w:tblBorders>
       </w:tblPr>
       <w:tblGrid>
-        <w:gridCol w:w="4968"/>
-        <w:gridCol w:w="4968"/>
+        <w:gridCol w:w="2880"/>
+        <w:gridCol w:w="6768"/>
       </w:tblGrid>
       <w:tr>
         <w:trPr>
           <w:tblHeader/>
+          <w:cantSplit/>
         </w:trPr>
         <w:tc>
           <w:tcPr>
@@ -799,6 +534,9 @@
         </w:tc>
       </w:tr>
       <w:tr>
+        <w:trPr>
+          <w:cantSplit/>
+        </w:trPr>
         <w:tc>
           <w:tcPr>
             <w:tcW w:type="dxa" w:w="2880"/>
@@ -847,6 +585,9 @@
         </w:tc>
       </w:tr>
       <w:tr>
+        <w:trPr>
+          <w:cantSplit/>
+        </w:trPr>
         <w:tc>
           <w:tcPr>
             <w:tcW w:type="dxa" w:w="2880"/>
@@ -897,6 +638,9 @@
         </w:tc>
       </w:tr>
       <w:tr>
+        <w:trPr>
+          <w:cantSplit/>
+        </w:trPr>
         <w:tc>
           <w:tcPr>
             <w:tcW w:type="dxa" w:w="2880"/>
@@ -945,6 +689,9 @@
         </w:tc>
       </w:tr>
       <w:tr>
+        <w:trPr>
+          <w:cantSplit/>
+        </w:trPr>
         <w:tc>
           <w:tcPr>
             <w:tcW w:type="dxa" w:w="2880"/>
@@ -995,6 +742,9 @@
         </w:tc>
       </w:tr>
       <w:tr>
+        <w:trPr>
+          <w:cantSplit/>
+        </w:trPr>
         <w:tc>
           <w:tcPr>
             <w:tcW w:type="dxa" w:w="2880"/>
@@ -1043,6 +793,9 @@
         </w:tc>
       </w:tr>
       <w:tr>
+        <w:trPr>
+          <w:cantSplit/>
+        </w:trPr>
         <w:tc>
           <w:tcPr>
             <w:tcW w:type="dxa" w:w="2880"/>
@@ -1093,6 +846,9 @@
         </w:tc>
       </w:tr>
       <w:tr>
+        <w:trPr>
+          <w:cantSplit/>
+        </w:trPr>
         <w:tc>
           <w:tcPr>
             <w:tcW w:type="dxa" w:w="2880"/>
@@ -1158,7 +914,7 @@
       <w:tblPr>
         <w:tblW w:type="auto" w:w="0"/>
         <w:jc w:val="center"/>
-        <w:tblLayout w:type="autofit"/>
+        <w:tblLayout w:type="fixed"/>
         <w:tblLook w:firstColumn="1" w:firstRow="1" w:lastColumn="0" w:lastRow="0" w:noHBand="0" w:noVBand="1" w:val="04A0"/>
         <w:tblBorders>
           <w:top w:val="single" w:sz="4" w:color="D9D9D9"/>
@@ -1170,12 +926,13 @@
         </w:tblBorders>
       </w:tblPr>
       <w:tblGrid>
-        <w:gridCol w:w="4968"/>
-        <w:gridCol w:w="4968"/>
+        <w:gridCol w:w="2880"/>
+        <w:gridCol w:w="6768"/>
       </w:tblGrid>
       <w:tr>
         <w:trPr>
           <w:tblHeader/>
+          <w:cantSplit/>
         </w:trPr>
         <w:tc>
           <w:tcPr>
@@ -1223,6 +980,9 @@
         </w:tc>
       </w:tr>
       <w:tr>
+        <w:trPr>
+          <w:cantSplit/>
+        </w:trPr>
         <w:tc>
           <w:tcPr>
             <w:tcW w:type="dxa" w:w="2880"/>
@@ -1271,6 +1031,9 @@
         </w:tc>
       </w:tr>
       <w:tr>
+        <w:trPr>
+          <w:cantSplit/>
+        </w:trPr>
         <w:tc>
           <w:tcPr>
             <w:tcW w:type="dxa" w:w="2880"/>
@@ -1321,6 +1084,9 @@
         </w:tc>
       </w:tr>
       <w:tr>
+        <w:trPr>
+          <w:cantSplit/>
+        </w:trPr>
         <w:tc>
           <w:tcPr>
             <w:tcW w:type="dxa" w:w="2880"/>
@@ -1369,6 +1135,9 @@
         </w:tc>
       </w:tr>
       <w:tr>
+        <w:trPr>
+          <w:cantSplit/>
+        </w:trPr>
         <w:tc>
           <w:tcPr>
             <w:tcW w:type="dxa" w:w="2880"/>
@@ -1419,6 +1188,9 @@
         </w:tc>
       </w:tr>
       <w:tr>
+        <w:trPr>
+          <w:cantSplit/>
+        </w:trPr>
         <w:tc>
           <w:tcPr>
             <w:tcW w:type="dxa" w:w="2880"/>
@@ -1467,6 +1239,9 @@
         </w:tc>
       </w:tr>
       <w:tr>
+        <w:trPr>
+          <w:cantSplit/>
+        </w:trPr>
         <w:tc>
           <w:tcPr>
             <w:tcW w:type="dxa" w:w="2880"/>
@@ -1517,6 +1292,9 @@
         </w:tc>
       </w:tr>
       <w:tr>
+        <w:trPr>
+          <w:cantSplit/>
+        </w:trPr>
         <w:tc>
           <w:tcPr>
             <w:tcW w:type="dxa" w:w="2880"/>
@@ -1573,6 +1351,7 @@
     <w:p>
       <w:pPr>
         <w:pStyle w:val="Heading2"/>
+        <w:pageBreakBefore/>
       </w:pPr>
       <w:r>
         <w:t>3.4 Procedimentos metodológicos</w:t>
@@ -1584,7 +1363,16 @@
         <w:jc w:val="both"/>
       </w:pPr>
       <w:r>
-        <w:t>O trabalho seguiu o cronograma de 14 semanas em sete quinzenas: escopo; requisitos e AS-IS; TO-BE e contratos; fundação e CRM; reservas e contratos; financeiro, atendimento e workflow; e qualidade, relatório e apresentação. Cada mudança relacionou requisito, decisão, implementação e evidência na matriz de rastreabilidade. O enunciado prevaleceu sobre premissas, e detalhes organizacionais ausentes foram registrados como hipóteses a validar.</w:t>
+        <w:t>Os procedimentos compreenderam análise do escopo, levantamento de requisitos e AS-IS, modelagem TO-BE e contratos, implementação dos contextos e avaliação dos fluxos e atributos de qualidade. A matriz de rastreabilidade relaciona requisito, decisão, implementação e evidência. O enunciado prevalece sobre premissas, e detalhes organizacionais ausentes permanecem como hipóteses a validar.</w:t>
+      </w:r>
+    </w:p>
+    <w:p>
+      <w:pPr>
+        <w:spacing w:after="160" w:line="276" w:lineRule="auto"/>
+        <w:jc w:val="both"/>
+      </w:pPr>
+      <w:r>
+        <w:t>O recorte documental é 28 de outubro de 2026, com referência técnica na main f1669d7 (PR #75, 25/10/2026). O planejamento estabelece a entrega pronta em 09/11/2026 e a apresentação em 23/11/2026. Esses marcos são compromissos previstos, sem declaração de submissão, apresentação realizada ou aceite docente. A conclusão formal depende também da identificação dos participantes e de suas contribuições.</w:t>
       </w:r>
     </w:p>
     <w:p>
@@ -1616,6 +1404,7 @@
     </w:p>
     <w:p>
       <w:pPr>
+        <w:keepNext/>
         <w:spacing w:after="40"/>
         <w:jc w:val="center"/>
       </w:pPr>
@@ -1671,7 +1460,7 @@
       <w:tblPr>
         <w:tblW w:type="auto" w:w="0"/>
         <w:jc w:val="center"/>
-        <w:tblLayout w:type="autofit"/>
+        <w:tblLayout w:type="fixed"/>
         <w:tblLook w:firstColumn="1" w:firstRow="1" w:lastColumn="0" w:lastRow="0" w:noHBand="0" w:noVBand="1" w:val="04A0"/>
         <w:tblBorders>
           <w:top w:val="single" w:sz="4" w:color="D9D9D9"/>
@@ -1683,13 +1472,14 @@
         </w:tblBorders>
       </w:tblPr>
       <w:tblGrid>
-        <w:gridCol w:w="3312"/>
-        <w:gridCol w:w="3312"/>
-        <w:gridCol w:w="3312"/>
+        <w:gridCol w:w="2304"/>
+        <w:gridCol w:w="2448"/>
+        <w:gridCol w:w="4896"/>
       </w:tblGrid>
       <w:tr>
         <w:trPr>
           <w:tblHeader/>
+          <w:cantSplit/>
         </w:trPr>
         <w:tc>
           <w:tcPr>
@@ -1759,6 +1549,9 @@
         </w:tc>
       </w:tr>
       <w:tr>
+        <w:trPr>
+          <w:cantSplit/>
+        </w:trPr>
         <w:tc>
           <w:tcPr>
             <w:tcW w:type="dxa" w:w="2304"/>
@@ -1830,6 +1623,9 @@
         </w:tc>
       </w:tr>
       <w:tr>
+        <w:trPr>
+          <w:cantSplit/>
+        </w:trPr>
         <w:tc>
           <w:tcPr>
             <w:tcW w:type="dxa" w:w="2304"/>
@@ -1904,6 +1700,9 @@
         </w:tc>
       </w:tr>
       <w:tr>
+        <w:trPr>
+          <w:cantSplit/>
+        </w:trPr>
         <w:tc>
           <w:tcPr>
             <w:tcW w:type="dxa" w:w="2304"/>
@@ -1975,6 +1774,9 @@
         </w:tc>
       </w:tr>
       <w:tr>
+        <w:trPr>
+          <w:cantSplit/>
+        </w:trPr>
         <w:tc>
           <w:tcPr>
             <w:tcW w:type="dxa" w:w="2304"/>
@@ -2049,6 +1851,9 @@
         </w:tc>
       </w:tr>
       <w:tr>
+        <w:trPr>
+          <w:cantSplit/>
+        </w:trPr>
         <w:tc>
           <w:tcPr>
             <w:tcW w:type="dxa" w:w="2304"/>
@@ -2137,7 +1942,7 @@
       <w:tblPr>
         <w:tblW w:type="auto" w:w="0"/>
         <w:jc w:val="center"/>
-        <w:tblLayout w:type="autofit"/>
+        <w:tblLayout w:type="fixed"/>
         <w:tblLook w:firstColumn="1" w:firstRow="1" w:lastColumn="0" w:lastRow="0" w:noHBand="0" w:noVBand="1" w:val="04A0"/>
         <w:tblBorders>
           <w:top w:val="single" w:sz="4" w:color="D9D9D9"/>
@@ -2149,15 +1954,16 @@
         </w:tblBorders>
       </w:tblPr>
       <w:tblGrid>
-        <w:gridCol w:w="1987"/>
-        <w:gridCol w:w="1987"/>
-        <w:gridCol w:w="1987"/>
-        <w:gridCol w:w="1987"/>
-        <w:gridCol w:w="1987"/>
+        <w:gridCol w:w="1080"/>
+        <w:gridCol w:w="1656"/>
+        <w:gridCol w:w="1800"/>
+        <w:gridCol w:w="2376"/>
+        <w:gridCol w:w="2736"/>
       </w:tblGrid>
       <w:tr>
         <w:trPr>
           <w:tblHeader/>
+          <w:cantSplit/>
         </w:trPr>
         <w:tc>
           <w:tcPr>
@@ -2271,6 +2077,9 @@
         </w:tc>
       </w:tr>
       <w:tr>
+        <w:trPr>
+          <w:cantSplit/>
+        </w:trPr>
         <w:tc>
           <w:tcPr>
             <w:tcW w:type="dxa" w:w="1080"/>
@@ -2388,6 +2197,9 @@
         </w:tc>
       </w:tr>
       <w:tr>
+        <w:trPr>
+          <w:cantSplit/>
+        </w:trPr>
         <w:tc>
           <w:tcPr>
             <w:tcW w:type="dxa" w:w="1080"/>
@@ -2510,6 +2322,9 @@
         </w:tc>
       </w:tr>
       <w:tr>
+        <w:trPr>
+          <w:cantSplit/>
+        </w:trPr>
         <w:tc>
           <w:tcPr>
             <w:tcW w:type="dxa" w:w="1080"/>
@@ -2627,6 +2442,9 @@
         </w:tc>
       </w:tr>
       <w:tr>
+        <w:trPr>
+          <w:cantSplit/>
+        </w:trPr>
         <w:tc>
           <w:tcPr>
             <w:tcW w:type="dxa" w:w="1080"/>
@@ -2749,6 +2567,9 @@
         </w:tc>
       </w:tr>
       <w:tr>
+        <w:trPr>
+          <w:cantSplit/>
+        </w:trPr>
         <w:tc>
           <w:tcPr>
             <w:tcW w:type="dxa" w:w="1080"/>
@@ -2949,7 +2770,7 @@
       <w:tblPr>
         <w:tblW w:type="auto" w:w="0"/>
         <w:jc w:val="center"/>
-        <w:tblLayout w:type="autofit"/>
+        <w:tblLayout w:type="fixed"/>
         <w:tblLook w:firstColumn="1" w:firstRow="1" w:lastColumn="0" w:lastRow="0" w:noHBand="0" w:noVBand="1" w:val="04A0"/>
         <w:tblBorders>
           <w:top w:val="single" w:sz="4" w:color="D9D9D9"/>
@@ -2961,13 +2782,14 @@
         </w:tblBorders>
       </w:tblPr>
       <w:tblGrid>
-        <w:gridCol w:w="3312"/>
-        <w:gridCol w:w="3312"/>
-        <w:gridCol w:w="3312"/>
+        <w:gridCol w:w="1008"/>
+        <w:gridCol w:w="3456"/>
+        <w:gridCol w:w="5184"/>
       </w:tblGrid>
       <w:tr>
         <w:trPr>
           <w:tblHeader/>
+          <w:cantSplit/>
         </w:trPr>
         <w:tc>
           <w:tcPr>
@@ -3037,6 +2859,9 @@
         </w:tc>
       </w:tr>
       <w:tr>
+        <w:trPr>
+          <w:cantSplit/>
+        </w:trPr>
         <w:tc>
           <w:tcPr>
             <w:tcW w:type="dxa" w:w="1008"/>
@@ -3108,6 +2933,9 @@
         </w:tc>
       </w:tr>
       <w:tr>
+        <w:trPr>
+          <w:cantSplit/>
+        </w:trPr>
         <w:tc>
           <w:tcPr>
             <w:tcW w:type="dxa" w:w="1008"/>
@@ -3182,6 +3010,9 @@
         </w:tc>
       </w:tr>
       <w:tr>
+        <w:trPr>
+          <w:cantSplit/>
+        </w:trPr>
         <w:tc>
           <w:tcPr>
             <w:tcW w:type="dxa" w:w="1008"/>
@@ -3253,6 +3084,9 @@
         </w:tc>
       </w:tr>
       <w:tr>
+        <w:trPr>
+          <w:cantSplit/>
+        </w:trPr>
         <w:tc>
           <w:tcPr>
             <w:tcW w:type="dxa" w:w="1008"/>
@@ -3327,6 +3161,9 @@
         </w:tc>
       </w:tr>
       <w:tr>
+        <w:trPr>
+          <w:cantSplit/>
+        </w:trPr>
         <w:tc>
           <w:tcPr>
             <w:tcW w:type="dxa" w:w="1008"/>
@@ -3398,6 +3235,9 @@
         </w:tc>
       </w:tr>
       <w:tr>
+        <w:trPr>
+          <w:cantSplit/>
+        </w:trPr>
         <w:tc>
           <w:tcPr>
             <w:tcW w:type="dxa" w:w="1008"/>
@@ -3472,6 +3312,9 @@
         </w:tc>
       </w:tr>
       <w:tr>
+        <w:trPr>
+          <w:cantSplit/>
+        </w:trPr>
         <w:tc>
           <w:tcPr>
             <w:tcW w:type="dxa" w:w="1008"/>
@@ -3560,7 +3403,7 @@
       <w:tblPr>
         <w:tblW w:type="auto" w:w="0"/>
         <w:jc w:val="center"/>
-        <w:tblLayout w:type="autofit"/>
+        <w:tblLayout w:type="fixed"/>
         <w:tblLook w:firstColumn="1" w:firstRow="1" w:lastColumn="0" w:lastRow="0" w:noHBand="0" w:noVBand="1" w:val="04A0"/>
         <w:tblBorders>
           <w:top w:val="single" w:sz="4" w:color="D9D9D9"/>
@@ -3572,14 +3415,15 @@
         </w:tblBorders>
       </w:tblPr>
       <w:tblGrid>
-        <w:gridCol w:w="2484"/>
-        <w:gridCol w:w="2484"/>
-        <w:gridCol w:w="2484"/>
-        <w:gridCol w:w="2484"/>
+        <w:gridCol w:w="1008"/>
+        <w:gridCol w:w="2736"/>
+        <w:gridCol w:w="1152"/>
+        <w:gridCol w:w="4752"/>
       </w:tblGrid>
       <w:tr>
         <w:trPr>
           <w:tblHeader/>
+          <w:cantSplit/>
         </w:trPr>
         <w:tc>
           <w:tcPr>
@@ -3671,6 +3515,9 @@
         </w:tc>
       </w:tr>
       <w:tr>
+        <w:trPr>
+          <w:cantSplit/>
+        </w:trPr>
         <w:tc>
           <w:tcPr>
             <w:tcW w:type="dxa" w:w="1008"/>
@@ -3765,6 +3612,9 @@
         </w:tc>
       </w:tr>
       <w:tr>
+        <w:trPr>
+          <w:cantSplit/>
+        </w:trPr>
         <w:tc>
           <w:tcPr>
             <w:tcW w:type="dxa" w:w="1008"/>
@@ -3863,6 +3713,9 @@
         </w:tc>
       </w:tr>
       <w:tr>
+        <w:trPr>
+          <w:cantSplit/>
+        </w:trPr>
         <w:tc>
           <w:tcPr>
             <w:tcW w:type="dxa" w:w="1008"/>
@@ -3957,6 +3810,9 @@
         </w:tc>
       </w:tr>
       <w:tr>
+        <w:trPr>
+          <w:cantSplit/>
+        </w:trPr>
         <w:tc>
           <w:tcPr>
             <w:tcW w:type="dxa" w:w="1008"/>
@@ -4055,6 +3911,9 @@
         </w:tc>
       </w:tr>
       <w:tr>
+        <w:trPr>
+          <w:cantSplit/>
+        </w:trPr>
         <w:tc>
           <w:tcPr>
             <w:tcW w:type="dxa" w:w="1008"/>
@@ -4149,6 +4008,9 @@
         </w:tc>
       </w:tr>
       <w:tr>
+        <w:trPr>
+          <w:cantSplit/>
+        </w:trPr>
         <w:tc>
           <w:tcPr>
             <w:tcW w:type="dxa" w:w="1008"/>
@@ -4247,6 +4109,9 @@
         </w:tc>
       </w:tr>
       <w:tr>
+        <w:trPr>
+          <w:cantSplit/>
+        </w:trPr>
         <w:tc>
           <w:tcPr>
             <w:tcW w:type="dxa" w:w="1008"/>
@@ -4341,6 +4206,9 @@
         </w:tc>
       </w:tr>
       <w:tr>
+        <w:trPr>
+          <w:cantSplit/>
+        </w:trPr>
         <w:tc>
           <w:tcPr>
             <w:tcW w:type="dxa" w:w="1008"/>
@@ -4439,6 +4307,9 @@
         </w:tc>
       </w:tr>
       <w:tr>
+        <w:trPr>
+          <w:cantSplit/>
+        </w:trPr>
         <w:tc>
           <w:tcPr>
             <w:tcW w:type="dxa" w:w="1008"/>
@@ -4566,6 +4437,7 @@
     </w:p>
     <w:p>
       <w:pPr>
+        <w:keepNext/>
         <w:spacing w:after="40"/>
         <w:jc w:val="center"/>
       </w:pPr>
@@ -4621,7 +4493,7 @@
       <w:tblPr>
         <w:tblW w:type="auto" w:w="0"/>
         <w:jc w:val="center"/>
-        <w:tblLayout w:type="autofit"/>
+        <w:tblLayout w:type="fixed"/>
         <w:tblLook w:firstColumn="1" w:firstRow="1" w:lastColumn="0" w:lastRow="0" w:noHBand="0" w:noVBand="1" w:val="04A0"/>
         <w:tblBorders>
           <w:top w:val="single" w:sz="4" w:color="D9D9D9"/>
@@ -4633,13 +4505,14 @@
         </w:tblBorders>
       </w:tblPr>
       <w:tblGrid>
-        <w:gridCol w:w="3312"/>
-        <w:gridCol w:w="3312"/>
-        <w:gridCol w:w="3312"/>
+        <w:gridCol w:w="1584"/>
+        <w:gridCol w:w="3456"/>
+        <w:gridCol w:w="4608"/>
       </w:tblGrid>
       <w:tr>
         <w:trPr>
           <w:tblHeader/>
+          <w:cantSplit/>
         </w:trPr>
         <w:tc>
           <w:tcPr>
@@ -4709,6 +4582,9 @@
         </w:tc>
       </w:tr>
       <w:tr>
+        <w:trPr>
+          <w:cantSplit/>
+        </w:trPr>
         <w:tc>
           <w:tcPr>
             <w:tcW w:type="dxa" w:w="1584"/>
@@ -4780,6 +4656,9 @@
         </w:tc>
       </w:tr>
       <w:tr>
+        <w:trPr>
+          <w:cantSplit/>
+        </w:trPr>
         <w:tc>
           <w:tcPr>
             <w:tcW w:type="dxa" w:w="1584"/>
@@ -4854,6 +4733,9 @@
         </w:tc>
       </w:tr>
       <w:tr>
+        <w:trPr>
+          <w:cantSplit/>
+        </w:trPr>
         <w:tc>
           <w:tcPr>
             <w:tcW w:type="dxa" w:w="1584"/>
@@ -4925,6 +4807,9 @@
         </w:tc>
       </w:tr>
       <w:tr>
+        <w:trPr>
+          <w:cantSplit/>
+        </w:trPr>
         <w:tc>
           <w:tcPr>
             <w:tcW w:type="dxa" w:w="1584"/>
@@ -4999,6 +4884,9 @@
         </w:tc>
       </w:tr>
       <w:tr>
+        <w:trPr>
+          <w:cantSplit/>
+        </w:trPr>
         <w:tc>
           <w:tcPr>
             <w:tcW w:type="dxa" w:w="1584"/>
@@ -5070,6 +4958,9 @@
         </w:tc>
       </w:tr>
       <w:tr>
+        <w:trPr>
+          <w:cantSplit/>
+        </w:trPr>
         <w:tc>
           <w:tcPr>
             <w:tcW w:type="dxa" w:w="1584"/>
@@ -5168,6 +5059,7 @@
     </w:p>
     <w:p>
       <w:pPr>
+        <w:keepNext/>
         <w:spacing w:after="40"/>
         <w:jc w:val="center"/>
       </w:pPr>
@@ -5223,7 +5115,7 @@
       <w:tblPr>
         <w:tblW w:type="auto" w:w="0"/>
         <w:jc w:val="center"/>
-        <w:tblLayout w:type="autofit"/>
+        <w:tblLayout w:type="fixed"/>
         <w:tblLook w:firstColumn="1" w:firstRow="1" w:lastColumn="0" w:lastRow="0" w:noHBand="0" w:noVBand="1" w:val="04A0"/>
         <w:tblBorders>
           <w:top w:val="single" w:sz="4" w:color="D9D9D9"/>
@@ -5235,13 +5127,14 @@
         </w:tblBorders>
       </w:tblPr>
       <w:tblGrid>
-        <w:gridCol w:w="3312"/>
-        <w:gridCol w:w="3312"/>
-        <w:gridCol w:w="3312"/>
+        <w:gridCol w:w="1656"/>
+        <w:gridCol w:w="3744"/>
+        <w:gridCol w:w="4248"/>
       </w:tblGrid>
       <w:tr>
         <w:trPr>
           <w:tblHeader/>
+          <w:cantSplit/>
         </w:trPr>
         <w:tc>
           <w:tcPr>
@@ -5311,6 +5204,9 @@
         </w:tc>
       </w:tr>
       <w:tr>
+        <w:trPr>
+          <w:cantSplit/>
+        </w:trPr>
         <w:tc>
           <w:tcPr>
             <w:tcW w:type="dxa" w:w="1656"/>
@@ -5382,6 +5278,9 @@
         </w:tc>
       </w:tr>
       <w:tr>
+        <w:trPr>
+          <w:cantSplit/>
+        </w:trPr>
         <w:tc>
           <w:tcPr>
             <w:tcW w:type="dxa" w:w="1656"/>
@@ -5456,6 +5355,9 @@
         </w:tc>
       </w:tr>
       <w:tr>
+        <w:trPr>
+          <w:cantSplit/>
+        </w:trPr>
         <w:tc>
           <w:tcPr>
             <w:tcW w:type="dxa" w:w="1656"/>
@@ -5527,6 +5429,9 @@
         </w:tc>
       </w:tr>
       <w:tr>
+        <w:trPr>
+          <w:cantSplit/>
+        </w:trPr>
         <w:tc>
           <w:tcPr>
             <w:tcW w:type="dxa" w:w="1656"/>
@@ -5637,7 +5542,7 @@
         <w:jc w:val="both"/>
       </w:pPr>
       <w:r>
-        <w:t>O protótipo simula tokens e aplica papéis por área. A validação ocorre na fronteira, e eventos não carregam documentos, dados bancários nem a descrição do chamado. Um ambiente real exigiria provedor OIDC, contas individuais e TLS; esses itens são metas, não funcionalidades demonstradas.</w:t>
+        <w:t>O protótipo aplica papéis por tokens locais e permite configurar um segredo compartilhado para o modo público. A validação ocorre na fronteira, e eventos não carregam documentos, dados bancários nem a descrição do chamado. A versão de referência compara credenciais em bytes para tratar caracteres não ASCII e limita o registro de exceções inesperadas ao tipo do erro, sem mensagem sensível nem traceback (PROJETO APLICADO 7, 2026b). Um ambiente real exigiria provedor OIDC, contas individuais e TLS verificado; esses itens não estão demonstrados.</w:t>
       </w:r>
     </w:p>
     <w:p>
@@ -5660,7 +5565,7 @@
       <w:tblPr>
         <w:tblW w:type="auto" w:w="0"/>
         <w:jc w:val="center"/>
-        <w:tblLayout w:type="autofit"/>
+        <w:tblLayout w:type="fixed"/>
         <w:tblLook w:firstColumn="1" w:firstRow="1" w:lastColumn="0" w:lastRow="0" w:noHBand="0" w:noVBand="1" w:val="04A0"/>
         <w:tblBorders>
           <w:top w:val="single" w:sz="4" w:color="D9D9D9"/>
@@ -5672,15 +5577,16 @@
         </w:tblBorders>
       </w:tblPr>
       <w:tblGrid>
-        <w:gridCol w:w="1987"/>
-        <w:gridCol w:w="1987"/>
-        <w:gridCol w:w="1987"/>
-        <w:gridCol w:w="1987"/>
-        <w:gridCol w:w="1987"/>
+        <w:gridCol w:w="1656"/>
+        <w:gridCol w:w="1512"/>
+        <w:gridCol w:w="2088"/>
+        <w:gridCol w:w="2304"/>
+        <w:gridCol w:w="2088"/>
       </w:tblGrid>
       <w:tr>
         <w:trPr>
           <w:tblHeader/>
+          <w:cantSplit/>
         </w:trPr>
         <w:tc>
           <w:tcPr>
@@ -5794,6 +5700,9 @@
         </w:tc>
       </w:tr>
       <w:tr>
+        <w:trPr>
+          <w:cantSplit/>
+        </w:trPr>
         <w:tc>
           <w:tcPr>
             <w:tcW w:type="dxa" w:w="1656"/>
@@ -5911,6 +5820,9 @@
         </w:tc>
       </w:tr>
       <w:tr>
+        <w:trPr>
+          <w:cantSplit/>
+        </w:trPr>
         <w:tc>
           <w:tcPr>
             <w:tcW w:type="dxa" w:w="1656"/>
@@ -6033,6 +5945,9 @@
         </w:tc>
       </w:tr>
       <w:tr>
+        <w:trPr>
+          <w:cantSplit/>
+        </w:trPr>
         <w:tc>
           <w:tcPr>
             <w:tcW w:type="dxa" w:w="1656"/>
@@ -6150,6 +6065,9 @@
         </w:tc>
       </w:tr>
       <w:tr>
+        <w:trPr>
+          <w:cantSplit/>
+        </w:trPr>
         <w:tc>
           <w:tcPr>
             <w:tcW w:type="dxa" w:w="1656"/>
@@ -6272,6 +6190,9 @@
         </w:tc>
       </w:tr>
       <w:tr>
+        <w:trPr>
+          <w:cantSplit/>
+        </w:trPr>
         <w:tc>
           <w:tcPr>
             <w:tcW w:type="dxa" w:w="1656"/>
@@ -6488,6 +6409,7 @@
     </w:p>
     <w:p>
       <w:pPr>
+        <w:keepNext/>
         <w:spacing w:after="40"/>
         <w:jc w:val="center"/>
       </w:pPr>
@@ -6543,7 +6465,7 @@
       <w:tblPr>
         <w:tblW w:type="auto" w:w="0"/>
         <w:jc w:val="center"/>
-        <w:tblLayout w:type="autofit"/>
+        <w:tblLayout w:type="fixed"/>
         <w:tblLook w:firstColumn="1" w:firstRow="1" w:lastColumn="0" w:lastRow="0" w:noHBand="0" w:noVBand="1" w:val="04A0"/>
         <w:tblBorders>
           <w:top w:val="single" w:sz="4" w:color="D9D9D9"/>
@@ -6555,12 +6477,13 @@
         </w:tblBorders>
       </w:tblPr>
       <w:tblGrid>
-        <w:gridCol w:w="4968"/>
-        <w:gridCol w:w="4968"/>
+        <w:gridCol w:w="2160"/>
+        <w:gridCol w:w="7488"/>
       </w:tblGrid>
       <w:tr>
         <w:trPr>
           <w:tblHeader/>
+          <w:cantSplit/>
         </w:trPr>
         <w:tc>
           <w:tcPr>
@@ -6608,6 +6531,9 @@
         </w:tc>
       </w:tr>
       <w:tr>
+        <w:trPr>
+          <w:cantSplit/>
+        </w:trPr>
         <w:tc>
           <w:tcPr>
             <w:tcW w:type="dxa" w:w="2160"/>
@@ -6656,6 +6582,9 @@
         </w:tc>
       </w:tr>
       <w:tr>
+        <w:trPr>
+          <w:cantSplit/>
+        </w:trPr>
         <w:tc>
           <w:tcPr>
             <w:tcW w:type="dxa" w:w="2160"/>
@@ -6706,6 +6635,9 @@
         </w:tc>
       </w:tr>
       <w:tr>
+        <w:trPr>
+          <w:cantSplit/>
+        </w:trPr>
         <w:tc>
           <w:tcPr>
             <w:tcW w:type="dxa" w:w="2160"/>
@@ -6754,6 +6686,9 @@
         </w:tc>
       </w:tr>
       <w:tr>
+        <w:trPr>
+          <w:cantSplit/>
+        </w:trPr>
         <w:tc>
           <w:tcPr>
             <w:tcW w:type="dxa" w:w="2160"/>
@@ -6804,6 +6739,9 @@
         </w:tc>
       </w:tr>
       <w:tr>
+        <w:trPr>
+          <w:cantSplit/>
+        </w:trPr>
         <w:tc>
           <w:tcPr>
             <w:tcW w:type="dxa" w:w="2160"/>
@@ -6852,6 +6790,9 @@
         </w:tc>
       </w:tr>
       <w:tr>
+        <w:trPr>
+          <w:cantSplit/>
+        </w:trPr>
         <w:tc>
           <w:tcPr>
             <w:tcW w:type="dxa" w:w="2160"/>
@@ -6902,6 +6843,9 @@
         </w:tc>
       </w:tr>
       <w:tr>
+        <w:trPr>
+          <w:cantSplit/>
+        </w:trPr>
         <w:tc>
           <w:tcPr>
             <w:tcW w:type="dxa" w:w="2160"/>
@@ -6965,6 +6909,7 @@
     </w:p>
     <w:p>
       <w:pPr>
+        <w:keepNext/>
         <w:spacing w:after="40"/>
         <w:jc w:val="center"/>
       </w:pPr>
@@ -7020,7 +6965,7 @@
       <w:tblPr>
         <w:tblW w:type="auto" w:w="0"/>
         <w:jc w:val="center"/>
-        <w:tblLayout w:type="autofit"/>
+        <w:tblLayout w:type="fixed"/>
         <w:tblLook w:firstColumn="1" w:firstRow="1" w:lastColumn="0" w:lastRow="0" w:noHBand="0" w:noVBand="1" w:val="04A0"/>
         <w:tblBorders>
           <w:top w:val="single" w:sz="4" w:color="D9D9D9"/>
@@ -7032,12 +6977,13 @@
         </w:tblBorders>
       </w:tblPr>
       <w:tblGrid>
-        <w:gridCol w:w="4968"/>
-        <w:gridCol w:w="4968"/>
+        <w:gridCol w:w="2160"/>
+        <w:gridCol w:w="7488"/>
       </w:tblGrid>
       <w:tr>
         <w:trPr>
           <w:tblHeader/>
+          <w:cantSplit/>
         </w:trPr>
         <w:tc>
           <w:tcPr>
@@ -7085,6 +7031,9 @@
         </w:tc>
       </w:tr>
       <w:tr>
+        <w:trPr>
+          <w:cantSplit/>
+        </w:trPr>
         <w:tc>
           <w:tcPr>
             <w:tcW w:type="dxa" w:w="2160"/>
@@ -7133,6 +7082,9 @@
         </w:tc>
       </w:tr>
       <w:tr>
+        <w:trPr>
+          <w:cantSplit/>
+        </w:trPr>
         <w:tc>
           <w:tcPr>
             <w:tcW w:type="dxa" w:w="2160"/>
@@ -7183,6 +7135,9 @@
         </w:tc>
       </w:tr>
       <w:tr>
+        <w:trPr>
+          <w:cantSplit/>
+        </w:trPr>
         <w:tc>
           <w:tcPr>
             <w:tcW w:type="dxa" w:w="2160"/>
@@ -7231,6 +7186,9 @@
         </w:tc>
       </w:tr>
       <w:tr>
+        <w:trPr>
+          <w:cantSplit/>
+        </w:trPr>
         <w:tc>
           <w:tcPr>
             <w:tcW w:type="dxa" w:w="2160"/>
@@ -7281,6 +7239,9 @@
         </w:tc>
       </w:tr>
       <w:tr>
+        <w:trPr>
+          <w:cantSplit/>
+        </w:trPr>
         <w:tc>
           <w:tcPr>
             <w:tcW w:type="dxa" w:w="2160"/>
@@ -7323,7 +7284,7 @@
               <w:rPr>
                 <w:sz w:val="18"/>
               </w:rPr>
-              <w:t>Três tentativas; depois FAILED com motivo; reprocessamento auditado; inbox impede duplicidade</w:t>
+              <w:t>Três tentativas; depois FAILED com motivo genérico; reprocessamento auditado; inbox impede duplicidade</w:t>
             </w:r>
           </w:p>
         </w:tc>
@@ -7344,6 +7305,7 @@
     </w:p>
     <w:p>
       <w:pPr>
+        <w:keepNext/>
         <w:spacing w:after="40"/>
         <w:jc w:val="center"/>
       </w:pPr>
@@ -7399,7 +7361,7 @@
       <w:tblPr>
         <w:tblW w:type="auto" w:w="0"/>
         <w:jc w:val="center"/>
-        <w:tblLayout w:type="autofit"/>
+        <w:tblLayout w:type="fixed"/>
         <w:tblLook w:firstColumn="1" w:firstRow="1" w:lastColumn="0" w:lastRow="0" w:noHBand="0" w:noVBand="1" w:val="04A0"/>
         <w:tblBorders>
           <w:top w:val="single" w:sz="4" w:color="D9D9D9"/>
@@ -7411,12 +7373,13 @@
         </w:tblBorders>
       </w:tblPr>
       <w:tblGrid>
-        <w:gridCol w:w="4968"/>
-        <w:gridCol w:w="4968"/>
+        <w:gridCol w:w="2160"/>
+        <w:gridCol w:w="7488"/>
       </w:tblGrid>
       <w:tr>
         <w:trPr>
           <w:tblHeader/>
+          <w:cantSplit/>
         </w:trPr>
         <w:tc>
           <w:tcPr>
@@ -7464,6 +7427,9 @@
         </w:tc>
       </w:tr>
       <w:tr>
+        <w:trPr>
+          <w:cantSplit/>
+        </w:trPr>
         <w:tc>
           <w:tcPr>
             <w:tcW w:type="dxa" w:w="2160"/>
@@ -7512,6 +7478,9 @@
         </w:tc>
       </w:tr>
       <w:tr>
+        <w:trPr>
+          <w:cantSplit/>
+        </w:trPr>
         <w:tc>
           <w:tcPr>
             <w:tcW w:type="dxa" w:w="2160"/>
@@ -7562,6 +7531,9 @@
         </w:tc>
       </w:tr>
       <w:tr>
+        <w:trPr>
+          <w:cantSplit/>
+        </w:trPr>
         <w:tc>
           <w:tcPr>
             <w:tcW w:type="dxa" w:w="2160"/>
@@ -7610,6 +7582,9 @@
         </w:tc>
       </w:tr>
       <w:tr>
+        <w:trPr>
+          <w:cantSplit/>
+        </w:trPr>
         <w:tc>
           <w:tcPr>
             <w:tcW w:type="dxa" w:w="2160"/>
@@ -7677,7 +7652,7 @@
       <w:tblPr>
         <w:tblW w:type="auto" w:w="0"/>
         <w:jc w:val="center"/>
-        <w:tblLayout w:type="autofit"/>
+        <w:tblLayout w:type="fixed"/>
         <w:tblLook w:firstColumn="1" w:firstRow="1" w:lastColumn="0" w:lastRow="0" w:noHBand="0" w:noVBand="1" w:val="04A0"/>
         <w:tblBorders>
           <w:top w:val="single" w:sz="4" w:color="D9D9D9"/>
@@ -7689,15 +7664,16 @@
         </w:tblBorders>
       </w:tblPr>
       <w:tblGrid>
-        <w:gridCol w:w="1987"/>
-        <w:gridCol w:w="1987"/>
-        <w:gridCol w:w="1987"/>
-        <w:gridCol w:w="1987"/>
-        <w:gridCol w:w="1987"/>
+        <w:gridCol w:w="1512"/>
+        <w:gridCol w:w="1800"/>
+        <w:gridCol w:w="1728"/>
+        <w:gridCol w:w="2520"/>
+        <w:gridCol w:w="2088"/>
       </w:tblGrid>
       <w:tr>
         <w:trPr>
           <w:tblHeader/>
+          <w:cantSplit/>
         </w:trPr>
         <w:tc>
           <w:tcPr>
@@ -7811,6 +7787,9 @@
         </w:tc>
       </w:tr>
       <w:tr>
+        <w:trPr>
+          <w:cantSplit/>
+        </w:trPr>
         <w:tc>
           <w:tcPr>
             <w:tcW w:type="dxa" w:w="1512"/>
@@ -7928,6 +7907,9 @@
         </w:tc>
       </w:tr>
       <w:tr>
+        <w:trPr>
+          <w:cantSplit/>
+        </w:trPr>
         <w:tc>
           <w:tcPr>
             <w:tcW w:type="dxa" w:w="1512"/>
@@ -8050,6 +8032,9 @@
         </w:tc>
       </w:tr>
       <w:tr>
+        <w:trPr>
+          <w:cantSplit/>
+        </w:trPr>
         <w:tc>
           <w:tcPr>
             <w:tcW w:type="dxa" w:w="1512"/>
@@ -8167,6 +8152,9 @@
         </w:tc>
       </w:tr>
       <w:tr>
+        <w:trPr>
+          <w:cantSplit/>
+        </w:trPr>
         <w:tc>
           <w:tcPr>
             <w:tcW w:type="dxa" w:w="1512"/>
@@ -8289,6 +8277,9 @@
         </w:tc>
       </w:tr>
       <w:tr>
+        <w:trPr>
+          <w:cantSplit/>
+        </w:trPr>
         <w:tc>
           <w:tcPr>
             <w:tcW w:type="dxa" w:w="1512"/>
@@ -8406,6 +8397,9 @@
         </w:tc>
       </w:tr>
       <w:tr>
+        <w:trPr>
+          <w:cantSplit/>
+        </w:trPr>
         <w:tc>
           <w:tcPr>
             <w:tcW w:type="dxa" w:w="1512"/>
@@ -8528,6 +8522,9 @@
         </w:tc>
       </w:tr>
       <w:tr>
+        <w:trPr>
+          <w:cantSplit/>
+        </w:trPr>
         <w:tc>
           <w:tcPr>
             <w:tcW w:type="dxa" w:w="1512"/>
@@ -8639,12 +8636,15 @@
               <w:rPr>
                 <w:sz w:val="18"/>
               </w:rPr>
-              <w:t>p95 local até 45,1 ms</w:t>
+              <w:t>p95 histórico de 45,1 ms (20/10)</w:t>
             </w:r>
           </w:p>
         </w:tc>
       </w:tr>
       <w:tr>
+        <w:trPr>
+          <w:cantSplit/>
+        </w:trPr>
         <w:tc>
           <w:tcPr>
             <w:tcW w:type="dxa" w:w="1512"/>
@@ -8767,6 +8767,9 @@
         </w:tc>
       </w:tr>
       <w:tr>
+        <w:trPr>
+          <w:cantSplit/>
+        </w:trPr>
         <w:tc>
           <w:tcPr>
             <w:tcW w:type="dxa" w:w="1512"/>
@@ -8878,7 +8881,7 @@
               <w:rPr>
                 <w:sz w:val="18"/>
               </w:rPr>
-              <w:t>246 testes aprovados com PostgreSQL 16 e RabbitMQ 3.12 reais (232 aprovados e 14 ignorados com SQLite puro)</w:t>
+              <w:t>Suítes da CI 40199072801 verificadas separadamente (seção 4.10)</w:t>
             </w:r>
           </w:p>
         </w:tc>
@@ -8895,7 +8898,7 @@
         <w:jc w:val="both"/>
       </w:pPr>
       <w:r>
-        <w:t>As medições representam um ambiente local (contêiner Linux, Python 3.13, PostgreSQL 16 e SQLite) com dados sintéticos e não substituem planejamento de capacidade com volumes reais. PostgreSQL e RabbitMQ foram verificados localmente e na integração contínua; a hospedagem pública e o PostgreSQL gerenciado ainda não foram verificados.</w:t>
+        <w:t>A medição de desempenho de 20/10 representa um ambiente local (contêiner Linux, Python 3.13, PostgreSQL 16 e RabbitMQ 3.12) com dados sintéticos. A CI de 25/10 verifica a main de referência em jobs distintos de aplicação, PostgreSQL, RabbitMQ e navegador. As suítes se sobrepõem; suas contagens não constituem um total único. A verificação local de 28/10 registrou Python 252 aprovados e 14 ignorados, frontend 19 aprovados, TypeScript e OpenAPI aprovados. A hospedagem pública, o PostgreSQL gerenciado e a capacidade com volumes reais permanecem sem comprovação.</w:t>
       </w:r>
     </w:p>
     <w:p>
@@ -8910,7 +8913,7 @@
       <w:tblPr>
         <w:tblW w:type="auto" w:w="0"/>
         <w:jc w:val="center"/>
-        <w:tblLayout w:type="autofit"/>
+        <w:tblLayout w:type="fixed"/>
         <w:tblLook w:firstColumn="1" w:firstRow="1" w:lastColumn="0" w:lastRow="0" w:noHBand="0" w:noVBand="1" w:val="04A0"/>
         <w:tblBorders>
           <w:top w:val="single" w:sz="4" w:color="D9D9D9"/>
@@ -8922,12 +8925,13 @@
         </w:tblBorders>
       </w:tblPr>
       <w:tblGrid>
-        <w:gridCol w:w="4968"/>
-        <w:gridCol w:w="4968"/>
+        <w:gridCol w:w="3312"/>
+        <w:gridCol w:w="6336"/>
       </w:tblGrid>
       <w:tr>
         <w:trPr>
           <w:tblHeader/>
+          <w:cantSplit/>
         </w:trPr>
         <w:tc>
           <w:tcPr>
@@ -8975,6 +8979,9 @@
         </w:tc>
       </w:tr>
       <w:tr>
+        <w:trPr>
+          <w:cantSplit/>
+        </w:trPr>
         <w:tc>
           <w:tcPr>
             <w:tcW w:type="dxa" w:w="3312"/>
@@ -9023,6 +9030,9 @@
         </w:tc>
       </w:tr>
       <w:tr>
+        <w:trPr>
+          <w:cantSplit/>
+        </w:trPr>
         <w:tc>
           <w:tcPr>
             <w:tcW w:type="dxa" w:w="3312"/>
@@ -9073,6 +9083,9 @@
         </w:tc>
       </w:tr>
       <w:tr>
+        <w:trPr>
+          <w:cantSplit/>
+        </w:trPr>
         <w:tc>
           <w:tcPr>
             <w:tcW w:type="dxa" w:w="3312"/>
@@ -9121,6 +9134,9 @@
         </w:tc>
       </w:tr>
       <w:tr>
+        <w:trPr>
+          <w:cantSplit/>
+        </w:trPr>
         <w:tc>
           <w:tcPr>
             <w:tcW w:type="dxa" w:w="3312"/>
@@ -9171,6 +9187,9 @@
         </w:tc>
       </w:tr>
       <w:tr>
+        <w:trPr>
+          <w:cantSplit/>
+        </w:trPr>
         <w:tc>
           <w:tcPr>
             <w:tcW w:type="dxa" w:w="3312"/>
@@ -9219,6 +9238,9 @@
         </w:tc>
       </w:tr>
       <w:tr>
+        <w:trPr>
+          <w:cantSplit/>
+        </w:trPr>
         <w:tc>
           <w:tcPr>
             <w:tcW w:type="dxa" w:w="3312"/>
@@ -9269,6 +9291,9 @@
         </w:tc>
       </w:tr>
       <w:tr>
+        <w:trPr>
+          <w:cantSplit/>
+        </w:trPr>
         <w:tc>
           <w:tcPr>
             <w:tcW w:type="dxa" w:w="3312"/>
@@ -9371,7 +9396,299 @@
         <w:jc w:val="both"/>
       </w:pPr>
       <w:r>
-        <w:t>A arquitetura resolve o problema identificado no escopo demonstrável: os três fluxos eliminam o recadastro, automatizam cobrança e preparação de retirada e levam o SLA ao atendimento, com testes e roteiros como evidência. Os componentes estão organizados por propriedade de dados, e um teste estático impede importação de modelos entre contextos. As integrações são coerentes: REST quando a resposta é necessária na hora e eventos para efeitos posteriores. Os padrões escolhidos são adequados ao porte e à incerteza do cenário, e a arquitetura permite evolução por portas, contratos aditivos e ADRs.</w:t>
+        <w:t>A versão analisada é a main f1669d7, incorporada pelo PR #75 em 25/10/2026 (PROJETO APLICADO 7, 2026b). A CI 40199072801, executada em 25/10 nessa main, concluiu os quatro jobs com sucesso. Os resultados abaixo foram conferidos nos logs do GitHub Actions (PROJETO APLICADO 7, 2026c).</w:t>
+      </w:r>
+    </w:p>
+    <w:tbl>
+      <w:tblPr>
+        <w:tblW w:type="auto" w:w="0"/>
+        <w:jc w:val="center"/>
+        <w:tblLayout w:type="fixed"/>
+        <w:tblLook w:firstColumn="1" w:firstRow="1" w:lastColumn="0" w:lastRow="0" w:noHBand="0" w:noVBand="1" w:val="04A0"/>
+        <w:tblBorders>
+          <w:top w:val="single" w:sz="4" w:color="D9D9D9"/>
+          <w:left w:val="single" w:sz="4" w:color="D9D9D9"/>
+          <w:bottom w:val="single" w:sz="4" w:color="D9D9D9"/>
+          <w:right w:val="single" w:sz="4" w:color="D9D9D9"/>
+          <w:insideH w:val="single" w:sz="4" w:color="D9D9D9"/>
+          <w:insideV w:val="single" w:sz="4" w:color="D9D9D9"/>
+        </w:tblBorders>
+      </w:tblPr>
+      <w:tblGrid>
+        <w:gridCol w:w="1872"/>
+        <w:gridCol w:w="7776"/>
+      </w:tblGrid>
+      <w:tr>
+        <w:trPr>
+          <w:tblHeader/>
+          <w:cantSplit/>
+        </w:trPr>
+        <w:tc>
+          <w:tcPr>
+            <w:tcW w:type="dxa" w:w="1872"/>
+            <w:shd w:fill="17365D"/>
+            <w:vAlign w:val="center"/>
+            <w:tcMar>
+              <w:top w:w="100" w:type="dxa"/>
+              <w:start w:w="120" w:type="dxa"/>
+              <w:bottom w:w="100" w:type="dxa"/>
+              <w:end w:w="120" w:type="dxa"/>
+            </w:tcMar>
+          </w:tcPr>
+          <w:p>
+            <w:r>
+              <w:rPr>
+                <w:b/>
+                <w:color w:val="FFFFFF"/>
+              </w:rPr>
+              <w:t>Job da CI</w:t>
+            </w:r>
+          </w:p>
+        </w:tc>
+        <w:tc>
+          <w:tcPr>
+            <w:tcW w:type="dxa" w:w="7776"/>
+            <w:shd w:fill="17365D"/>
+            <w:vAlign w:val="center"/>
+            <w:tcMar>
+              <w:top w:w="100" w:type="dxa"/>
+              <w:start w:w="120" w:type="dxa"/>
+              <w:bottom w:w="100" w:type="dxa"/>
+              <w:end w:w="120" w:type="dxa"/>
+            </w:tcMar>
+          </w:tcPr>
+          <w:p>
+            <w:r>
+              <w:rPr>
+                <w:b/>
+                <w:color w:val="FFFFFF"/>
+              </w:rPr>
+              <w:t>Resultado da verificação</w:t>
+            </w:r>
+          </w:p>
+        </w:tc>
+      </w:tr>
+      <w:tr>
+        <w:trPr>
+          <w:cantSplit/>
+        </w:trPr>
+        <w:tc>
+          <w:tcPr>
+            <w:tcW w:type="dxa" w:w="1872"/>
+            <w:vAlign w:val="center"/>
+            <w:tcMar>
+              <w:top w:w="100" w:type="dxa"/>
+              <w:start w:w="120" w:type="dxa"/>
+              <w:bottom w:w="100" w:type="dxa"/>
+              <w:end w:w="120" w:type="dxa"/>
+            </w:tcMar>
+          </w:tcPr>
+          <w:p>
+            <w:pPr>
+              <w:spacing w:after="0"/>
+            </w:pPr>
+            <w:r>
+              <w:rPr>
+                <w:sz w:val="18"/>
+              </w:rPr>
+              <w:t>application</w:t>
+            </w:r>
+          </w:p>
+        </w:tc>
+        <w:tc>
+          <w:tcPr>
+            <w:tcW w:type="dxa" w:w="7776"/>
+            <w:vAlign w:val="center"/>
+            <w:tcMar>
+              <w:top w:w="100" w:type="dxa"/>
+              <w:start w:w="120" w:type="dxa"/>
+              <w:bottom w:w="100" w:type="dxa"/>
+              <w:end w:w="120" w:type="dxa"/>
+            </w:tcMar>
+          </w:tcPr>
+          <w:p>
+            <w:pPr>
+              <w:spacing w:after="0"/>
+            </w:pPr>
+            <w:r>
+              <w:rPr>
+                <w:sz w:val="18"/>
+              </w:rPr>
+              <w:t>252 testes aprovados e 14 ignorados</w:t>
+            </w:r>
+          </w:p>
+        </w:tc>
+      </w:tr>
+      <w:tr>
+        <w:trPr>
+          <w:cantSplit/>
+        </w:trPr>
+        <w:tc>
+          <w:tcPr>
+            <w:tcW w:type="dxa" w:w="1872"/>
+            <w:vAlign w:val="center"/>
+            <w:tcMar>
+              <w:top w:w="100" w:type="dxa"/>
+              <w:start w:w="120" w:type="dxa"/>
+              <w:bottom w:w="100" w:type="dxa"/>
+              <w:end w:w="120" w:type="dxa"/>
+            </w:tcMar>
+            <w:shd w:fill="EAF1F8"/>
+          </w:tcPr>
+          <w:p>
+            <w:pPr>
+              <w:spacing w:after="0"/>
+            </w:pPr>
+            <w:r>
+              <w:rPr>
+                <w:sz w:val="18"/>
+              </w:rPr>
+              <w:t>postgresql</w:t>
+            </w:r>
+          </w:p>
+        </w:tc>
+        <w:tc>
+          <w:tcPr>
+            <w:tcW w:type="dxa" w:w="7776"/>
+            <w:vAlign w:val="center"/>
+            <w:tcMar>
+              <w:top w:w="100" w:type="dxa"/>
+              <w:start w:w="120" w:type="dxa"/>
+              <w:bottom w:w="100" w:type="dxa"/>
+              <w:end w:w="120" w:type="dxa"/>
+            </w:tcMar>
+            <w:shd w:fill="EAF1F8"/>
+          </w:tcPr>
+          <w:p>
+            <w:pPr>
+              <w:spacing w:after="0"/>
+            </w:pPr>
+            <w:r>
+              <w:rPr>
+                <w:sz w:val="18"/>
+              </w:rPr>
+              <w:t>262 testes aprovados e 4 ignorados</w:t>
+            </w:r>
+          </w:p>
+        </w:tc>
+      </w:tr>
+      <w:tr>
+        <w:trPr>
+          <w:cantSplit/>
+        </w:trPr>
+        <w:tc>
+          <w:tcPr>
+            <w:tcW w:type="dxa" w:w="1872"/>
+            <w:vAlign w:val="center"/>
+            <w:tcMar>
+              <w:top w:w="100" w:type="dxa"/>
+              <w:start w:w="120" w:type="dxa"/>
+              <w:bottom w:w="100" w:type="dxa"/>
+              <w:end w:w="120" w:type="dxa"/>
+            </w:tcMar>
+          </w:tcPr>
+          <w:p>
+            <w:pPr>
+              <w:spacing w:after="0"/>
+            </w:pPr>
+            <w:r>
+              <w:rPr>
+                <w:sz w:val="18"/>
+              </w:rPr>
+              <w:t>rabbitmq</w:t>
+            </w:r>
+          </w:p>
+        </w:tc>
+        <w:tc>
+          <w:tcPr>
+            <w:tcW w:type="dxa" w:w="7776"/>
+            <w:vAlign w:val="center"/>
+            <w:tcMar>
+              <w:top w:w="100" w:type="dxa"/>
+              <w:start w:w="120" w:type="dxa"/>
+              <w:bottom w:w="100" w:type="dxa"/>
+              <w:end w:w="120" w:type="dxa"/>
+            </w:tcMar>
+          </w:tcPr>
+          <w:p>
+            <w:pPr>
+              <w:spacing w:after="0"/>
+            </w:pPr>
+            <w:r>
+              <w:rPr>
+                <w:sz w:val="18"/>
+              </w:rPr>
+              <w:t>22 testes aprovados</w:t>
+            </w:r>
+          </w:p>
+        </w:tc>
+      </w:tr>
+      <w:tr>
+        <w:trPr>
+          <w:cantSplit/>
+        </w:trPr>
+        <w:tc>
+          <w:tcPr>
+            <w:tcW w:type="dxa" w:w="1872"/>
+            <w:vAlign w:val="center"/>
+            <w:tcMar>
+              <w:top w:w="100" w:type="dxa"/>
+              <w:start w:w="120" w:type="dxa"/>
+              <w:bottom w:w="100" w:type="dxa"/>
+              <w:end w:w="120" w:type="dxa"/>
+            </w:tcMar>
+            <w:shd w:fill="EAF1F8"/>
+          </w:tcPr>
+          <w:p>
+            <w:pPr>
+              <w:spacing w:after="0"/>
+            </w:pPr>
+            <w:r>
+              <w:rPr>
+                <w:sz w:val="18"/>
+              </w:rPr>
+              <w:t>e2e</w:t>
+            </w:r>
+          </w:p>
+        </w:tc>
+        <w:tc>
+          <w:tcPr>
+            <w:tcW w:type="dxa" w:w="7776"/>
+            <w:vAlign w:val="center"/>
+            <w:tcMar>
+              <w:top w:w="100" w:type="dxa"/>
+              <w:start w:w="120" w:type="dxa"/>
+              <w:bottom w:w="100" w:type="dxa"/>
+              <w:end w:w="120" w:type="dxa"/>
+            </w:tcMar>
+            <w:shd w:fill="EAF1F8"/>
+          </w:tcPr>
+          <w:p>
+            <w:pPr>
+              <w:spacing w:after="0"/>
+            </w:pPr>
+            <w:r>
+              <w:rPr>
+                <w:sz w:val="18"/>
+              </w:rPr>
+              <w:t>25 roteiros de navegador aprovados; verificação axe separada: 1 aprovada</w:t>
+            </w:r>
+          </w:p>
+        </w:tc>
+      </w:tr>
+    </w:tbl>
+    <w:p>
+      <w:pPr>
+        <w:spacing w:after="40"/>
+      </w:pPr>
+    </w:p>
+    <w:p>
+      <w:pPr>
+        <w:spacing w:after="160" w:line="276" w:lineRule="auto"/>
+        <w:jc w:val="both"/>
+      </w:pPr>
+      <w:r>
+        <w:t>As suítes se sobrepõem e não devem ser somadas. A verificação local informada em 28/10 registrou 252 testes Python aprovados e 14 ignorados, 19 testes da interface aprovados, checagem TypeScript e conferência OpenAPI aprovadas (PROJETO APLICADO 7, 2026d). A evidência de 20/10 (246 testes com PostgreSQL/RabbitMQ, 22 roteiros de navegador e p95 máximo de 45,1 ms) permanece histórica; o p95 não foi medido novamente sobre a main f1669d7 nesta revisão (PROJETO APLICADO 7, 2026a).</w:t>
       </w:r>
     </w:p>
     <w:p>
@@ -9380,12 +9697,31 @@
         <w:jc w:val="both"/>
       </w:pPr>
       <w:r>
-        <w:t>Riscos e limitações: os dados organizacionais reais são desconhecidos; não há OIDC, tracing distribuído nem agendador (vencimento de fatura e SLA dependem de acionamento); o RabbitMQ recebe cópia dos eventos, mas não entrega aos consumidores; o prazo da leitura do CRM limita tentativas e esperas, mas não interrompe uma chamada no mesmo processo; a hospedagem pública e o PostgreSQL gerenciado não foram verificados.</w:t>
+        <w:t>Nos cenários exercitados, os três fluxos evitam recadastro, automatizam cobrança e preparação de retirada e levam o SLA ao atendimento. Os resultados sustentam a viabilidade do desenho, mas não garantem convergência em toda ordem de eventos ou consistência de todos os estados. Os componentes estão organizados por propriedade de dados, com teste estático das fronteiras. REST atende respostas imediatas e eventos coordenam efeitos posteriores. Portas, contratos aditivos e ADRs permitem evolução com mudanças localizadas.</w:t>
+      </w:r>
+    </w:p>
+    <w:p>
+      <w:pPr>
+        <w:spacing w:after="160" w:line="276" w:lineRule="auto"/>
+        <w:jc w:val="both"/>
+      </w:pPr>
+      <w:r>
+        <w:t>A revisão de código de 28/10 identificou três limitações reproduzidas (PROJETO APLICADO 7, 2026d). No F3, se TicketOpened falha e TicketResolved é consumido antes da recuperação, o consumidor de resolução retorna sem processo; a recuperação posterior da abertura cria um processo STARTED embora o chamado já esteja RESOLVED, sem pendências na outbox que assegurem a convergência. No encerramento de contrato, o processo pode ficar COMPLETED com tarefa CANCELLED. No financeiro, a leitura pode exibir OVERDUE enquanto o estado persistido permanece OPEN e ainda permite cancelamento. São defeitos conhecidos, não corrigidos nesta revisão documental; exigem correção e regressões específicas para ordem de eventos e coerência de estados. Aprovação das suítes não equivale a confiabilidade absoluta.</w:t>
+      </w:r>
+    </w:p>
+    <w:p>
+      <w:pPr>
+        <w:spacing w:after="160" w:line="276" w:lineRule="auto"/>
+        <w:jc w:val="both"/>
+      </w:pPr>
+      <w:r>
+        <w:t>Riscos e limitações: os dados organizacionais reais são desconhecidos; não há OIDC, tracing distribuído nem agendador (vencimento de fatura e SLA dependem de acionamento); o RabbitMQ recebe cópia dos eventos, mas não entrega aos consumidores, e FAILED é um estado da aplicação, não uma fila de erro do broker. O prazo da leitura do CRM limita tentativas e esperas, mas não interrompe uma chamada no mesmo processo; o ADR-006 permanece proposto, aguardando aceite. A hospedagem pública e o PostgreSQL gerenciado não foram verificados. Integração na main não comprova aceite docente, validação das premissas ou conclusão formal da entrega.</w:t>
       </w:r>
     </w:p>
     <w:p>
       <w:pPr>
         <w:pStyle w:val="Heading1"/>
+        <w:pageBreakBefore/>
       </w:pPr>
       <w:r>
         <w:t>5 Considerações finais</w:t>
@@ -9397,7 +9733,7 @@
         <w:jc w:val="both"/>
       </w:pPr>
       <w:r>
-        <w:t>Os objetivos foram alcançados no nível de protótipo acadêmico: requisitos, AS-IS, TO-BE, padrões, três integrações, interoperabilidade, qualidade e evolução estão documentados e demonstrados. As decisões mais relevantes foram o monólito modular com fronteiras extraíveis, a outbox com inbox para efeitos únicos e o tratamento explícito da indisponibilidade (503 no F1 e estado pendente no F3). Os principais desafios foram manter fronteiras com banco e processo compartilhados e garantir a mesma correlação em HTTP, auditoria e eventos.</w:t>
+        <w:t>Os objetivos técnicos possuem evidências no nível de protótipo acadêmico: requisitos, AS-IS, TO-BE, padrões, três integrações, interoperabilidade, qualidade e evolução estão documentados e demonstrados no recorte de validação apresentado. A entrega acadêmica permanece condicionada à informação dos nomes e contribuições individuais e à revisão docente das premissas. As decisões mais relevantes foram o monólito modular com fronteiras extraíveis, a outbox com inbox para efeitos únicos e o tratamento explícito da indisponibilidade (503 no F1 e estado pendente no F3). Os principais desafios foram manter fronteiras com banco e processo compartilhados e garantir a mesma correlação em HTTP, auditoria e eventos.</w:t>
       </w:r>
     </w:p>
     <w:p>
@@ -9406,7 +9742,7 @@
         <w:jc w:val="both"/>
       </w:pPr>
       <w:r>
-        <w:t>Como evolução, a arquitetura pode incorporar identidade corporativa, agendador para vencimentos e alertas de SLA, consumo efetivo pelo broker e conectores reais por adaptadores. Funcionalidades futuras incluem gestão de frota, vistoria com fotos e portal do cliente. O principal aprendizado é que contratos versionados não bastam sozinhos: idempotência, estados de recuperação e evidências precisam ser projetados junto com cada fluxo.</w:t>
+        <w:t>A prioridade técnica é corrigir as limitações de convergência e coerência de estados descritas na seção 4.10 e demonstrar sua recuperação por testes específicos. Como evolução, a arquitetura pode incorporar identidade corporativa, agendador para vencimentos e alertas de SLA, consumo efetivo pelo broker e conectores reais por adaptadores. Funcionalidades futuras incluem gestão de frota, vistoria com fotos e portal do cliente. O principal aprendizado é que idempotência, ordenação de eventos, estados de recuperação e evidências precisam ser projetados junto com cada fluxo.</w:t>
       </w:r>
     </w:p>
     <w:p>
@@ -9416,214 +9752,258 @@
         <w:spacing w:before="160" w:after="240"/>
       </w:pPr>
       <w:r>
-        <w:t>Referências</w:t>
+        <w:t>6 Referências</w:t>
       </w:r>
     </w:p>
     <w:p>
       <w:pPr>
-        <w:spacing w:after="100"/>
+        <w:spacing w:after="80"/>
       </w:pPr>
       <w:r>
         <w:rPr>
-          <w:sz w:val="19"/>
+          <w:sz w:val="18"/>
         </w:rPr>
         <w:t>ARCHCORP. Projeto Aplicado – ArchCorp: Arquitetura de Sistemas Corporativos. Enunciado acadêmico do Projeto Aplicado. 2026a.</w:t>
       </w:r>
     </w:p>
     <w:p>
       <w:pPr>
-        <w:spacing w:after="100"/>
+        <w:spacing w:after="80"/>
       </w:pPr>
       <w:r>
         <w:rPr>
-          <w:sz w:val="19"/>
+          <w:sz w:val="18"/>
         </w:rPr>
         <w:t>ARCHCORP. Plano de Execução e Cronograma Detalhado. Material acadêmico fornecido ao projeto. 2026b.</w:t>
       </w:r>
     </w:p>
     <w:p>
       <w:pPr>
-        <w:spacing w:after="100"/>
+        <w:spacing w:after="80"/>
       </w:pPr>
       <w:r>
         <w:rPr>
-          <w:sz w:val="19"/>
+          <w:sz w:val="18"/>
         </w:rPr>
         <w:t>ASYNCAPI INITIATIVE. AsyncAPI Specification 3.0.0. 2023. Disponível em: https://www.asyncapi.com/docs/reference/specification/v3.0.0. Acesso em: 17 out. 2026.</w:t>
       </w:r>
     </w:p>
     <w:p>
       <w:pPr>
-        <w:spacing w:after="100"/>
+        <w:spacing w:after="80"/>
       </w:pPr>
       <w:r>
         <w:rPr>
-          <w:sz w:val="19"/>
+          <w:sz w:val="18"/>
         </w:rPr>
         <w:t>BASS, Len; CLEMENTS, Paul; KAZMAN, Rick. Software architecture in practice. 4. ed. Boston: Addison-Wesley, 2021.</w:t>
       </w:r>
     </w:p>
     <w:p>
       <w:pPr>
-        <w:spacing w:after="100"/>
+        <w:spacing w:after="80"/>
       </w:pPr>
       <w:r>
         <w:rPr>
-          <w:sz w:val="19"/>
+          <w:sz w:val="18"/>
         </w:rPr>
         <w:t>BUTTLE, Francis; MAKLAN, Stan. Customer relationship management: concepts and technologies. 4. ed. London: Routledge, 2019.</w:t>
       </w:r>
     </w:p>
     <w:p>
       <w:pPr>
-        <w:spacing w:after="100"/>
+        <w:spacing w:after="80"/>
       </w:pPr>
       <w:r>
         <w:rPr>
-          <w:sz w:val="19"/>
+          <w:sz w:val="18"/>
         </w:rPr>
         <w:t>COCKBURN, Alistair. Hexagonal architecture. 2005. Disponível em: https://alistair.cockburn.us/hexagonal-architecture/. Acesso em: 17 out. 2026.</w:t>
       </w:r>
     </w:p>
     <w:p>
       <w:pPr>
-        <w:spacing w:after="100"/>
+        <w:spacing w:after="80"/>
       </w:pPr>
       <w:r>
         <w:rPr>
-          <w:sz w:val="19"/>
+          <w:sz w:val="18"/>
         </w:rPr>
         <w:t>DAVENPORT, Thomas H. Putting the enterprise into the enterprise system. Harvard Business Review, Boston, v. 76, n. 4, p. 121-131, jul./ago. 1998.</w:t>
       </w:r>
     </w:p>
     <w:p>
       <w:pPr>
-        <w:spacing w:after="100"/>
+        <w:spacing w:after="80"/>
       </w:pPr>
       <w:r>
         <w:rPr>
-          <w:sz w:val="19"/>
+          <w:sz w:val="18"/>
         </w:rPr>
         <w:t>DUMAS, Marlon; LA ROSA, Marcello; MENDLING, Jan; REIJERS, Hajo A. Fundamentals of business process management. 2. ed. Berlin: Springer, 2018.</w:t>
       </w:r>
     </w:p>
     <w:p>
       <w:pPr>
-        <w:spacing w:after="100"/>
+        <w:spacing w:after="80"/>
       </w:pPr>
       <w:r>
         <w:rPr>
-          <w:sz w:val="19"/>
+          <w:sz w:val="18"/>
         </w:rPr>
         <w:t>FIELDING, Roy; NOTTINGHAM, Mark; RESCHKE, Julian (ed.). RFC 9110: HTTP semantics. Internet Engineering Task Force, jun. 2022. Disponível em: https://www.rfc-editor.org/rfc/rfc9110. Acesso em: 17 out. 2026.</w:t>
       </w:r>
     </w:p>
     <w:p>
       <w:pPr>
-        <w:spacing w:after="100"/>
+        <w:spacing w:after="80"/>
       </w:pPr>
       <w:r>
         <w:rPr>
-          <w:sz w:val="19"/>
+          <w:sz w:val="18"/>
         </w:rPr>
         <w:t>FOWLER, Martin. Patterns of enterprise application architecture. Boston: Addison-Wesley, 2002.</w:t>
       </w:r>
     </w:p>
     <w:p>
       <w:pPr>
-        <w:spacing w:after="100"/>
+        <w:spacing w:after="80"/>
       </w:pPr>
       <w:r>
         <w:rPr>
-          <w:sz w:val="19"/>
+          <w:sz w:val="18"/>
         </w:rPr>
         <w:t>FOWLER, Martin. MonolithFirst. 3 jun. 2015. Disponível em: https://martinfowler.com/bliki/MonolithFirst.html. Acesso em: 17 out. 2026.</w:t>
       </w:r>
     </w:p>
     <w:p>
       <w:pPr>
-        <w:spacing w:after="100"/>
+        <w:spacing w:after="80"/>
       </w:pPr>
       <w:r>
         <w:rPr>
-          <w:sz w:val="19"/>
+          <w:sz w:val="18"/>
         </w:rPr>
         <w:t>HOHPE, Gregor; WOOLF, Bobby. Enterprise integration patterns: designing, building, and deploying messaging solutions. Boston: Addison-Wesley, 2003.</w:t>
       </w:r>
     </w:p>
     <w:p>
       <w:pPr>
-        <w:spacing w:after="100"/>
+        <w:spacing w:after="80"/>
       </w:pPr>
       <w:r>
         <w:rPr>
-          <w:sz w:val="19"/>
+          <w:sz w:val="18"/>
         </w:rPr>
         <w:t>ISO/IEC. ISO/IEC 25010:2011: systems and software engineering — systems and software quality requirements and evaluation (SQuaRE) — system and software quality models. Geneva: ISO, 2011.</w:t>
       </w:r>
     </w:p>
     <w:p>
       <w:pPr>
-        <w:spacing w:after="100"/>
+        <w:spacing w:after="80"/>
       </w:pPr>
       <w:r>
         <w:rPr>
-          <w:sz w:val="19"/>
+          <w:sz w:val="18"/>
         </w:rPr>
         <w:t>LEHMAN, Meir M. Programs, life cycles, and laws of software evolution. Proceedings of the IEEE, v. 68, n. 9, p. 1060-1076, 1980.</w:t>
       </w:r>
     </w:p>
     <w:p>
       <w:pPr>
-        <w:spacing w:after="100"/>
+        <w:spacing w:after="80"/>
       </w:pPr>
       <w:r>
         <w:rPr>
-          <w:sz w:val="19"/>
+          <w:sz w:val="18"/>
         </w:rPr>
         <w:t>LEWIS, James; FOWLER, Martin. Microservices: a definition of this new architectural term. 25 mar. 2014. Disponível em: https://martinfowler.com/articles/microservices.html. Acesso em: 17 out. 2026.</w:t>
       </w:r>
     </w:p>
     <w:p>
       <w:pPr>
-        <w:spacing w:after="100"/>
+        <w:spacing w:after="80"/>
       </w:pPr>
       <w:r>
         <w:rPr>
-          <w:sz w:val="19"/>
+          <w:sz w:val="18"/>
         </w:rPr>
         <w:t>NEWMAN, Sam. Building microservices: designing fine-grained systems. 2. ed. Sebastopol: O'Reilly Media, 2021.</w:t>
       </w:r>
     </w:p>
     <w:p>
       <w:pPr>
-        <w:spacing w:after="100"/>
+        <w:spacing w:after="80"/>
       </w:pPr>
       <w:r>
         <w:rPr>
-          <w:sz w:val="19"/>
+          <w:sz w:val="18"/>
         </w:rPr>
         <w:t>NYGARD, Michael T. Release it!: design and deploy production-ready software. 2. ed. Raleigh: Pragmatic Bookshelf, 2018.</w:t>
       </w:r>
     </w:p>
     <w:p>
       <w:pPr>
-        <w:spacing w:after="100"/>
+        <w:spacing w:after="80"/>
       </w:pPr>
       <w:r>
         <w:rPr>
-          <w:sz w:val="19"/>
+          <w:sz w:val="18"/>
         </w:rPr>
         <w:t>OPENAPI INITIATIVE. OpenAPI Specification 3.1.1. 2024. Disponível em: https://spec.openapis.org/oas/v3.1.1.html. Acesso em: 17 out. 2026.</w:t>
       </w:r>
     </w:p>
     <w:p>
       <w:pPr>
-        <w:spacing w:after="100"/>
+        <w:spacing w:after="80"/>
       </w:pPr>
       <w:r>
         <w:rPr>
-          <w:sz w:val="19"/>
+          <w:sz w:val="18"/>
+        </w:rPr>
+        <w:t>PROJETO APLICADO 7. Evidências de validação. Seções de 20/10 e 21/10/2026. Documento do repositório docs/EVIDENCIAS_VALIDACAO.md, versão f1669d7. 2026a.</w:t>
+      </w:r>
+    </w:p>
+    <w:p>
+      <w:pPr>
+        <w:spacing w:after="80"/>
+      </w:pPr>
+      <w:r>
+        <w:rPr>
+          <w:sz w:val="18"/>
+        </w:rPr>
+        <w:t>PROJETO APLICADO 7. Integra as tarefas T06–T19 à main e recupera correções do T17. PR #75, commit f1669d78f01e2d279b3de60a999ed778e6c9916e, 25 out. 2026. Disponível em: https://github.com/Roger-Quinelato/projetoAplicado7/pull/75. Registro do commit consultado localmente em: 28 out. 2026. 2026b.</w:t>
+      </w:r>
+    </w:p>
+    <w:p>
+      <w:pPr>
+        <w:spacing w:after="80"/>
+      </w:pPr>
+      <w:r>
+        <w:rPr>
+          <w:sz w:val="18"/>
+        </w:rPr>
+        <w:t>PROJETO APLICADO 7. Verify: execução 40199072801 na main f1669d7. GitHub Actions, 25 out. 2026. Disponível em: https://github.com/Roger-Quinelato/projetoAplicado7/actions/runs/40199072801. Logs consultados no GitHub Actions em: 28 out. 2026. 2026c.</w:t>
+      </w:r>
+    </w:p>
+    <w:p>
+      <w:pPr>
+        <w:spacing w:after="80"/>
+      </w:pPr>
+      <w:r>
+        <w:rPr>
+          <w:sz w:val="18"/>
+        </w:rPr>
+        <w:t>PROJETO APLICADO 7. Registros de testes locais e revisão de código de 28 out. 2026. Resultados e reproduções informados pela equipe; conferência dos consumidores em src/archcorp/workflow/service.py e das regras em src/archcorp/finance/service.py e domain.py. 2026d.</w:t>
+      </w:r>
+    </w:p>
+    <w:p>
+      <w:pPr>
+        <w:spacing w:after="80"/>
+      </w:pPr>
+      <w:r>
+        <w:rPr>
+          <w:sz w:val="18"/>
         </w:rPr>
         <w:t>RICHARDS, Mark; FORD, Neal. Fundamentals of software architecture: an engineering approach. Sebastopol: O'Reilly Media, 2020.</w:t>
       </w:r>
@@ -9639,8 +10019,8 @@
     </w:p>
     <w:sectPr>
       <w:footerReference w:type="default" r:id="rId9"/>
-      <w:pgSz w:w="12240" w:h="15840"/>
-      <w:pgMar w:top="1037" w:right="1152" w:bottom="1037" w:left="1152" w:header="720" w:footer="720" w:gutter="0"/>
+      <w:pgSz w:w="11909" w:h="16834"/>
+      <w:pgMar w:top="1037" w:right="979" w:bottom="1037" w:left="979" w:header="720" w:footer="720" w:gutter="0"/>
       <w:cols w:space="720"/>
       <w:docGrid w:linePitch="360"/>
     </w:sectPr>

</xml_diff>

<commit_message>
fix: recupera F3 e alinha estados de fechamento e autoria
</commit_message>
<xml_diff>
--- a/output/Relatorio_Tecnico_Cenario_4.docx
+++ b/output/Relatorio_Tecnico_Cenario_4.docx
@@ -30,7 +30,9 @@
         <w:jc w:val="center"/>
       </w:pPr>
       <w:r>
-        <w:t>Autoria e contribuições individuais pendentes de informação pela equipe</w:t>
+        <w:t>Rodrigo Nenato</w:t>
+        <w:br/>
+        <w:t>Raquel</w:t>
         <w:br/>
         <w:t>Versão de 28 de outubro de 2026</w:t>
         <w:br/>
@@ -447,14 +449,184 @@
         <w:t>3.1 Participantes</w:t>
       </w:r>
     </w:p>
+    <w:tbl>
+      <w:tblPr>
+        <w:tblW w:type="auto" w:w="0"/>
+        <w:jc w:val="center"/>
+        <w:tblLayout w:type="fixed"/>
+        <w:tblLook w:firstColumn="1" w:firstRow="1" w:lastColumn="0" w:lastRow="0" w:noHBand="0" w:noVBand="1" w:val="04A0"/>
+        <w:tblBorders>
+          <w:top w:val="single" w:sz="4" w:color="D9D9D9"/>
+          <w:left w:val="single" w:sz="4" w:color="D9D9D9"/>
+          <w:bottom w:val="single" w:sz="4" w:color="D9D9D9"/>
+          <w:right w:val="single" w:sz="4" w:color="D9D9D9"/>
+          <w:insideH w:val="single" w:sz="4" w:color="D9D9D9"/>
+          <w:insideV w:val="single" w:sz="4" w:color="D9D9D9"/>
+        </w:tblBorders>
+      </w:tblPr>
+      <w:tblGrid>
+        <w:gridCol w:w="3168"/>
+        <w:gridCol w:w="6480"/>
+      </w:tblGrid>
+      <w:tr>
+        <w:trPr>
+          <w:tblHeader/>
+          <w:cantSplit/>
+        </w:trPr>
+        <w:tc>
+          <w:tcPr>
+            <w:tcW w:type="dxa" w:w="3168"/>
+            <w:shd w:fill="17365D"/>
+            <w:vAlign w:val="center"/>
+            <w:tcMar>
+              <w:top w:w="100" w:type="dxa"/>
+              <w:start w:w="120" w:type="dxa"/>
+              <w:bottom w:w="100" w:type="dxa"/>
+              <w:end w:w="120" w:type="dxa"/>
+            </w:tcMar>
+          </w:tcPr>
+          <w:p>
+            <w:r>
+              <w:rPr>
+                <w:b/>
+                <w:color w:val="FFFFFF"/>
+              </w:rPr>
+              <w:t>Integrante</w:t>
+            </w:r>
+          </w:p>
+        </w:tc>
+        <w:tc>
+          <w:tcPr>
+            <w:tcW w:type="dxa" w:w="6480"/>
+            <w:shd w:fill="17365D"/>
+            <w:vAlign w:val="center"/>
+            <w:tcMar>
+              <w:top w:w="100" w:type="dxa"/>
+              <w:start w:w="120" w:type="dxa"/>
+              <w:bottom w:w="100" w:type="dxa"/>
+              <w:end w:w="120" w:type="dxa"/>
+            </w:tcMar>
+          </w:tcPr>
+          <w:p>
+            <w:r>
+              <w:rPr>
+                <w:b/>
+                <w:color w:val="FFFFFF"/>
+              </w:rPr>
+              <w:t>Contribuição</w:t>
+            </w:r>
+          </w:p>
+        </w:tc>
+      </w:tr>
+      <w:tr>
+        <w:trPr>
+          <w:cantSplit/>
+        </w:trPr>
+        <w:tc>
+          <w:tcPr>
+            <w:tcW w:type="dxa" w:w="3168"/>
+            <w:vAlign w:val="center"/>
+            <w:tcMar>
+              <w:top w:w="100" w:type="dxa"/>
+              <w:start w:w="120" w:type="dxa"/>
+              <w:bottom w:w="100" w:type="dxa"/>
+              <w:end w:w="120" w:type="dxa"/>
+            </w:tcMar>
+          </w:tcPr>
+          <w:p>
+            <w:pPr>
+              <w:spacing w:after="0"/>
+            </w:pPr>
+            <w:r>
+              <w:rPr>
+                <w:sz w:val="18"/>
+              </w:rPr>
+              <w:t>Rodrigo Nenato</w:t>
+            </w:r>
+          </w:p>
+        </w:tc>
+        <w:tc>
+          <w:tcPr>
+            <w:tcW w:type="dxa" w:w="6480"/>
+            <w:vAlign w:val="center"/>
+            <w:tcMar>
+              <w:top w:w="100" w:type="dxa"/>
+              <w:start w:w="120" w:type="dxa"/>
+              <w:bottom w:w="100" w:type="dxa"/>
+              <w:end w:w="120" w:type="dxa"/>
+            </w:tcMar>
+          </w:tcPr>
+          <w:p>
+            <w:pPr>
+              <w:spacing w:after="0"/>
+            </w:pPr>
+            <w:r>
+              <w:rPr>
+                <w:sz w:val="18"/>
+              </w:rPr>
+              <w:t>Backend, produto e negócio</w:t>
+            </w:r>
+          </w:p>
+        </w:tc>
+      </w:tr>
+      <w:tr>
+        <w:trPr>
+          <w:cantSplit/>
+        </w:trPr>
+        <w:tc>
+          <w:tcPr>
+            <w:tcW w:type="dxa" w:w="3168"/>
+            <w:vAlign w:val="center"/>
+            <w:tcMar>
+              <w:top w:w="100" w:type="dxa"/>
+              <w:start w:w="120" w:type="dxa"/>
+              <w:bottom w:w="100" w:type="dxa"/>
+              <w:end w:w="120" w:type="dxa"/>
+            </w:tcMar>
+            <w:shd w:fill="EAF1F8"/>
+          </w:tcPr>
+          <w:p>
+            <w:pPr>
+              <w:spacing w:after="0"/>
+            </w:pPr>
+            <w:r>
+              <w:rPr>
+                <w:sz w:val="18"/>
+              </w:rPr>
+              <w:t>Raquel</w:t>
+            </w:r>
+          </w:p>
+        </w:tc>
+        <w:tc>
+          <w:tcPr>
+            <w:tcW w:type="dxa" w:w="6480"/>
+            <w:vAlign w:val="center"/>
+            <w:tcMar>
+              <w:top w:w="100" w:type="dxa"/>
+              <w:start w:w="120" w:type="dxa"/>
+              <w:bottom w:w="100" w:type="dxa"/>
+              <w:end w:w="120" w:type="dxa"/>
+            </w:tcMar>
+            <w:shd w:fill="EAF1F8"/>
+          </w:tcPr>
+          <w:p>
+            <w:pPr>
+              <w:spacing w:after="0"/>
+            </w:pPr>
+            <w:r>
+              <w:rPr>
+                <w:sz w:val="18"/>
+              </w:rPr>
+              <w:t>Frontend e levantamento de requisitos</w:t>
+            </w:r>
+          </w:p>
+        </w:tc>
+      </w:tr>
+    </w:tbl>
     <w:p>
       <w:pPr>
-        <w:spacing w:after="160" w:line="276" w:lineRule="auto"/>
-        <w:jc w:val="both"/>
+        <w:spacing w:after="40"/>
       </w:pPr>
-      <w:r>
-        <w:t>Os nomes dos integrantes e suas contribuições individuais não foram informados. Essa informação é necessária para cumprir o item Participantes do Guia (ARCHCORP, 2026a, p. 11) e permanece pendente antes da submissão. As frentes de requisitos, arquitetura, implementação, testes e comunicação técnica descrevem atividades do projeto, sem atribuição individual comprovada. O histórico de commits não substitui a declaração de autoria e de contribuição pela equipe.</w:t>
-      </w:r>
     </w:p>
     <w:p>
       <w:pPr>
@@ -8898,7 +9070,7 @@
         <w:jc w:val="both"/>
       </w:pPr>
       <w:r>
-        <w:t>A medição de desempenho de 20/10 representa um ambiente local (contêiner Linux, Python 3.13, PostgreSQL 16 e RabbitMQ 3.12) com dados sintéticos. A CI de 25/10 verifica a main de referência em jobs distintos de aplicação, PostgreSQL, RabbitMQ e navegador. As suítes se sobrepõem; suas contagens não constituem um total único. A verificação local de 28/10 registrou Python 252 aprovados e 14 ignorados, frontend 19 aprovados, TypeScript e OpenAPI aprovados. A hospedagem pública, o PostgreSQL gerenciado e a capacidade com volumes reais permanecem sem comprovação.</w:t>
+        <w:t>A medição de desempenho de 20/10 representa um ambiente local (contêiner Linux, Python 3.13, PostgreSQL 16 e RabbitMQ 3.12) com dados sintéticos. A CI de 25/10 verifica a main de referência em jobs distintos de aplicação, PostgreSQL, RabbitMQ e navegador. As suítes se sobrepõem; suas contagens não constituem um total único. A verificação local de 28/10 registrou Python 264 aprovados e 14 ignorados, frontend 19 aprovados, TypeScript e OpenAPI aprovados. A hospedagem pública, o PostgreSQL gerenciado e a capacidade com volumes reais permanecem sem comprovação.</w:t>
       </w:r>
     </w:p>
     <w:p>
@@ -9396,7 +9568,7 @@
         <w:jc w:val="both"/>
       </w:pPr>
       <w:r>
-        <w:t>A versão analisada é a main f1669d7, incorporada pelo PR #75 em 25/10/2026 (PROJETO APLICADO 7, 2026b). A CI 40199072801, executada em 25/10 nessa main, concluiu os quatro jobs com sucesso. Os resultados abaixo foram conferidos nos logs do GitHub Actions (PROJETO APLICADO 7, 2026c).</w:t>
+        <w:t>A base da implementação é a main f1669d7, incorporada pelo PR #75 em 25/10/2026, com as correções de fechamento descritas nesta seção (PROJETO APLICADO 7, 2026b). A CI 40199072801, executada em 25/10 nessa main, concluiu os quatro jobs com sucesso. Os resultados abaixo foram conferidos nos logs do GitHub Actions (PROJETO APLICADO 7, 2026c).</w:t>
       </w:r>
     </w:p>
     <w:tbl>
@@ -9688,7 +9860,7 @@
         <w:jc w:val="both"/>
       </w:pPr>
       <w:r>
-        <w:t>As suítes se sobrepõem e não devem ser somadas. A verificação local informada em 28/10 registrou 252 testes Python aprovados e 14 ignorados, 19 testes da interface aprovados, checagem TypeScript e conferência OpenAPI aprovadas (PROJETO APLICADO 7, 2026d). A evidência de 20/10 (246 testes com PostgreSQL/RabbitMQ, 22 roteiros de navegador e p95 máximo de 45,1 ms) permanece histórica; o p95 não foi medido novamente sobre a main f1669d7 nesta revisão (PROJETO APLICADO 7, 2026a).</w:t>
+        <w:t>As suítes se sobrepõem e não devem ser somadas. A verificação local informada em 28/10 registrou 264 testes Python aprovados e 14 ignorados, 19 testes da interface aprovados, checagem TypeScript e conferência OpenAPI aprovadas (PROJETO APLICADO 7, 2026d). A evidência de 20/10 (246 testes com PostgreSQL/RabbitMQ, 22 roteiros de navegador e p95 máximo de 45,1 ms) permanece histórica; o p95 não foi medido novamente sobre a main f1669d7 nesta revisão (PROJETO APLICADO 7, 2026a).</w:t>
       </w:r>
     </w:p>
     <w:p>
@@ -9706,7 +9878,7 @@
         <w:jc w:val="both"/>
       </w:pPr>
       <w:r>
-        <w:t>A revisão de código de 28/10 identificou três limitações reproduzidas (PROJETO APLICADO 7, 2026d). No F3, se TicketOpened falha e TicketResolved é consumido antes da recuperação, o consumidor de resolução retorna sem processo; a recuperação posterior da abertura cria um processo STARTED embora o chamado já esteja RESOLVED, sem pendências na outbox que assegurem a convergência. No encerramento de contrato, o processo pode ficar COMPLETED com tarefa CANCELLED. No financeiro, a leitura pode exibir OVERDUE enquanto o estado persistido permanece OPEN e ainda permite cancelamento. São defeitos conhecidos, não corrigidos nesta revisão documental; exigem correção e regressões específicas para ordem de eventos e coerência de estados. Aprovação das suítes não equivale a confiabilidade absoluta.</w:t>
+        <w:t>O fechamento corrige três falhas reproduzidas e protegidas por regressões (PROJETO APLICADO 7, 2026d). No F3, resolução ou reconciliação sem processo existente falham de forma recuperável e não confirmam a inbox; após recuperar a abertura, o despacho conclui o processo, com reprocessamento explícito quando o evento chegou a FAILED. No encerramento de contrato, tarefas ainda abertas são canceladas e o estado do processo deriva do agregado: todas DONE resultam em COMPLETED; qualquer tarefa CANCELLED entre tarefas finais resulta em CANCELLED. O cancelamento financeiro usa o mesmo estado efetivo da consulta: fatura vencida é recusada com 409, mesmo antes do registro explícito da inadimplência. As mudanças não reparam retroativamente registros consumidos em versões anteriores.</w:t>
       </w:r>
     </w:p>
     <w:p>
@@ -9733,7 +9905,7 @@
         <w:jc w:val="both"/>
       </w:pPr>
       <w:r>
-        <w:t>Os objetivos técnicos possuem evidências no nível de protótipo acadêmico: requisitos, AS-IS, TO-BE, padrões, três integrações, interoperabilidade, qualidade e evolução estão documentados e demonstrados no recorte de validação apresentado. A entrega acadêmica permanece condicionada à informação dos nomes e contribuições individuais e à revisão docente das premissas. As decisões mais relevantes foram o monólito modular com fronteiras extraíveis, a outbox com inbox para efeitos únicos e o tratamento explícito da indisponibilidade (503 no F1 e estado pendente no F3). Os principais desafios foram manter fronteiras com banco e processo compartilhados e garantir a mesma correlação em HTTP, auditoria e eventos.</w:t>
+        <w:t>Os objetivos técnicos possuem evidências no nível de protótipo acadêmico: requisitos, AS-IS, TO-BE, padrões, três integrações, interoperabilidade, qualidade e evolução estão documentados e demonstrados no recorte de validação apresentado. A autoria e as contribuições individuais estão identificadas na metodologia. A entrega acadêmica permanece condicionada à revisão docente das premissas e ao ensaio no ambiente escolhido. As decisões mais relevantes foram o monólito modular com fronteiras extraíveis, a outbox com inbox para efeitos únicos e o tratamento explícito da indisponibilidade (503 no F1 e estado pendente no F3). Os principais desafios foram manter fronteiras com banco e processo compartilhados e garantir a mesma correlação em HTTP, auditoria e eventos.</w:t>
       </w:r>
     </w:p>
     <w:p>
@@ -9742,7 +9914,7 @@
         <w:jc w:val="both"/>
       </w:pPr>
       <w:r>
-        <w:t>A prioridade técnica é corrigir as limitações de convergência e coerência de estados descritas na seção 4.10 e demonstrar sua recuperação por testes específicos. Como evolução, a arquitetura pode incorporar identidade corporativa, agendador para vencimentos e alertas de SLA, consumo efetivo pelo broker e conectores reais por adaptadores. Funcionalidades futuras incluem gestão de frota, vistoria com fotos e portal do cliente. O principal aprendizado é que idempotência, ordenação de eventos, estados de recuperação e evidências precisam ser projetados junto com cada fluxo.</w:t>
+        <w:t>As correções de convergência e coerência de estados da seção 4.10 são protegidas por testes de regressão. A prioridade passa a ser o ensaio completo e a validação do ambiente de apresentação. Como evolução, a arquitetura pode incorporar identidade corporativa, agendador para vencimentos e alertas de SLA, consumo efetivo pelo broker e conectores reais por adaptadores. Funcionalidades futuras incluem gestão de frota, vistoria com fotos e portal do cliente. O principal aprendizado é que idempotência, ordenação de eventos, estados de recuperação e evidências precisam ser projetados junto com cada fluxo.</w:t>
       </w:r>
     </w:p>
     <w:p>

</xml_diff>

<commit_message>
docs: corrige autoria para Roger Quinelato
</commit_message>
<xml_diff>
--- a/output/Relatorio_Tecnico_Cenario_4.docx
+++ b/output/Relatorio_Tecnico_Cenario_4.docx
@@ -30,7 +30,7 @@
         <w:jc w:val="center"/>
       </w:pPr>
       <w:r>
-        <w:t>Rodrigo Nenato</w:t>
+        <w:t>Roger Quinelato</w:t>
         <w:br/>
         <w:t>Raquel</w:t>
         <w:br/>
@@ -541,7 +541,7 @@
               <w:rPr>
                 <w:sz w:val="18"/>
               </w:rPr>
-              <w:t>Rodrigo Nenato</w:t>
+              <w:t>Roger Quinelato</w:t>
             </w:r>
           </w:p>
         </w:tc>

</xml_diff>

<commit_message>
Corrige recuperação do F3, estados de fechamento e autoria da entrega (#78)
* fix: recupera F3 e alinha estados de fechamento e autoria

* docs: corrige autoria para Roger Quinelato
</commit_message>
<xml_diff>
--- a/output/Relatorio_Tecnico_Cenario_4.docx
+++ b/output/Relatorio_Tecnico_Cenario_4.docx
@@ -30,7 +30,9 @@
         <w:jc w:val="center"/>
       </w:pPr>
       <w:r>
-        <w:t>Autoria e contribuições individuais pendentes de informação pela equipe</w:t>
+        <w:t>Roger Quinelato</w:t>
+        <w:br/>
+        <w:t>Raquel</w:t>
         <w:br/>
         <w:t>Versão de 28 de outubro de 2026</w:t>
         <w:br/>
@@ -447,14 +449,184 @@
         <w:t>3.1 Participantes</w:t>
       </w:r>
     </w:p>
+    <w:tbl>
+      <w:tblPr>
+        <w:tblW w:type="auto" w:w="0"/>
+        <w:jc w:val="center"/>
+        <w:tblLayout w:type="fixed"/>
+        <w:tblLook w:firstColumn="1" w:firstRow="1" w:lastColumn="0" w:lastRow="0" w:noHBand="0" w:noVBand="1" w:val="04A0"/>
+        <w:tblBorders>
+          <w:top w:val="single" w:sz="4" w:color="D9D9D9"/>
+          <w:left w:val="single" w:sz="4" w:color="D9D9D9"/>
+          <w:bottom w:val="single" w:sz="4" w:color="D9D9D9"/>
+          <w:right w:val="single" w:sz="4" w:color="D9D9D9"/>
+          <w:insideH w:val="single" w:sz="4" w:color="D9D9D9"/>
+          <w:insideV w:val="single" w:sz="4" w:color="D9D9D9"/>
+        </w:tblBorders>
+      </w:tblPr>
+      <w:tblGrid>
+        <w:gridCol w:w="3168"/>
+        <w:gridCol w:w="6480"/>
+      </w:tblGrid>
+      <w:tr>
+        <w:trPr>
+          <w:tblHeader/>
+          <w:cantSplit/>
+        </w:trPr>
+        <w:tc>
+          <w:tcPr>
+            <w:tcW w:type="dxa" w:w="3168"/>
+            <w:shd w:fill="17365D"/>
+            <w:vAlign w:val="center"/>
+            <w:tcMar>
+              <w:top w:w="100" w:type="dxa"/>
+              <w:start w:w="120" w:type="dxa"/>
+              <w:bottom w:w="100" w:type="dxa"/>
+              <w:end w:w="120" w:type="dxa"/>
+            </w:tcMar>
+          </w:tcPr>
+          <w:p>
+            <w:r>
+              <w:rPr>
+                <w:b/>
+                <w:color w:val="FFFFFF"/>
+              </w:rPr>
+              <w:t>Integrante</w:t>
+            </w:r>
+          </w:p>
+        </w:tc>
+        <w:tc>
+          <w:tcPr>
+            <w:tcW w:type="dxa" w:w="6480"/>
+            <w:shd w:fill="17365D"/>
+            <w:vAlign w:val="center"/>
+            <w:tcMar>
+              <w:top w:w="100" w:type="dxa"/>
+              <w:start w:w="120" w:type="dxa"/>
+              <w:bottom w:w="100" w:type="dxa"/>
+              <w:end w:w="120" w:type="dxa"/>
+            </w:tcMar>
+          </w:tcPr>
+          <w:p>
+            <w:r>
+              <w:rPr>
+                <w:b/>
+                <w:color w:val="FFFFFF"/>
+              </w:rPr>
+              <w:t>Contribuição</w:t>
+            </w:r>
+          </w:p>
+        </w:tc>
+      </w:tr>
+      <w:tr>
+        <w:trPr>
+          <w:cantSplit/>
+        </w:trPr>
+        <w:tc>
+          <w:tcPr>
+            <w:tcW w:type="dxa" w:w="3168"/>
+            <w:vAlign w:val="center"/>
+            <w:tcMar>
+              <w:top w:w="100" w:type="dxa"/>
+              <w:start w:w="120" w:type="dxa"/>
+              <w:bottom w:w="100" w:type="dxa"/>
+              <w:end w:w="120" w:type="dxa"/>
+            </w:tcMar>
+          </w:tcPr>
+          <w:p>
+            <w:pPr>
+              <w:spacing w:after="0"/>
+            </w:pPr>
+            <w:r>
+              <w:rPr>
+                <w:sz w:val="18"/>
+              </w:rPr>
+              <w:t>Roger Quinelato</w:t>
+            </w:r>
+          </w:p>
+        </w:tc>
+        <w:tc>
+          <w:tcPr>
+            <w:tcW w:type="dxa" w:w="6480"/>
+            <w:vAlign w:val="center"/>
+            <w:tcMar>
+              <w:top w:w="100" w:type="dxa"/>
+              <w:start w:w="120" w:type="dxa"/>
+              <w:bottom w:w="100" w:type="dxa"/>
+              <w:end w:w="120" w:type="dxa"/>
+            </w:tcMar>
+          </w:tcPr>
+          <w:p>
+            <w:pPr>
+              <w:spacing w:after="0"/>
+            </w:pPr>
+            <w:r>
+              <w:rPr>
+                <w:sz w:val="18"/>
+              </w:rPr>
+              <w:t>Backend, produto e negócio</w:t>
+            </w:r>
+          </w:p>
+        </w:tc>
+      </w:tr>
+      <w:tr>
+        <w:trPr>
+          <w:cantSplit/>
+        </w:trPr>
+        <w:tc>
+          <w:tcPr>
+            <w:tcW w:type="dxa" w:w="3168"/>
+            <w:vAlign w:val="center"/>
+            <w:tcMar>
+              <w:top w:w="100" w:type="dxa"/>
+              <w:start w:w="120" w:type="dxa"/>
+              <w:bottom w:w="100" w:type="dxa"/>
+              <w:end w:w="120" w:type="dxa"/>
+            </w:tcMar>
+            <w:shd w:fill="EAF1F8"/>
+          </w:tcPr>
+          <w:p>
+            <w:pPr>
+              <w:spacing w:after="0"/>
+            </w:pPr>
+            <w:r>
+              <w:rPr>
+                <w:sz w:val="18"/>
+              </w:rPr>
+              <w:t>Raquel</w:t>
+            </w:r>
+          </w:p>
+        </w:tc>
+        <w:tc>
+          <w:tcPr>
+            <w:tcW w:type="dxa" w:w="6480"/>
+            <w:vAlign w:val="center"/>
+            <w:tcMar>
+              <w:top w:w="100" w:type="dxa"/>
+              <w:start w:w="120" w:type="dxa"/>
+              <w:bottom w:w="100" w:type="dxa"/>
+              <w:end w:w="120" w:type="dxa"/>
+            </w:tcMar>
+            <w:shd w:fill="EAF1F8"/>
+          </w:tcPr>
+          <w:p>
+            <w:pPr>
+              <w:spacing w:after="0"/>
+            </w:pPr>
+            <w:r>
+              <w:rPr>
+                <w:sz w:val="18"/>
+              </w:rPr>
+              <w:t>Frontend e levantamento de requisitos</w:t>
+            </w:r>
+          </w:p>
+        </w:tc>
+      </w:tr>
+    </w:tbl>
     <w:p>
       <w:pPr>
-        <w:spacing w:after="160" w:line="276" w:lineRule="auto"/>
-        <w:jc w:val="both"/>
+        <w:spacing w:after="40"/>
       </w:pPr>
-      <w:r>
-        <w:t>Os nomes dos integrantes e suas contribuições individuais não foram informados. Essa informação é necessária para cumprir o item Participantes do Guia (ARCHCORP, 2026a, p. 11) e permanece pendente antes da submissão. As frentes de requisitos, arquitetura, implementação, testes e comunicação técnica descrevem atividades do projeto, sem atribuição individual comprovada. O histórico de commits não substitui a declaração de autoria e de contribuição pela equipe.</w:t>
-      </w:r>
     </w:p>
     <w:p>
       <w:pPr>
@@ -8898,7 +9070,7 @@
         <w:jc w:val="both"/>
       </w:pPr>
       <w:r>
-        <w:t>A medição de desempenho de 20/10 representa um ambiente local (contêiner Linux, Python 3.13, PostgreSQL 16 e RabbitMQ 3.12) com dados sintéticos. A CI de 25/10 verifica a main de referência em jobs distintos de aplicação, PostgreSQL, RabbitMQ e navegador. As suítes se sobrepõem; suas contagens não constituem um total único. A verificação local de 28/10 registrou Python 252 aprovados e 14 ignorados, frontend 19 aprovados, TypeScript e OpenAPI aprovados. A hospedagem pública, o PostgreSQL gerenciado e a capacidade com volumes reais permanecem sem comprovação.</w:t>
+        <w:t>A medição de desempenho de 20/10 representa um ambiente local (contêiner Linux, Python 3.13, PostgreSQL 16 e RabbitMQ 3.12) com dados sintéticos. A CI de 25/10 verifica a main de referência em jobs distintos de aplicação, PostgreSQL, RabbitMQ e navegador. As suítes se sobrepõem; suas contagens não constituem um total único. A verificação local de 28/10 registrou Python 264 aprovados e 14 ignorados, frontend 19 aprovados, TypeScript e OpenAPI aprovados. A hospedagem pública, o PostgreSQL gerenciado e a capacidade com volumes reais permanecem sem comprovação.</w:t>
       </w:r>
     </w:p>
     <w:p>
@@ -9396,7 +9568,7 @@
         <w:jc w:val="both"/>
       </w:pPr>
       <w:r>
-        <w:t>A versão analisada é a main f1669d7, incorporada pelo PR #75 em 25/10/2026 (PROJETO APLICADO 7, 2026b). A CI 40199072801, executada em 25/10 nessa main, concluiu os quatro jobs com sucesso. Os resultados abaixo foram conferidos nos logs do GitHub Actions (PROJETO APLICADO 7, 2026c).</w:t>
+        <w:t>A base da implementação é a main f1669d7, incorporada pelo PR #75 em 25/10/2026, com as correções de fechamento descritas nesta seção (PROJETO APLICADO 7, 2026b). A CI 40199072801, executada em 25/10 nessa main, concluiu os quatro jobs com sucesso. Os resultados abaixo foram conferidos nos logs do GitHub Actions (PROJETO APLICADO 7, 2026c).</w:t>
       </w:r>
     </w:p>
     <w:tbl>
@@ -9688,7 +9860,7 @@
         <w:jc w:val="both"/>
       </w:pPr>
       <w:r>
-        <w:t>As suítes se sobrepõem e não devem ser somadas. A verificação local informada em 28/10 registrou 252 testes Python aprovados e 14 ignorados, 19 testes da interface aprovados, checagem TypeScript e conferência OpenAPI aprovadas (PROJETO APLICADO 7, 2026d). A evidência de 20/10 (246 testes com PostgreSQL/RabbitMQ, 22 roteiros de navegador e p95 máximo de 45,1 ms) permanece histórica; o p95 não foi medido novamente sobre a main f1669d7 nesta revisão (PROJETO APLICADO 7, 2026a).</w:t>
+        <w:t>As suítes se sobrepõem e não devem ser somadas. A verificação local informada em 28/10 registrou 264 testes Python aprovados e 14 ignorados, 19 testes da interface aprovados, checagem TypeScript e conferência OpenAPI aprovadas (PROJETO APLICADO 7, 2026d). A evidência de 20/10 (246 testes com PostgreSQL/RabbitMQ, 22 roteiros de navegador e p95 máximo de 45,1 ms) permanece histórica; o p95 não foi medido novamente sobre a main f1669d7 nesta revisão (PROJETO APLICADO 7, 2026a).</w:t>
       </w:r>
     </w:p>
     <w:p>
@@ -9706,7 +9878,7 @@
         <w:jc w:val="both"/>
       </w:pPr>
       <w:r>
-        <w:t>A revisão de código de 28/10 identificou três limitações reproduzidas (PROJETO APLICADO 7, 2026d). No F3, se TicketOpened falha e TicketResolved é consumido antes da recuperação, o consumidor de resolução retorna sem processo; a recuperação posterior da abertura cria um processo STARTED embora o chamado já esteja RESOLVED, sem pendências na outbox que assegurem a convergência. No encerramento de contrato, o processo pode ficar COMPLETED com tarefa CANCELLED. No financeiro, a leitura pode exibir OVERDUE enquanto o estado persistido permanece OPEN e ainda permite cancelamento. São defeitos conhecidos, não corrigidos nesta revisão documental; exigem correção e regressões específicas para ordem de eventos e coerência de estados. Aprovação das suítes não equivale a confiabilidade absoluta.</w:t>
+        <w:t>O fechamento corrige três falhas reproduzidas e protegidas por regressões (PROJETO APLICADO 7, 2026d). No F3, resolução ou reconciliação sem processo existente falham de forma recuperável e não confirmam a inbox; após recuperar a abertura, o despacho conclui o processo, com reprocessamento explícito quando o evento chegou a FAILED. No encerramento de contrato, tarefas ainda abertas são canceladas e o estado do processo deriva do agregado: todas DONE resultam em COMPLETED; qualquer tarefa CANCELLED entre tarefas finais resulta em CANCELLED. O cancelamento financeiro usa o mesmo estado efetivo da consulta: fatura vencida é recusada com 409, mesmo antes do registro explícito da inadimplência. As mudanças não reparam retroativamente registros consumidos em versões anteriores.</w:t>
       </w:r>
     </w:p>
     <w:p>
@@ -9733,7 +9905,7 @@
         <w:jc w:val="both"/>
       </w:pPr>
       <w:r>
-        <w:t>Os objetivos técnicos possuem evidências no nível de protótipo acadêmico: requisitos, AS-IS, TO-BE, padrões, três integrações, interoperabilidade, qualidade e evolução estão documentados e demonstrados no recorte de validação apresentado. A entrega acadêmica permanece condicionada à informação dos nomes e contribuições individuais e à revisão docente das premissas. As decisões mais relevantes foram o monólito modular com fronteiras extraíveis, a outbox com inbox para efeitos únicos e o tratamento explícito da indisponibilidade (503 no F1 e estado pendente no F3). Os principais desafios foram manter fronteiras com banco e processo compartilhados e garantir a mesma correlação em HTTP, auditoria e eventos.</w:t>
+        <w:t>Os objetivos técnicos possuem evidências no nível de protótipo acadêmico: requisitos, AS-IS, TO-BE, padrões, três integrações, interoperabilidade, qualidade e evolução estão documentados e demonstrados no recorte de validação apresentado. A autoria e as contribuições individuais estão identificadas na metodologia. A entrega acadêmica permanece condicionada à revisão docente das premissas e ao ensaio no ambiente escolhido. As decisões mais relevantes foram o monólito modular com fronteiras extraíveis, a outbox com inbox para efeitos únicos e o tratamento explícito da indisponibilidade (503 no F1 e estado pendente no F3). Os principais desafios foram manter fronteiras com banco e processo compartilhados e garantir a mesma correlação em HTTP, auditoria e eventos.</w:t>
       </w:r>
     </w:p>
     <w:p>
@@ -9742,7 +9914,7 @@
         <w:jc w:val="both"/>
       </w:pPr>
       <w:r>
-        <w:t>A prioridade técnica é corrigir as limitações de convergência e coerência de estados descritas na seção 4.10 e demonstrar sua recuperação por testes específicos. Como evolução, a arquitetura pode incorporar identidade corporativa, agendador para vencimentos e alertas de SLA, consumo efetivo pelo broker e conectores reais por adaptadores. Funcionalidades futuras incluem gestão de frota, vistoria com fotos e portal do cliente. O principal aprendizado é que idempotência, ordenação de eventos, estados de recuperação e evidências precisam ser projetados junto com cada fluxo.</w:t>
+        <w:t>As correções de convergência e coerência de estados da seção 4.10 são protegidas por testes de regressão. A prioridade passa a ser o ensaio completo e a validação do ambiente de apresentação. Como evolução, a arquitetura pode incorporar identidade corporativa, agendador para vencimentos e alertas de SLA, consumo efetivo pelo broker e conectores reais por adaptadores. Funcionalidades futuras incluem gestão de frota, vistoria com fotos e portal do cliente. O principal aprendizado é que idempotência, ordenação de eventos, estados de recuperação e evidências precisam ser projetados junto com cada fluxo.</w:t>
       </w:r>
     </w:p>
     <w:p>

</xml_diff>

<commit_message>
docs: relatório e slides gerados a partir da evidência consolidada (etapa 6)
Os geradores passam a ler output/evidencias/evidencias.json (versão,
testes, p95, interface e CI), sem números transcritos à mão. Retirada a
publicação Supabase/Render (ADR-007), incluídos os agentes de revisão e
o relatório operacional, e corrigidas as referências (2026a-d; removida
a ARCHCORP 2026b, não citada). PDF com 20 páginas; 18 slides.
</commit_message>
<xml_diff>
--- a/output/Relatorio_Tecnico_Cenario_4.docx
+++ b/output/Relatorio_Tecnico_Cenario_4.docx
@@ -32,9 +32,9 @@
       <w:r>
         <w:t>Roger Quinelato</w:t>
         <w:br/>
-        <w:t>Raquel</w:t>
+        <w:t>Raquel Pereira</w:t>
         <w:br/>
-        <w:t>Versão de 28 de outubro de 2026</w:t>
+        <w:t>Versão de 29 de outubro de 2026</w:t>
         <w:br/>
         <w:t>Entrega pronta prevista para 09/11/2026</w:t>
         <w:br/>
@@ -75,7 +75,7 @@
         <w:jc w:val="both"/>
       </w:pPr>
       <w:r>
-        <w:t>A análise considera a main em f1669d7, integrada pelo PR #75 em 25/10/2026. Na CI 40199072801, de 25/10, os quatro jobs concluíram com sucesso: application (252 aprovados e 14 ignorados), postgresql (262 aprovados e 4 ignorados), rabbitmq (22 aprovados) e e2e (25 roteiros aprovados e uma verificação axe aprovada). As suítes se sobrepõem e suas contagens não devem ser somadas. Como evidência histórica, em 20 de outubro de 2026 foram registrados 246 testes aprovados com PostgreSQL 16 e RabbitMQ 3.12 reais (232 aprovados e 14 ignorados com SQLite puro) e verificações dos fluxos F1 (20/20), F2 (14/14) e F3 (15/15). A medição histórica do RNF-07, com 60 clientes e 100 amostras por consulta em 10 consultas de negócio, apresentou maior p95 de 45,1 ms no PostgreSQL, abaixo da meta de 500 ms. Os resultados usam dados sintéticos e não comprovam hospedagem pública nem nova medição de desempenho sobre essa main (PROJETO APLICADO 7, 2026a, 2026b, 2026c).</w:t>
+        <w:t>A análise considera a versão 534eab2. Em 29/10/2026, a verificação consolidada registrou 269 aprovados e 14 ignorados (SQLite), 19 testes da interface aprovados, contrato OpenAPI sincronizado e os roteiros F1, F2 e F3 concluídos sem falha; a CI do pull request executa os jobs de aplicação, PostgreSQL 16, RabbitMQ e navegador. A medição do RNF-07, com 60 clientes e 100 amostras em 10 consultas de negócio, apresentou maior p95 de 21,53 ms, abaixo da meta de 500 ms. Um relatório operacional converte métricas, auditoria e eventos em indicadores com decisão sugerida. Os resultados usam dados sintéticos e uma demonstração local (PROJETO APLICADO 7, 2026a, 2026c).</w:t>
       </w:r>
     </w:p>
     <w:p>
@@ -593,7 +593,7 @@
               <w:rPr>
                 <w:sz w:val="18"/>
               </w:rPr>
-              <w:t>Raquel</w:t>
+              <w:t>Raquel Pereira</w:t>
             </w:r>
           </w:p>
         </w:tc>
@@ -908,7 +908,7 @@
               <w:rPr>
                 <w:sz w:val="18"/>
               </w:rPr>
-              <w:t>PostgreSQL e RabbitMQ no Docker Compose; SQLite nos testes</w:t>
+              <w:t>PostgreSQL e RabbitMQ no Docker Compose; SQLite na demonstração local e nos testes</w:t>
             </w:r>
           </w:p>
         </w:tc>
@@ -1063,7 +1063,7 @@
               <w:rPr>
                 <w:sz w:val="18"/>
               </w:rPr>
-              <w:t>Pytest, testes de contrato e de fronteira, Playwright e roteiros httpx</w:t>
+              <w:t>Pytest, testes de contrato e de fronteira, Playwright com axe, roteiros httpx e agentes de revisão FDE e QA somente leitura</w:t>
             </w:r>
           </w:p>
         </w:tc>
@@ -1544,7 +1544,7 @@
         <w:jc w:val="both"/>
       </w:pPr>
       <w:r>
-        <w:t>O recorte documental é 28 de outubro de 2026, com referência técnica na main f1669d7 (PR #75, 25/10/2026). O planejamento estabelece a entrega pronta em 09/11/2026 e a apresentação em 23/11/2026. Esses marcos são compromissos previstos, sem declaração de submissão, apresentação realizada ou aceite docente. A conclusão formal depende também da identificação dos participantes e de suas contribuições.</w:t>
+        <w:t>O recorte documental é 29 de outubro de 2026, com referência técnica na versão 534eab2. Cada mudança passou por um portão de qualidade determinístico (testes, contrato e CI) e por revisão independente: um agente de QA verifica o código e um agente FDE confronta a entrega com o Guia, ambos sem permissão de alterar arquivos. O planejamento estabelece a entrega pronta em 09/11/2026 e a apresentação em 23/11/2026. Esses marcos são compromissos previstos, sem declaração de submissão, apresentação realizada ou aceite docente. A conclusão formal depende também da identificação dos participantes e de suas contribuições.</w:t>
       </w:r>
     </w:p>
     <w:p>
@@ -5714,7 +5714,7 @@
         <w:jc w:val="both"/>
       </w:pPr>
       <w:r>
-        <w:t>O protótipo aplica papéis por tokens locais e permite configurar um segredo compartilhado para o modo público. A validação ocorre na fronteira, e eventos não carregam documentos, dados bancários nem a descrição do chamado. A versão de referência compara credenciais em bytes para tratar caracteres não ASCII e limita o registro de exceções inesperadas ao tipo do erro, sem mensagem sensível nem traceback (PROJETO APLICADO 7, 2026b). Um ambiente real exigiria provedor OIDC, contas individuais e TLS verificado; esses itens não estão demonstrados.</w:t>
+        <w:t>O protótipo aplica papéis por tokens locais e permite configurar um segredo compartilhado para o modo público. A validação ocorre na fronteira, e eventos não carregam documentos, dados bancários nem a descrição do chamado. A versão de referência compara credenciais em bytes para tratar caracteres não ASCII e limita o registro de exceções inesperadas ao tipo do erro, sem mensagem sensível nem traceback (PROJETO APLICADO 7, 2026b). Um ambiente real exigiria provedor OIDC, contas individuais e TLS verificado; esses itens não estão demonstrados. A demonstração é local, sem publicação pública (ADR-007).</w:t>
       </w:r>
     </w:p>
     <w:p>
@@ -8808,7 +8808,7 @@
               <w:rPr>
                 <w:sz w:val="18"/>
               </w:rPr>
-              <w:t>p95 histórico de 45,1 ms (20/10)</w:t>
+              <w:t>p95 máximo de 21,53 ms</w:t>
             </w:r>
           </w:p>
         </w:tc>
@@ -9053,7 +9053,7 @@
               <w:rPr>
                 <w:sz w:val="18"/>
               </w:rPr>
-              <w:t>Suítes da CI 40199072801 verificadas separadamente (seção 4.10)</w:t>
+              <w:t>269 aprovados e 14 ignorados (SQLite)</w:t>
             </w:r>
           </w:p>
         </w:tc>
@@ -9070,7 +9070,7 @@
         <w:jc w:val="both"/>
       </w:pPr>
       <w:r>
-        <w:t>A medição de desempenho de 20/10 representa um ambiente local (contêiner Linux, Python 3.13, PostgreSQL 16 e RabbitMQ 3.12) com dados sintéticos. A CI de 25/10 verifica a main de referência em jobs distintos de aplicação, PostgreSQL, RabbitMQ e navegador. As suítes se sobrepõem; suas contagens não constituem um total único. A verificação local de 28/10 registrou Python 264 aprovados e 14 ignorados, frontend 19 aprovados, TypeScript e OpenAPI aprovados. A hospedagem pública, o PostgreSQL gerenciado e a capacidade com volumes reais permanecem sem comprovação.</w:t>
+        <w:t>A medição de desempenho de 29/10/2026 usa SQLite local com dados sintéticos; a CI verifica a mesma base com PostgreSQL 16, RabbitMQ e navegador. A capacidade com volumes reais permanece sem comprovação.</w:t>
       </w:r>
     </w:p>
     <w:p>
@@ -9568,7 +9568,7 @@
         <w:jc w:val="both"/>
       </w:pPr>
       <w:r>
-        <w:t>A base da implementação é a main f1669d7, incorporada pelo PR #75 em 25/10/2026, com as correções de fechamento descritas nesta seção (PROJETO APLICADO 7, 2026b). A CI 40199072801, executada em 25/10 nessa main, concluiu os quatro jobs com sucesso. Os resultados abaixo foram conferidos nos logs do GitHub Actions (PROJETO APLICADO 7, 2026c).</w:t>
+        <w:t>A versão analisada é 534eab2, que parte da integração das tarefas T06–T19 (PROJETO APLICADO 7, 2026b) e incorpora as correções de fechamento descritas nesta seção (PROJETO APLICADO 7, 2026d). Os números a seguir foram gerados automaticamente a partir das execuções, sem transcrição manual (PROJETO APLICADO 7, 2026a).</w:t>
       </w:r>
     </w:p>
     <w:tbl>
@@ -9587,8 +9587,8 @@
         </w:tblBorders>
       </w:tblPr>
       <w:tblGrid>
-        <w:gridCol w:w="1872"/>
-        <w:gridCol w:w="7776"/>
+        <w:gridCol w:w="2592"/>
+        <w:gridCol w:w="7056"/>
       </w:tblGrid>
       <w:tr>
         <w:trPr>
@@ -9597,7 +9597,7 @@
         </w:trPr>
         <w:tc>
           <w:tcPr>
-            <w:tcW w:type="dxa" w:w="1872"/>
+            <w:tcW w:type="dxa" w:w="2592"/>
             <w:shd w:fill="17365D"/>
             <w:vAlign w:val="center"/>
             <w:tcMar>
@@ -9613,13 +9613,13 @@
                 <w:b/>
                 <w:color w:val="FFFFFF"/>
               </w:rPr>
-              <w:t>Job da CI</w:t>
+              <w:t>Verificação</w:t>
             </w:r>
           </w:p>
         </w:tc>
         <w:tc>
           <w:tcPr>
-            <w:tcW w:type="dxa" w:w="7776"/>
+            <w:tcW w:type="dxa" w:w="7056"/>
             <w:shd w:fill="17365D"/>
             <w:vAlign w:val="center"/>
             <w:tcMar>
@@ -9635,7 +9635,7 @@
                 <w:b/>
                 <w:color w:val="FFFFFF"/>
               </w:rPr>
-              <w:t>Resultado da verificação</w:t>
+              <w:t>Resultado</w:t>
             </w:r>
           </w:p>
         </w:tc>
@@ -9646,7 +9646,7 @@
         </w:trPr>
         <w:tc>
           <w:tcPr>
-            <w:tcW w:type="dxa" w:w="1872"/>
+            <w:tcW w:type="dxa" w:w="2592"/>
             <w:vAlign w:val="center"/>
             <w:tcMar>
               <w:top w:w="100" w:type="dxa"/>
@@ -9663,13 +9663,13 @@
               <w:rPr>
                 <w:sz w:val="18"/>
               </w:rPr>
-              <w:t>application</w:t>
+              <w:t>Suíte Python</w:t>
             </w:r>
           </w:p>
         </w:tc>
         <w:tc>
           <w:tcPr>
-            <w:tcW w:type="dxa" w:w="7776"/>
+            <w:tcW w:type="dxa" w:w="7056"/>
             <w:vAlign w:val="center"/>
             <w:tcMar>
               <w:top w:w="100" w:type="dxa"/>
@@ -9686,7 +9686,7 @@
               <w:rPr>
                 <w:sz w:val="18"/>
               </w:rPr>
-              <w:t>252 testes aprovados e 14 ignorados</w:t>
+              <w:t>269 aprovados e 14 ignorados (SQLite)</w:t>
             </w:r>
           </w:p>
         </w:tc>
@@ -9697,7 +9697,7 @@
         </w:trPr>
         <w:tc>
           <w:tcPr>
-            <w:tcW w:type="dxa" w:w="1872"/>
+            <w:tcW w:type="dxa" w:w="2592"/>
             <w:vAlign w:val="center"/>
             <w:tcMar>
               <w:top w:w="100" w:type="dxa"/>
@@ -9715,13 +9715,13 @@
               <w:rPr>
                 <w:sz w:val="18"/>
               </w:rPr>
-              <w:t>postgresql</w:t>
+              <w:t>Interface (node:test)</w:t>
             </w:r>
           </w:p>
         </w:tc>
         <w:tc>
           <w:tcPr>
-            <w:tcW w:type="dxa" w:w="7776"/>
+            <w:tcW w:type="dxa" w:w="7056"/>
             <w:vAlign w:val="center"/>
             <w:tcMar>
               <w:top w:w="100" w:type="dxa"/>
@@ -9739,7 +9739,7 @@
               <w:rPr>
                 <w:sz w:val="18"/>
               </w:rPr>
-              <w:t>262 testes aprovados e 4 ignorados</w:t>
+              <w:t>19 testes aprovados</w:t>
             </w:r>
           </w:p>
         </w:tc>
@@ -9750,7 +9750,7 @@
         </w:trPr>
         <w:tc>
           <w:tcPr>
-            <w:tcW w:type="dxa" w:w="1872"/>
+            <w:tcW w:type="dxa" w:w="2592"/>
             <w:vAlign w:val="center"/>
             <w:tcMar>
               <w:top w:w="100" w:type="dxa"/>
@@ -9767,13 +9767,13 @@
               <w:rPr>
                 <w:sz w:val="18"/>
               </w:rPr>
-              <w:t>rabbitmq</w:t>
+              <w:t>Contrato OpenAPI</w:t>
             </w:r>
           </w:p>
         </w:tc>
         <w:tc>
           <w:tcPr>
-            <w:tcW w:type="dxa" w:w="7776"/>
+            <w:tcW w:type="dxa" w:w="7056"/>
             <w:vAlign w:val="center"/>
             <w:tcMar>
               <w:top w:w="100" w:type="dxa"/>
@@ -9790,7 +9790,7 @@
               <w:rPr>
                 <w:sz w:val="18"/>
               </w:rPr>
-              <w:t>22 testes aprovados</w:t>
+              <w:t>sincronizado com a aplicação</w:t>
             </w:r>
           </w:p>
         </w:tc>
@@ -9801,7 +9801,7 @@
         </w:trPr>
         <w:tc>
           <w:tcPr>
-            <w:tcW w:type="dxa" w:w="1872"/>
+            <w:tcW w:type="dxa" w:w="2592"/>
             <w:vAlign w:val="center"/>
             <w:tcMar>
               <w:top w:w="100" w:type="dxa"/>
@@ -9819,13 +9819,13 @@
               <w:rPr>
                 <w:sz w:val="18"/>
               </w:rPr>
-              <w:t>e2e</w:t>
+              <w:t>Desempenho (RNF-07)</w:t>
             </w:r>
           </w:p>
         </w:tc>
         <w:tc>
           <w:tcPr>
-            <w:tcW w:type="dxa" w:w="7776"/>
+            <w:tcW w:type="dxa" w:w="7056"/>
             <w:vAlign w:val="center"/>
             <w:tcMar>
               <w:top w:w="100" w:type="dxa"/>
@@ -9843,7 +9843,58 @@
               <w:rPr>
                 <w:sz w:val="18"/>
               </w:rPr>
-              <w:t>25 roteiros de navegador aprovados; verificação axe separada: 1 aprovada</w:t>
+              <w:t>maior p95 de 21,53 ms em 10 consultas; meta de 500 ms</w:t>
+            </w:r>
+          </w:p>
+        </w:tc>
+      </w:tr>
+      <w:tr>
+        <w:trPr>
+          <w:cantSplit/>
+        </w:trPr>
+        <w:tc>
+          <w:tcPr>
+            <w:tcW w:type="dxa" w:w="2592"/>
+            <w:vAlign w:val="center"/>
+            <w:tcMar>
+              <w:top w:w="100" w:type="dxa"/>
+              <w:start w:w="120" w:type="dxa"/>
+              <w:bottom w:w="100" w:type="dxa"/>
+              <w:end w:w="120" w:type="dxa"/>
+            </w:tcMar>
+          </w:tcPr>
+          <w:p>
+            <w:pPr>
+              <w:spacing w:after="0"/>
+            </w:pPr>
+            <w:r>
+              <w:rPr>
+                <w:sz w:val="18"/>
+              </w:rPr>
+              <w:t>CI do GitHub Actions</w:t>
+            </w:r>
+          </w:p>
+        </w:tc>
+        <w:tc>
+          <w:tcPr>
+            <w:tcW w:type="dxa" w:w="7056"/>
+            <w:vAlign w:val="center"/>
+            <w:tcMar>
+              <w:top w:w="100" w:type="dxa"/>
+              <w:start w:w="120" w:type="dxa"/>
+              <w:bottom w:w="100" w:type="dxa"/>
+              <w:end w:w="120" w:type="dxa"/>
+            </w:tcMar>
+          </w:tcPr>
+          <w:p>
+            <w:pPr>
+              <w:spacing w:after="0"/>
+            </w:pPr>
+            <w:r>
+              <w:rPr>
+                <w:sz w:val="18"/>
+              </w:rPr>
+              <w:t>a CI do pull request executa os jobs de aplicação, PostgreSQL 16, RabbitMQ e navegador</w:t>
             </w:r>
           </w:p>
         </w:tc>
@@ -9860,7 +9911,7 @@
         <w:jc w:val="both"/>
       </w:pPr>
       <w:r>
-        <w:t>As suítes se sobrepõem e não devem ser somadas. A verificação local informada em 28/10 registrou 264 testes Python aprovados e 14 ignorados, 19 testes da interface aprovados, checagem TypeScript e conferência OpenAPI aprovadas (PROJETO APLICADO 7, 2026d). A evidência de 20/10 (246 testes com PostgreSQL/RabbitMQ, 22 roteiros de navegador e p95 máximo de 45,1 ms) permanece histórica; o p95 não foi medido novamente sobre a main f1669d7 nesta revisão (PROJETO APLICADO 7, 2026a).</w:t>
+        <w:t>O relatório operacional transforma os dados já gravados pela API em informação para decisão: funil F1→F2→F3, cumprimento de SLA, atraso do despacho por consumidor, retentativas e falhas por evento, repetições absorvidas pela idempotência, p95 e erros por código e uso por módulo. No ensaio, o funil indicou que nenhuma fatura foi paga, porque os roteiros não exercitam pagamento; esse tipo de leitura orienta o que demonstrar e onde evoluir (PROJETO APLICADO 7, 2026c).</w:t>
       </w:r>
     </w:p>
     <w:p>
@@ -9887,7 +9938,7 @@
         <w:jc w:val="both"/>
       </w:pPr>
       <w:r>
-        <w:t>Riscos e limitações: os dados organizacionais reais são desconhecidos; não há OIDC, tracing distribuído nem agendador (vencimento de fatura e SLA dependem de acionamento); o RabbitMQ recebe cópia dos eventos, mas não entrega aos consumidores, e FAILED é um estado da aplicação, não uma fila de erro do broker. O prazo da leitura do CRM limita tentativas e esperas, mas não interrompe uma chamada no mesmo processo; o ADR-006 permanece proposto, aguardando aceite. A hospedagem pública e o PostgreSQL gerenciado não foram verificados. Integração na main não comprova aceite docente, validação das premissas ou conclusão formal da entrega.</w:t>
+        <w:t>Riscos e limitações: os dados organizacionais reais são desconhecidos; não há OIDC, tracing distribuído nem agendador (vencimento de fatura e SLA dependem de acionamento); o RabbitMQ recebe cópia dos eventos, mas não entrega aos consumidores, e FAILED é um estado da aplicação, não uma fila de erro do broker. O prazo da leitura do CRM limita tentativas e esperas, mas não interrompe uma chamada no mesmo processo; o ADR-006 permanece proposto, aguardando aceite. A demonstração é local e a publicação pública ficou como evolução (ADR-007). Integração na main não comprova aceite docente, validação das premissas ou conclusão formal da entrega.</w:t>
       </w:r>
     </w:p>
     <w:p>
@@ -9936,17 +9987,6 @@
           <w:sz w:val="18"/>
         </w:rPr>
         <w:t>ARCHCORP. Projeto Aplicado – ArchCorp: Arquitetura de Sistemas Corporativos. Enunciado acadêmico do Projeto Aplicado. 2026a.</w:t>
-      </w:r>
-    </w:p>
-    <w:p>
-      <w:pPr>
-        <w:spacing w:after="80"/>
-      </w:pPr>
-      <w:r>
-        <w:rPr>
-          <w:sz w:val="18"/>
-        </w:rPr>
-        <w:t>ARCHCORP. Plano de Execução e Cronograma Detalhado. Material acadêmico fornecido ao projeto. 2026b.</w:t>
       </w:r>
     </w:p>
     <w:p>
@@ -10133,7 +10173,7 @@
         <w:rPr>
           <w:sz w:val="18"/>
         </w:rPr>
-        <w:t>PROJETO APLICADO 7. Evidências de validação. Seções de 20/10 e 21/10/2026. Documento do repositório docs/EVIDENCIAS_VALIDACAO.md, versão f1669d7. 2026a.</w:t>
+        <w:t>PROJETO APLICADO 7. Evidências de validação. Documento docs/EVIDENCIAS_VALIDACAO.md e arquivo output/evidencias/evidencias.json, versão 534eab2, 29/10/2026. 2026a.</w:t>
       </w:r>
     </w:p>
     <w:p>
@@ -10155,7 +10195,7 @@
         <w:rPr>
           <w:sz w:val="18"/>
         </w:rPr>
-        <w:t>PROJETO APLICADO 7. Verify: execução 40199072801 na main f1669d7. GitHub Actions, 25 out. 2026. Disponível em: https://github.com/Roger-Quinelato/projetoAplicado7/actions/runs/40199072801. Logs consultados no GitHub Actions em: 28 out. 2026. 2026c.</w:t>
+        <w:t>PROJETO APLICADO 7. Relatório operacional e agentes de verificação. Arquivos scripts/relatorio_operacional.py, tools/consolidar_evidencias.py e docs/agentes/AGENTES_FDE_QA.md. 2026c.</w:t>
       </w:r>
     </w:p>
     <w:p>
@@ -10166,7 +10206,7 @@
         <w:rPr>
           <w:sz w:val="18"/>
         </w:rPr>
-        <w:t>PROJETO APLICADO 7. Registros de testes locais e revisão de código de 28 out. 2026. Resultados e reproduções informados pela equipe; conferência dos consumidores em src/archcorp/workflow/service.py e das regras em src/archcorp/finance/service.py e domain.py. 2026d.</w:t>
+        <w:t>PROJETO APLICADO 7. Corrige recuperação do F3, estados de fechamento e autoria da entrega. PR #78, commit 714b17c, 28 out. 2026. Disponível em: https://github.com/Roger-Quinelato/projetoAplicado7/pull/78. 2026d.</w:t>
       </w:r>
     </w:p>
     <w:p>
@@ -10186,7 +10226,7 @@
         <w:jc w:val="both"/>
       </w:pPr>
       <w:r>
-        <w:t>Documentos complementares do repositório: ADR-001 a ADR-006; requisitos; plano de implementação; matriz de rastreabilidade; arquitetura AS-IS, TO-BE e fluxos de integração; exemplos de API; contratos OpenAPI e AsyncAPI; roteiros de demonstração; evidências de validação.</w:t>
+        <w:t>Documentos complementares do repositório: ADR-001 a ADR-007; requisitos; plano de implementação; matriz de rastreabilidade; arquitetura AS-IS, TO-BE e fluxos de integração; exemplos de API; contratos OpenAPI e AsyncAPI; roteiros de demonstração; evidências de validação.</w:t>
       </w:r>
     </w:p>
     <w:sectPr>

</xml_diff>

<commit_message>
docs: ADR-006 não adotado e retirada dos agentes cavecrew/caveman
- ADR-006 marcado como não adotado: com a demonstração local e o CRM no
  mesmo processo, a leitura resiliente não tem efeito real. O adaptador e
  os testes permanecem como evolução para um CRM externo; README, matriz,
  cronograma, estado, relatório e slides deixam de apresentá-lo.
- Removidos os agentes cavecrew-* e as skills cavecrew, caveman e
  caveman-commit (e o skills-lock.json), que podiam ocupar o lugar do
  archcorp-qa ou comprimir textos em português.
- Relatório (20 páginas) e slides gerados de novo.
</commit_message>
<xml_diff>
--- a/output/Relatorio_Tecnico_Cenario_4.docx
+++ b/output/Relatorio_Tecnico_Cenario_4.docx
@@ -3176,7 +3176,7 @@
               <w:rPr>
                 <w:sz w:val="18"/>
               </w:rPr>
-              <w:t>Rascunho sem recadastro; CRM indisponível responde 503 sem efeito</w:t>
+              <w:t>Rascunho sem recadastro, pelo customerId do CRM</w:t>
             </w:r>
           </w:p>
         </w:tc>
@@ -7060,7 +7060,7 @@
               <w:rPr>
                 <w:sz w:val="18"/>
               </w:rPr>
-              <w:t>422 cliente inelegível; 409 chave reutilizada; 503 CRM indisponível sem efeito (ADR-006)</w:t>
+              <w:t>422 cliente inelegível ou inexistente; 409 chave de idempotência reutilizada com outro pedido</w:t>
             </w:r>
           </w:p>
         </w:tc>
@@ -9938,7 +9938,7 @@
         <w:jc w:val="both"/>
       </w:pPr>
       <w:r>
-        <w:t>Riscos e limitações: os dados organizacionais reais são desconhecidos; não há OIDC, tracing distribuído nem agendador (vencimento de fatura e SLA dependem de acionamento); o RabbitMQ recebe cópia dos eventos, mas não entrega aos consumidores, e FAILED é um estado da aplicação, não uma fila de erro do broker. O prazo da leitura do CRM limita tentativas e esperas, mas não interrompe uma chamada no mesmo processo; o ADR-006 permanece proposto, aguardando aceite. A demonstração é local e a publicação pública ficou como evolução (ADR-007). Integração na main não comprova aceite docente, validação das premissas ou conclusão formal da entrega.</w:t>
+        <w:t>Riscos e limitações: os dados organizacionais reais são desconhecidos; não há OIDC, tracing distribuído nem agendador (vencimento de fatura e SLA dependem de acionamento); o RabbitMQ recebe cópia dos eventos, mas não entrega aos consumidores, e FAILED é um estado da aplicação, não uma fila de erro do broker. O prazo da leitura do CRM limita tentativas e esperas, mas não interrompe uma chamada no mesmo processo; por isso o ADR-006 não foi adotado e fica como evolução para um CRM externo. A demonstração é local e a publicação pública ficou como evolução (ADR-007). Integração na main não comprova aceite docente, validação das premissas ou conclusão formal da entrega.</w:t>
       </w:r>
     </w:p>
     <w:p>
@@ -9956,7 +9956,7 @@
         <w:jc w:val="both"/>
       </w:pPr>
       <w:r>
-        <w:t>Os objetivos técnicos possuem evidências no nível de protótipo acadêmico: requisitos, AS-IS, TO-BE, padrões, três integrações, interoperabilidade, qualidade e evolução estão documentados e demonstrados no recorte de validação apresentado. A autoria e as contribuições individuais estão identificadas na metodologia. A entrega acadêmica permanece condicionada à revisão docente das premissas e ao ensaio no ambiente escolhido. As decisões mais relevantes foram o monólito modular com fronteiras extraíveis, a outbox com inbox para efeitos únicos e o tratamento explícito da indisponibilidade (503 no F1 e estado pendente no F3). Os principais desafios foram manter fronteiras com banco e processo compartilhados e garantir a mesma correlação em HTTP, auditoria e eventos.</w:t>
+        <w:t>Os objetivos técnicos possuem evidências no nível de protótipo acadêmico: requisitos, AS-IS, TO-BE, padrões, três integrações, interoperabilidade, qualidade e evolução estão documentados e demonstrados no recorte de validação apresentado. A autoria e as contribuições individuais estão identificadas na metodologia. A entrega acadêmica permanece condicionada à revisão docente das premissas e ao ensaio no ambiente escolhido. As decisões mais relevantes foram o monólito modular com fronteiras extraíveis, a outbox com inbox para efeitos únicos e o tratamento explícito da indisponibilidade (estado pendente e reconciliação no F3). Os principais desafios foram manter fronteiras com banco e processo compartilhados e garantir a mesma correlação em HTTP, auditoria e eventos.</w:t>
       </w:r>
     </w:p>
     <w:p>

</xml_diff>